<commit_message>
Update Capitulo 2 to add point 2.2.6
</commit_message>
<xml_diff>
--- a/docs/Capítulo 2 - Antecedentes.docx
+++ b/docs/Capítulo 2 - Antecedentes.docx
@@ -3866,7 +3866,6 @@
         </w:rPr>
         <w:t xml:space="preserve">2.2.4.- </w:t>
       </w:r>
-      <w:proofErr w:type="spellStart"/>
       <w:r>
         <w:rPr>
           <w:b/>
@@ -3899,58 +3898,47 @@
         </w:rPr>
         <w:t>Plus</w:t>
       </w:r>
-      <w:proofErr w:type="spellEnd"/>
-    </w:p>
-    <w:p>
-      <w:pPr>
-        <w:pBdr>
-          <w:top w:val="nil"/>
-          <w:left w:val="nil"/>
-          <w:bottom w:val="nil"/>
-          <w:right w:val="nil"/>
-          <w:between w:val="nil"/>
-        </w:pBdr>
-        <w:jc w:val="both"/>
-        <w:rPr>
-          <w:rFonts w:ascii="Times New Roman" w:eastAsia="Times New Roman" w:hAnsi="Times New Roman" w:cs="Times New Roman"/>
-          <w:sz w:val="24"/>
-          <w:szCs w:val="24"/>
-        </w:rPr>
-      </w:pPr>
-    </w:p>
-    <w:p>
-      <w:pPr>
-        <w:pBdr>
-          <w:top w:val="nil"/>
-          <w:left w:val="nil"/>
-          <w:bottom w:val="nil"/>
-          <w:right w:val="nil"/>
-          <w:between w:val="nil"/>
-        </w:pBdr>
-        <w:jc w:val="both"/>
-        <w:rPr>
-          <w:rFonts w:ascii="Times New Roman" w:eastAsia="Times New Roman" w:hAnsi="Times New Roman" w:cs="Times New Roman"/>
-          <w:sz w:val="24"/>
-          <w:szCs w:val="24"/>
-        </w:rPr>
-      </w:pPr>
-      <w:proofErr w:type="spellStart"/>
-      <w:r>
-        <w:rPr>
-          <w:rFonts w:ascii="Times New Roman" w:eastAsia="Times New Roman" w:hAnsi="Times New Roman" w:cs="Times New Roman"/>
-          <w:sz w:val="24"/>
-          <w:szCs w:val="24"/>
-        </w:rPr>
-        <w:t>PetnotePlus</w:t>
-      </w:r>
-      <w:proofErr w:type="spellEnd"/>
-      <w:r>
-        <w:rPr>
-          <w:rFonts w:ascii="Times New Roman" w:eastAsia="Times New Roman" w:hAnsi="Times New Roman" w:cs="Times New Roman"/>
-          <w:sz w:val="24"/>
-          <w:szCs w:val="24"/>
-        </w:rPr>
-        <w:t xml:space="preserve"> es una </w:t>
+    </w:p>
+    <w:p>
+      <w:pPr>
+        <w:pBdr>
+          <w:top w:val="nil"/>
+          <w:left w:val="nil"/>
+          <w:bottom w:val="nil"/>
+          <w:right w:val="nil"/>
+          <w:between w:val="nil"/>
+        </w:pBdr>
+        <w:jc w:val="both"/>
+        <w:rPr>
+          <w:rFonts w:ascii="Times New Roman" w:eastAsia="Times New Roman" w:hAnsi="Times New Roman" w:cs="Times New Roman"/>
+          <w:sz w:val="24"/>
+          <w:szCs w:val="24"/>
+        </w:rPr>
+      </w:pPr>
+    </w:p>
+    <w:p>
+      <w:pPr>
+        <w:pBdr>
+          <w:top w:val="nil"/>
+          <w:left w:val="nil"/>
+          <w:bottom w:val="nil"/>
+          <w:right w:val="nil"/>
+          <w:between w:val="nil"/>
+        </w:pBdr>
+        <w:jc w:val="both"/>
+        <w:rPr>
+          <w:rFonts w:ascii="Times New Roman" w:eastAsia="Times New Roman" w:hAnsi="Times New Roman" w:cs="Times New Roman"/>
+          <w:sz w:val="24"/>
+          <w:szCs w:val="24"/>
+        </w:rPr>
+      </w:pPr>
+      <w:r>
+        <w:rPr>
+          <w:rFonts w:ascii="Times New Roman" w:eastAsia="Times New Roman" w:hAnsi="Times New Roman" w:cs="Times New Roman"/>
+          <w:sz w:val="24"/>
+          <w:szCs w:val="24"/>
+        </w:rPr>
+        <w:t xml:space="preserve">PetnotePlus es una </w:t>
       </w:r>
       <w:r>
         <w:rPr>
@@ -4054,25 +4042,7 @@
           <w:sz w:val="24"/>
           <w:szCs w:val="24"/>
         </w:rPr>
-        <w:t xml:space="preserve">puedan anotar las acciones realizadas y consultar las pendientes, contribuyendo así a evitar olvidos y duplicidades. A diferencia de las herramientas analizadas anteriormente, </w:t>
-      </w:r>
-      <w:proofErr w:type="spellStart"/>
-      <w:r>
-        <w:rPr>
-          <w:rFonts w:ascii="Times New Roman" w:eastAsia="Times New Roman" w:hAnsi="Times New Roman" w:cs="Times New Roman"/>
-          <w:sz w:val="24"/>
-          <w:szCs w:val="24"/>
-        </w:rPr>
-        <w:t>PetnotePlus</w:t>
-      </w:r>
-      <w:proofErr w:type="spellEnd"/>
-      <w:r>
-        <w:rPr>
-          <w:rFonts w:ascii="Times New Roman" w:eastAsia="Times New Roman" w:hAnsi="Times New Roman" w:cs="Times New Roman"/>
-          <w:sz w:val="24"/>
-          <w:szCs w:val="24"/>
-        </w:rPr>
-        <w:t xml:space="preserve"> es multiespecie y admite el registro de mamíferos, aves y reptiles. </w:t>
+        <w:t xml:space="preserve">puedan anotar las acciones realizadas y consultar las pendientes, contribuyendo así a evitar olvidos y duplicidades. A diferencia de las herramientas analizadas anteriormente, PetnotePlus es multiespecie y admite el registro de mamíferos, aves y reptiles. </w:t>
       </w:r>
       <w:r>
         <w:rPr>
@@ -4787,83 +4757,55 @@
         </w:rPr>
         <w:t xml:space="preserve">Por otra parte, </w:t>
       </w:r>
-      <w:proofErr w:type="spellStart"/>
-      <w:r>
-        <w:rPr>
-          <w:rFonts w:ascii="Times New Roman" w:eastAsia="Times New Roman" w:hAnsi="Times New Roman" w:cs="Times New Roman"/>
-          <w:sz w:val="24"/>
-          <w:szCs w:val="24"/>
-        </w:rPr>
-        <w:t>PetnotePlus</w:t>
-      </w:r>
-      <w:proofErr w:type="spellEnd"/>
-      <w:r>
-        <w:rPr>
-          <w:rFonts w:ascii="Times New Roman" w:eastAsia="Times New Roman" w:hAnsi="Times New Roman" w:cs="Times New Roman"/>
-          <w:sz w:val="24"/>
-          <w:szCs w:val="24"/>
-        </w:rPr>
-        <w:t xml:space="preserve"> implementa un modelo basado en grupos: el propietario crea el perfil de la mascota y genera un código de invitación que los demás cuidadores pueden introducir desde sus propias cuentas para unirse al hogar. Una vez integrados, todos los miembros pueden consultar y registrar información sobre las mascotas compartidas. El sistema diferencia entre el rol de propietario, con permisos de gestión del grupo, y el rol de miembro, con permisos de lectura y escritura. Cuando un usuario registra una acción, la aplicación puede enviar una notificación push al resto de miembros del grupo, siendo esta opción configurable por cada usuario.</w:t>
-      </w:r>
-    </w:p>
-    <w:p>
-      <w:pPr>
-        <w:pBdr>
-          <w:top w:val="nil"/>
-          <w:left w:val="nil"/>
-          <w:bottom w:val="nil"/>
-          <w:right w:val="nil"/>
-          <w:between w:val="nil"/>
-        </w:pBdr>
-        <w:jc w:val="both"/>
-        <w:rPr>
-          <w:rFonts w:ascii="Times New Roman" w:eastAsia="Times New Roman" w:hAnsi="Times New Roman" w:cs="Times New Roman"/>
-          <w:sz w:val="24"/>
-          <w:szCs w:val="24"/>
-        </w:rPr>
-      </w:pPr>
-    </w:p>
-    <w:p>
-      <w:pPr>
-        <w:pBdr>
-          <w:top w:val="nil"/>
-          <w:left w:val="nil"/>
-          <w:bottom w:val="nil"/>
-          <w:right w:val="nil"/>
-          <w:between w:val="nil"/>
-        </w:pBdr>
-        <w:jc w:val="both"/>
-        <w:rPr>
-          <w:rFonts w:ascii="Times New Roman" w:eastAsia="Times New Roman" w:hAnsi="Times New Roman" w:cs="Times New Roman"/>
-          <w:sz w:val="24"/>
-          <w:szCs w:val="24"/>
-        </w:rPr>
-      </w:pPr>
-      <w:r>
-        <w:rPr>
-          <w:rFonts w:ascii="Times New Roman" w:eastAsia="Times New Roman" w:hAnsi="Times New Roman" w:cs="Times New Roman"/>
-          <w:sz w:val="24"/>
-          <w:szCs w:val="24"/>
-        </w:rPr>
-        <w:t xml:space="preserve">En cuanto a sus limitaciones, aunque </w:t>
-      </w:r>
-      <w:proofErr w:type="spellStart"/>
-      <w:r>
-        <w:rPr>
-          <w:rFonts w:ascii="Times New Roman" w:eastAsia="Times New Roman" w:hAnsi="Times New Roman" w:cs="Times New Roman"/>
-          <w:sz w:val="24"/>
-          <w:szCs w:val="24"/>
-        </w:rPr>
-        <w:t>PetnotePlus</w:t>
-      </w:r>
-      <w:proofErr w:type="spellEnd"/>
-      <w:r>
-        <w:rPr>
-          <w:rFonts w:ascii="Times New Roman" w:eastAsia="Times New Roman" w:hAnsi="Times New Roman" w:cs="Times New Roman"/>
-          <w:sz w:val="24"/>
-          <w:szCs w:val="24"/>
-        </w:rPr>
-        <w:t xml:space="preserve"> es la herramienta analizada que más se aproxima al enfoque de coordinación multiusuario que plantea el presente proyecto, presenta carencias relevantes en este ámbito. El sistema de confirmación de mediación se basa en una simple marca de verificación sin mecanismos de bloqueo que impidan que dos cuidadores registren simultáneamente la misma acción. Si bien la sincronización en tiempo real permite que los registros sean visibles de forma inmediata para todos los miembros, la ausencia de un control de concurrencia explícito podría dar lugar a entradas duplicadas en situaciones de acceso simultáneo. </w:t>
+      <w:r>
+        <w:rPr>
+          <w:rFonts w:ascii="Times New Roman" w:eastAsia="Times New Roman" w:hAnsi="Times New Roman" w:cs="Times New Roman"/>
+          <w:sz w:val="24"/>
+          <w:szCs w:val="24"/>
+        </w:rPr>
+        <w:t>PetnotePlus implementa un modelo basado en grupos: el propietario crea el perfil de la mascota y genera un código de invitación que los demás cuidadores pueden introducir desde sus propias cuentas para unirse al hogar. Una vez integrados, todos los miembros pueden consultar y registrar información sobre las mascotas compartidas. El sistema diferencia entre el rol de propietario, con permisos de gestión del grupo, y el rol de miembro, con permisos de lectura y escritura. Cuando un usuario registra una acción, la aplicación puede enviar una notificación push al resto de miembros del grupo, siendo esta opción configurable por cada usuario.</w:t>
+      </w:r>
+    </w:p>
+    <w:p>
+      <w:pPr>
+        <w:pBdr>
+          <w:top w:val="nil"/>
+          <w:left w:val="nil"/>
+          <w:bottom w:val="nil"/>
+          <w:right w:val="nil"/>
+          <w:between w:val="nil"/>
+        </w:pBdr>
+        <w:jc w:val="both"/>
+        <w:rPr>
+          <w:rFonts w:ascii="Times New Roman" w:eastAsia="Times New Roman" w:hAnsi="Times New Roman" w:cs="Times New Roman"/>
+          <w:sz w:val="24"/>
+          <w:szCs w:val="24"/>
+        </w:rPr>
+      </w:pPr>
+    </w:p>
+    <w:p>
+      <w:pPr>
+        <w:pBdr>
+          <w:top w:val="nil"/>
+          <w:left w:val="nil"/>
+          <w:bottom w:val="nil"/>
+          <w:right w:val="nil"/>
+          <w:between w:val="nil"/>
+        </w:pBdr>
+        <w:jc w:val="both"/>
+        <w:rPr>
+          <w:rFonts w:ascii="Times New Roman" w:eastAsia="Times New Roman" w:hAnsi="Times New Roman" w:cs="Times New Roman"/>
+          <w:sz w:val="24"/>
+          <w:szCs w:val="24"/>
+        </w:rPr>
+      </w:pPr>
+      <w:r>
+        <w:rPr>
+          <w:rFonts w:ascii="Times New Roman" w:eastAsia="Times New Roman" w:hAnsi="Times New Roman" w:cs="Times New Roman"/>
+          <w:sz w:val="24"/>
+          <w:szCs w:val="24"/>
+        </w:rPr>
+        <w:t xml:space="preserve">En cuanto a sus limitaciones, aunque PetnotePlus es la herramienta analizada que más se aproxima al enfoque de coordinación multiusuario que plantea el presente proyecto, presenta carencias relevantes en este ámbito. El sistema de confirmación de mediación se basa en una simple marca de verificación sin mecanismos de bloqueo que impidan que dos cuidadores registren simultáneamente la misma acción. Si bien la sincronización en tiempo real permite que los registros sean visibles de forma inmediata para todos los miembros, la ausencia de un control de concurrencia explícito podría dar lugar a entradas duplicadas en situaciones de acceso simultáneo. </w:t>
       </w:r>
     </w:p>
     <w:p>
@@ -6289,7 +6231,1844 @@
           <w:sz w:val="24"/>
           <w:szCs w:val="24"/>
         </w:rPr>
-        <w:t>Adicionalmente, al final de este apartado de estudio de diversas herramientas, se pueda incorporar una breve reseña, a modo de resumen, que deje constancia de las características de cada una de las herramientas vistas para, de un vistazo, poder ver las ventajas e inconvenientes de cada una de ellas, qué necesidades cubren y cuáles no. Estaría muy bien incluir aquí un cuadro/tabla resumen que permita hacer una revisión comparativa rápida de las herramientas estudiadas.</w:t>
+        <w:t xml:space="preserve">A </w:t>
+      </w:r>
+      <w:proofErr w:type="gramStart"/>
+      <w:r>
+        <w:rPr>
+          <w:rFonts w:ascii="Times New Roman" w:eastAsia="Times New Roman" w:hAnsi="Times New Roman" w:cs="Times New Roman"/>
+          <w:sz w:val="24"/>
+          <w:szCs w:val="24"/>
+        </w:rPr>
+        <w:t>continuación</w:t>
+      </w:r>
+      <w:proofErr w:type="gramEnd"/>
+      <w:r>
+        <w:rPr>
+          <w:rFonts w:ascii="Times New Roman" w:eastAsia="Times New Roman" w:hAnsi="Times New Roman" w:cs="Times New Roman"/>
+          <w:sz w:val="24"/>
+          <w:szCs w:val="24"/>
+        </w:rPr>
+        <w:t xml:space="preserve"> se presenta una tabla resumen que recoge las principales características de las cinco herramientas analizadas, con el objetivo de facilitar una comparación rápida entre ellas e identificar las necesidades que cubren y las que quedan sin resolver.</w:t>
+      </w:r>
+    </w:p>
+    <w:p>
+      <w:pPr>
+        <w:pBdr>
+          <w:top w:val="nil"/>
+          <w:left w:val="nil"/>
+          <w:bottom w:val="nil"/>
+          <w:right w:val="nil"/>
+          <w:between w:val="nil"/>
+        </w:pBdr>
+        <w:jc w:val="both"/>
+        <w:rPr>
+          <w:rFonts w:ascii="Times New Roman" w:eastAsia="Times New Roman" w:hAnsi="Times New Roman" w:cs="Times New Roman"/>
+          <w:sz w:val="24"/>
+          <w:szCs w:val="24"/>
+        </w:rPr>
+      </w:pPr>
+    </w:p>
+    <w:tbl>
+      <w:tblPr>
+        <w:tblStyle w:val="Tablaconcuadrcula"/>
+        <w:tblW w:w="0" w:type="auto"/>
+        <w:tblLook w:val="04A0" w:firstRow="1" w:lastRow="0" w:firstColumn="1" w:lastColumn="0" w:noHBand="0" w:noVBand="1"/>
+      </w:tblPr>
+      <w:tblGrid>
+        <w:gridCol w:w="1550"/>
+        <w:gridCol w:w="1459"/>
+        <w:gridCol w:w="1664"/>
+        <w:gridCol w:w="1418"/>
+        <w:gridCol w:w="1417"/>
+        <w:gridCol w:w="1270"/>
+      </w:tblGrid>
+      <w:tr>
+        <w:tc>
+          <w:tcPr>
+            <w:tcW w:w="1550" w:type="dxa"/>
+          </w:tcPr>
+          <w:p>
+            <w:pPr>
+              <w:jc w:val="both"/>
+              <w:rPr>
+                <w:rFonts w:ascii="Times New Roman" w:eastAsia="Times New Roman" w:hAnsi="Times New Roman" w:cs="Times New Roman"/>
+                <w:sz w:val="24"/>
+                <w:szCs w:val="24"/>
+              </w:rPr>
+            </w:pPr>
+            <w:r>
+              <w:rPr>
+                <w:rFonts w:ascii="Times New Roman" w:eastAsia="Times New Roman" w:hAnsi="Times New Roman" w:cs="Times New Roman"/>
+                <w:sz w:val="24"/>
+                <w:szCs w:val="24"/>
+              </w:rPr>
+              <w:t>Característica</w:t>
+            </w:r>
+          </w:p>
+        </w:tc>
+        <w:tc>
+          <w:tcPr>
+            <w:tcW w:w="1459" w:type="dxa"/>
+          </w:tcPr>
+          <w:p>
+            <w:pPr>
+              <w:jc w:val="both"/>
+              <w:rPr>
+                <w:rFonts w:ascii="Times New Roman" w:eastAsia="Times New Roman" w:hAnsi="Times New Roman" w:cs="Times New Roman"/>
+                <w:sz w:val="24"/>
+                <w:szCs w:val="24"/>
+              </w:rPr>
+            </w:pPr>
+            <w:r>
+              <w:rPr>
+                <w:rFonts w:ascii="Times New Roman" w:eastAsia="Times New Roman" w:hAnsi="Times New Roman" w:cs="Times New Roman"/>
+                <w:sz w:val="24"/>
+                <w:szCs w:val="24"/>
+              </w:rPr>
+              <w:t>PetDesk</w:t>
+            </w:r>
+          </w:p>
+        </w:tc>
+        <w:tc>
+          <w:tcPr>
+            <w:tcW w:w="1664" w:type="dxa"/>
+          </w:tcPr>
+          <w:p>
+            <w:pPr>
+              <w:jc w:val="both"/>
+              <w:rPr>
+                <w:rFonts w:ascii="Times New Roman" w:eastAsia="Times New Roman" w:hAnsi="Times New Roman" w:cs="Times New Roman"/>
+                <w:sz w:val="24"/>
+                <w:szCs w:val="24"/>
+              </w:rPr>
+            </w:pPr>
+            <w:r>
+              <w:rPr>
+                <w:rFonts w:ascii="Times New Roman" w:eastAsia="Times New Roman" w:hAnsi="Times New Roman" w:cs="Times New Roman"/>
+                <w:sz w:val="24"/>
+                <w:szCs w:val="24"/>
+              </w:rPr>
+              <w:t>11Pets</w:t>
+            </w:r>
+          </w:p>
+        </w:tc>
+        <w:tc>
+          <w:tcPr>
+            <w:tcW w:w="1418" w:type="dxa"/>
+          </w:tcPr>
+          <w:p>
+            <w:pPr>
+              <w:jc w:val="both"/>
+              <w:rPr>
+                <w:rFonts w:ascii="Times New Roman" w:eastAsia="Times New Roman" w:hAnsi="Times New Roman" w:cs="Times New Roman"/>
+                <w:sz w:val="24"/>
+                <w:szCs w:val="24"/>
+              </w:rPr>
+            </w:pPr>
+            <w:r>
+              <w:rPr>
+                <w:rFonts w:ascii="Times New Roman" w:eastAsia="Times New Roman" w:hAnsi="Times New Roman" w:cs="Times New Roman"/>
+                <w:sz w:val="24"/>
+                <w:szCs w:val="24"/>
+              </w:rPr>
+              <w:t>Dogo</w:t>
+            </w:r>
+          </w:p>
+        </w:tc>
+        <w:tc>
+          <w:tcPr>
+            <w:tcW w:w="1417" w:type="dxa"/>
+          </w:tcPr>
+          <w:p>
+            <w:pPr>
+              <w:jc w:val="both"/>
+              <w:rPr>
+                <w:rFonts w:ascii="Times New Roman" w:eastAsia="Times New Roman" w:hAnsi="Times New Roman" w:cs="Times New Roman"/>
+                <w:sz w:val="24"/>
+                <w:szCs w:val="24"/>
+              </w:rPr>
+            </w:pPr>
+            <w:r>
+              <w:rPr>
+                <w:rFonts w:ascii="Times New Roman" w:eastAsia="Times New Roman" w:hAnsi="Times New Roman" w:cs="Times New Roman"/>
+                <w:sz w:val="24"/>
+                <w:szCs w:val="24"/>
+              </w:rPr>
+              <w:t>PetnotePlus</w:t>
+            </w:r>
+          </w:p>
+        </w:tc>
+        <w:tc>
+          <w:tcPr>
+            <w:tcW w:w="1270" w:type="dxa"/>
+          </w:tcPr>
+          <w:p>
+            <w:pPr>
+              <w:jc w:val="both"/>
+              <w:rPr>
+                <w:rFonts w:ascii="Times New Roman" w:eastAsia="Times New Roman" w:hAnsi="Times New Roman" w:cs="Times New Roman"/>
+                <w:sz w:val="24"/>
+                <w:szCs w:val="24"/>
+              </w:rPr>
+            </w:pPr>
+            <w:r>
+              <w:rPr>
+                <w:rFonts w:ascii="Times New Roman" w:eastAsia="Times New Roman" w:hAnsi="Times New Roman" w:cs="Times New Roman"/>
+                <w:sz w:val="24"/>
+                <w:szCs w:val="24"/>
+              </w:rPr>
+              <w:t>VitusVet</w:t>
+            </w:r>
+          </w:p>
+        </w:tc>
+      </w:tr>
+      <w:tr>
+        <w:tc>
+          <w:tcPr>
+            <w:tcW w:w="1550" w:type="dxa"/>
+          </w:tcPr>
+          <w:p>
+            <w:pPr>
+              <w:jc w:val="both"/>
+              <w:rPr>
+                <w:rFonts w:ascii="Times New Roman" w:eastAsia="Times New Roman" w:hAnsi="Times New Roman" w:cs="Times New Roman"/>
+                <w:sz w:val="24"/>
+                <w:szCs w:val="24"/>
+              </w:rPr>
+            </w:pPr>
+            <w:r>
+              <w:rPr>
+                <w:rFonts w:ascii="Times New Roman" w:eastAsia="Times New Roman" w:hAnsi="Times New Roman" w:cs="Times New Roman"/>
+                <w:sz w:val="24"/>
+                <w:szCs w:val="24"/>
+              </w:rPr>
+              <w:t>Plataforma</w:t>
+            </w:r>
+          </w:p>
+        </w:tc>
+        <w:tc>
+          <w:tcPr>
+            <w:tcW w:w="1459" w:type="dxa"/>
+          </w:tcPr>
+          <w:p>
+            <w:pPr>
+              <w:jc w:val="both"/>
+              <w:rPr>
+                <w:rFonts w:ascii="Times New Roman" w:eastAsia="Times New Roman" w:hAnsi="Times New Roman" w:cs="Times New Roman"/>
+                <w:sz w:val="24"/>
+                <w:szCs w:val="24"/>
+              </w:rPr>
+            </w:pPr>
+            <w:r>
+              <w:rPr>
+                <w:rFonts w:ascii="Times New Roman" w:eastAsia="Times New Roman" w:hAnsi="Times New Roman" w:cs="Times New Roman"/>
+                <w:sz w:val="24"/>
+                <w:szCs w:val="24"/>
+              </w:rPr>
+              <w:t>iOS / Android</w:t>
+            </w:r>
+          </w:p>
+        </w:tc>
+        <w:tc>
+          <w:tcPr>
+            <w:tcW w:w="1664" w:type="dxa"/>
+          </w:tcPr>
+          <w:p>
+            <w:pPr>
+              <w:jc w:val="both"/>
+              <w:rPr>
+                <w:rFonts w:ascii="Times New Roman" w:eastAsia="Times New Roman" w:hAnsi="Times New Roman" w:cs="Times New Roman"/>
+                <w:sz w:val="24"/>
+                <w:szCs w:val="24"/>
+              </w:rPr>
+            </w:pPr>
+            <w:r>
+              <w:rPr>
+                <w:rFonts w:ascii="Times New Roman" w:eastAsia="Times New Roman" w:hAnsi="Times New Roman" w:cs="Times New Roman"/>
+                <w:sz w:val="24"/>
+                <w:szCs w:val="24"/>
+              </w:rPr>
+              <w:t>iOS / Android / Web</w:t>
+            </w:r>
+          </w:p>
+        </w:tc>
+        <w:tc>
+          <w:tcPr>
+            <w:tcW w:w="1418" w:type="dxa"/>
+          </w:tcPr>
+          <w:p>
+            <w:pPr>
+              <w:jc w:val="both"/>
+              <w:rPr>
+                <w:rFonts w:ascii="Times New Roman" w:eastAsia="Times New Roman" w:hAnsi="Times New Roman" w:cs="Times New Roman"/>
+                <w:sz w:val="24"/>
+                <w:szCs w:val="24"/>
+              </w:rPr>
+            </w:pPr>
+            <w:r>
+              <w:rPr>
+                <w:rFonts w:ascii="Times New Roman" w:eastAsia="Times New Roman" w:hAnsi="Times New Roman" w:cs="Times New Roman"/>
+                <w:sz w:val="24"/>
+                <w:szCs w:val="24"/>
+              </w:rPr>
+              <w:t>iOS / Android</w:t>
+            </w:r>
+          </w:p>
+        </w:tc>
+        <w:tc>
+          <w:tcPr>
+            <w:tcW w:w="1417" w:type="dxa"/>
+          </w:tcPr>
+          <w:p>
+            <w:pPr>
+              <w:jc w:val="both"/>
+              <w:rPr>
+                <w:rFonts w:ascii="Times New Roman" w:eastAsia="Times New Roman" w:hAnsi="Times New Roman" w:cs="Times New Roman"/>
+                <w:sz w:val="24"/>
+                <w:szCs w:val="24"/>
+              </w:rPr>
+            </w:pPr>
+            <w:r>
+              <w:rPr>
+                <w:rFonts w:ascii="Times New Roman" w:eastAsia="Times New Roman" w:hAnsi="Times New Roman" w:cs="Times New Roman"/>
+                <w:sz w:val="24"/>
+                <w:szCs w:val="24"/>
+              </w:rPr>
+              <w:t>iOS / Android</w:t>
+            </w:r>
+          </w:p>
+        </w:tc>
+        <w:tc>
+          <w:tcPr>
+            <w:tcW w:w="1270" w:type="dxa"/>
+          </w:tcPr>
+          <w:p>
+            <w:pPr>
+              <w:jc w:val="both"/>
+              <w:rPr>
+                <w:rFonts w:ascii="Times New Roman" w:eastAsia="Times New Roman" w:hAnsi="Times New Roman" w:cs="Times New Roman"/>
+                <w:sz w:val="24"/>
+                <w:szCs w:val="24"/>
+              </w:rPr>
+            </w:pPr>
+            <w:r>
+              <w:rPr>
+                <w:rFonts w:ascii="Times New Roman" w:eastAsia="Times New Roman" w:hAnsi="Times New Roman" w:cs="Times New Roman"/>
+                <w:sz w:val="24"/>
+                <w:szCs w:val="24"/>
+              </w:rPr>
+              <w:t>iOS</w:t>
+            </w:r>
+            <w:r>
+              <w:rPr>
+                <w:rFonts w:ascii="Times New Roman" w:eastAsia="Times New Roman" w:hAnsi="Times New Roman" w:cs="Times New Roman"/>
+                <w:sz w:val="24"/>
+                <w:szCs w:val="24"/>
+              </w:rPr>
+              <w:t xml:space="preserve"> </w:t>
+            </w:r>
+            <w:r>
+              <w:rPr>
+                <w:rFonts w:ascii="Times New Roman" w:eastAsia="Times New Roman" w:hAnsi="Times New Roman" w:cs="Times New Roman"/>
+                <w:sz w:val="24"/>
+                <w:szCs w:val="24"/>
+              </w:rPr>
+              <w:t>/</w:t>
+            </w:r>
+            <w:r>
+              <w:rPr>
+                <w:rFonts w:ascii="Times New Roman" w:eastAsia="Times New Roman" w:hAnsi="Times New Roman" w:cs="Times New Roman"/>
+                <w:sz w:val="24"/>
+                <w:szCs w:val="24"/>
+              </w:rPr>
+              <w:t xml:space="preserve"> </w:t>
+            </w:r>
+            <w:r>
+              <w:rPr>
+                <w:rFonts w:ascii="Times New Roman" w:eastAsia="Times New Roman" w:hAnsi="Times New Roman" w:cs="Times New Roman"/>
+                <w:sz w:val="24"/>
+                <w:szCs w:val="24"/>
+              </w:rPr>
+              <w:t>Android</w:t>
+            </w:r>
+            <w:r>
+              <w:rPr>
+                <w:rFonts w:ascii="Times New Roman" w:eastAsia="Times New Roman" w:hAnsi="Times New Roman" w:cs="Times New Roman"/>
+                <w:sz w:val="24"/>
+                <w:szCs w:val="24"/>
+              </w:rPr>
+              <w:t xml:space="preserve"> </w:t>
+            </w:r>
+            <w:r>
+              <w:rPr>
+                <w:rFonts w:ascii="Times New Roman" w:eastAsia="Times New Roman" w:hAnsi="Times New Roman" w:cs="Times New Roman"/>
+                <w:sz w:val="24"/>
+                <w:szCs w:val="24"/>
+              </w:rPr>
+              <w:t>/</w:t>
+            </w:r>
+            <w:r>
+              <w:rPr>
+                <w:rFonts w:ascii="Times New Roman" w:eastAsia="Times New Roman" w:hAnsi="Times New Roman" w:cs="Times New Roman"/>
+                <w:sz w:val="24"/>
+                <w:szCs w:val="24"/>
+              </w:rPr>
+              <w:t xml:space="preserve"> </w:t>
+            </w:r>
+            <w:r>
+              <w:rPr>
+                <w:rFonts w:ascii="Times New Roman" w:eastAsia="Times New Roman" w:hAnsi="Times New Roman" w:cs="Times New Roman"/>
+                <w:sz w:val="24"/>
+                <w:szCs w:val="24"/>
+              </w:rPr>
+              <w:t>Web</w:t>
+            </w:r>
+          </w:p>
+        </w:tc>
+      </w:tr>
+      <w:tr>
+        <w:tc>
+          <w:tcPr>
+            <w:tcW w:w="1550" w:type="dxa"/>
+          </w:tcPr>
+          <w:p>
+            <w:pPr>
+              <w:jc w:val="both"/>
+              <w:rPr>
+                <w:rFonts w:ascii="Times New Roman" w:eastAsia="Times New Roman" w:hAnsi="Times New Roman" w:cs="Times New Roman"/>
+                <w:sz w:val="24"/>
+                <w:szCs w:val="24"/>
+              </w:rPr>
+            </w:pPr>
+            <w:r>
+              <w:rPr>
+                <w:rFonts w:ascii="Times New Roman" w:eastAsia="Times New Roman" w:hAnsi="Times New Roman" w:cs="Times New Roman"/>
+                <w:sz w:val="24"/>
+                <w:szCs w:val="24"/>
+              </w:rPr>
+              <w:t>PWA</w:t>
+            </w:r>
+          </w:p>
+        </w:tc>
+        <w:tc>
+          <w:tcPr>
+            <w:tcW w:w="1459" w:type="dxa"/>
+          </w:tcPr>
+          <w:p>
+            <w:pPr>
+              <w:jc w:val="both"/>
+              <w:rPr>
+                <w:rFonts w:ascii="Times New Roman" w:eastAsia="Times New Roman" w:hAnsi="Times New Roman" w:cs="Times New Roman"/>
+                <w:sz w:val="24"/>
+                <w:szCs w:val="24"/>
+              </w:rPr>
+            </w:pPr>
+            <w:r>
+              <w:rPr>
+                <w:rFonts w:ascii="Times New Roman" w:eastAsia="Times New Roman" w:hAnsi="Times New Roman" w:cs="Times New Roman"/>
+                <w:sz w:val="24"/>
+                <w:szCs w:val="24"/>
+              </w:rPr>
+              <w:t>No</w:t>
+            </w:r>
+          </w:p>
+        </w:tc>
+        <w:tc>
+          <w:tcPr>
+            <w:tcW w:w="1664" w:type="dxa"/>
+          </w:tcPr>
+          <w:p>
+            <w:pPr>
+              <w:jc w:val="both"/>
+              <w:rPr>
+                <w:rFonts w:ascii="Times New Roman" w:eastAsia="Times New Roman" w:hAnsi="Times New Roman" w:cs="Times New Roman"/>
+                <w:sz w:val="24"/>
+                <w:szCs w:val="24"/>
+              </w:rPr>
+            </w:pPr>
+            <w:r>
+              <w:rPr>
+                <w:rFonts w:ascii="Times New Roman" w:eastAsia="Times New Roman" w:hAnsi="Times New Roman" w:cs="Times New Roman"/>
+                <w:sz w:val="24"/>
+                <w:szCs w:val="24"/>
+              </w:rPr>
+              <w:t>No</w:t>
+            </w:r>
+          </w:p>
+        </w:tc>
+        <w:tc>
+          <w:tcPr>
+            <w:tcW w:w="1418" w:type="dxa"/>
+          </w:tcPr>
+          <w:p>
+            <w:pPr>
+              <w:jc w:val="both"/>
+              <w:rPr>
+                <w:rFonts w:ascii="Times New Roman" w:eastAsia="Times New Roman" w:hAnsi="Times New Roman" w:cs="Times New Roman"/>
+                <w:sz w:val="24"/>
+                <w:szCs w:val="24"/>
+              </w:rPr>
+            </w:pPr>
+            <w:r>
+              <w:rPr>
+                <w:rFonts w:ascii="Times New Roman" w:eastAsia="Times New Roman" w:hAnsi="Times New Roman" w:cs="Times New Roman"/>
+                <w:sz w:val="24"/>
+                <w:szCs w:val="24"/>
+              </w:rPr>
+              <w:t>No</w:t>
+            </w:r>
+          </w:p>
+        </w:tc>
+        <w:tc>
+          <w:tcPr>
+            <w:tcW w:w="1417" w:type="dxa"/>
+          </w:tcPr>
+          <w:p>
+            <w:pPr>
+              <w:jc w:val="both"/>
+              <w:rPr>
+                <w:rFonts w:ascii="Times New Roman" w:eastAsia="Times New Roman" w:hAnsi="Times New Roman" w:cs="Times New Roman"/>
+                <w:sz w:val="24"/>
+                <w:szCs w:val="24"/>
+              </w:rPr>
+            </w:pPr>
+            <w:r>
+              <w:rPr>
+                <w:rFonts w:ascii="Times New Roman" w:eastAsia="Times New Roman" w:hAnsi="Times New Roman" w:cs="Times New Roman"/>
+                <w:sz w:val="24"/>
+                <w:szCs w:val="24"/>
+              </w:rPr>
+              <w:t>No</w:t>
+            </w:r>
+          </w:p>
+        </w:tc>
+        <w:tc>
+          <w:tcPr>
+            <w:tcW w:w="1270" w:type="dxa"/>
+          </w:tcPr>
+          <w:p>
+            <w:pPr>
+              <w:jc w:val="both"/>
+              <w:rPr>
+                <w:rFonts w:ascii="Times New Roman" w:eastAsia="Times New Roman" w:hAnsi="Times New Roman" w:cs="Times New Roman"/>
+                <w:sz w:val="24"/>
+                <w:szCs w:val="24"/>
+              </w:rPr>
+            </w:pPr>
+            <w:r>
+              <w:rPr>
+                <w:rFonts w:ascii="Times New Roman" w:eastAsia="Times New Roman" w:hAnsi="Times New Roman" w:cs="Times New Roman"/>
+                <w:sz w:val="24"/>
+                <w:szCs w:val="24"/>
+              </w:rPr>
+              <w:t>No</w:t>
+            </w:r>
+          </w:p>
+        </w:tc>
+      </w:tr>
+      <w:tr>
+        <w:tc>
+          <w:tcPr>
+            <w:tcW w:w="1550" w:type="dxa"/>
+          </w:tcPr>
+          <w:p>
+            <w:pPr>
+              <w:jc w:val="both"/>
+              <w:rPr>
+                <w:rFonts w:ascii="Times New Roman" w:eastAsia="Times New Roman" w:hAnsi="Times New Roman" w:cs="Times New Roman"/>
+                <w:sz w:val="24"/>
+                <w:szCs w:val="24"/>
+              </w:rPr>
+            </w:pPr>
+            <w:r>
+              <w:rPr>
+                <w:rFonts w:ascii="Times New Roman" w:eastAsia="Times New Roman" w:hAnsi="Times New Roman" w:cs="Times New Roman"/>
+                <w:sz w:val="24"/>
+                <w:szCs w:val="24"/>
+              </w:rPr>
+              <w:t>Disponible en España</w:t>
+            </w:r>
+          </w:p>
+        </w:tc>
+        <w:tc>
+          <w:tcPr>
+            <w:tcW w:w="1459" w:type="dxa"/>
+          </w:tcPr>
+          <w:p>
+            <w:pPr>
+              <w:jc w:val="both"/>
+              <w:rPr>
+                <w:rFonts w:ascii="Times New Roman" w:eastAsia="Times New Roman" w:hAnsi="Times New Roman" w:cs="Times New Roman"/>
+                <w:sz w:val="24"/>
+                <w:szCs w:val="24"/>
+              </w:rPr>
+            </w:pPr>
+            <w:r>
+              <w:rPr>
+                <w:rFonts w:ascii="Times New Roman" w:eastAsia="Times New Roman" w:hAnsi="Times New Roman" w:cs="Times New Roman"/>
+                <w:sz w:val="24"/>
+                <w:szCs w:val="24"/>
+              </w:rPr>
+              <w:t>No</w:t>
+            </w:r>
+          </w:p>
+        </w:tc>
+        <w:tc>
+          <w:tcPr>
+            <w:tcW w:w="1664" w:type="dxa"/>
+          </w:tcPr>
+          <w:p>
+            <w:pPr>
+              <w:jc w:val="both"/>
+              <w:rPr>
+                <w:rFonts w:ascii="Times New Roman" w:eastAsia="Times New Roman" w:hAnsi="Times New Roman" w:cs="Times New Roman"/>
+                <w:sz w:val="24"/>
+                <w:szCs w:val="24"/>
+              </w:rPr>
+            </w:pPr>
+            <w:r>
+              <w:rPr>
+                <w:rFonts w:ascii="Times New Roman" w:eastAsia="Times New Roman" w:hAnsi="Times New Roman" w:cs="Times New Roman"/>
+                <w:sz w:val="24"/>
+                <w:szCs w:val="24"/>
+              </w:rPr>
+              <w:t>Sí</w:t>
+            </w:r>
+          </w:p>
+        </w:tc>
+        <w:tc>
+          <w:tcPr>
+            <w:tcW w:w="1418" w:type="dxa"/>
+          </w:tcPr>
+          <w:p>
+            <w:pPr>
+              <w:jc w:val="both"/>
+              <w:rPr>
+                <w:rFonts w:ascii="Times New Roman" w:eastAsia="Times New Roman" w:hAnsi="Times New Roman" w:cs="Times New Roman"/>
+                <w:sz w:val="24"/>
+                <w:szCs w:val="24"/>
+              </w:rPr>
+            </w:pPr>
+            <w:r>
+              <w:rPr>
+                <w:rFonts w:ascii="Times New Roman" w:eastAsia="Times New Roman" w:hAnsi="Times New Roman" w:cs="Times New Roman"/>
+                <w:sz w:val="24"/>
+                <w:szCs w:val="24"/>
+              </w:rPr>
+              <w:t>Sí</w:t>
+            </w:r>
+          </w:p>
+        </w:tc>
+        <w:tc>
+          <w:tcPr>
+            <w:tcW w:w="1417" w:type="dxa"/>
+          </w:tcPr>
+          <w:p>
+            <w:pPr>
+              <w:jc w:val="both"/>
+              <w:rPr>
+                <w:rFonts w:ascii="Times New Roman" w:eastAsia="Times New Roman" w:hAnsi="Times New Roman" w:cs="Times New Roman"/>
+                <w:sz w:val="24"/>
+                <w:szCs w:val="24"/>
+              </w:rPr>
+            </w:pPr>
+            <w:r>
+              <w:rPr>
+                <w:rFonts w:ascii="Times New Roman" w:eastAsia="Times New Roman" w:hAnsi="Times New Roman" w:cs="Times New Roman"/>
+                <w:sz w:val="24"/>
+                <w:szCs w:val="24"/>
+              </w:rPr>
+              <w:t>Sí</w:t>
+            </w:r>
+          </w:p>
+        </w:tc>
+        <w:tc>
+          <w:tcPr>
+            <w:tcW w:w="1270" w:type="dxa"/>
+          </w:tcPr>
+          <w:p>
+            <w:pPr>
+              <w:jc w:val="both"/>
+              <w:rPr>
+                <w:rFonts w:ascii="Times New Roman" w:eastAsia="Times New Roman" w:hAnsi="Times New Roman" w:cs="Times New Roman"/>
+                <w:sz w:val="24"/>
+                <w:szCs w:val="24"/>
+              </w:rPr>
+            </w:pPr>
+            <w:r>
+              <w:rPr>
+                <w:rFonts w:ascii="Times New Roman" w:eastAsia="Times New Roman" w:hAnsi="Times New Roman" w:cs="Times New Roman"/>
+                <w:sz w:val="24"/>
+                <w:szCs w:val="24"/>
+              </w:rPr>
+              <w:t>Sí (limitada)</w:t>
+            </w:r>
+          </w:p>
+        </w:tc>
+      </w:tr>
+      <w:tr>
+        <w:tc>
+          <w:tcPr>
+            <w:tcW w:w="1550" w:type="dxa"/>
+          </w:tcPr>
+          <w:p>
+            <w:pPr>
+              <w:jc w:val="both"/>
+              <w:rPr>
+                <w:rFonts w:ascii="Times New Roman" w:eastAsia="Times New Roman" w:hAnsi="Times New Roman" w:cs="Times New Roman"/>
+                <w:sz w:val="24"/>
+                <w:szCs w:val="24"/>
+              </w:rPr>
+            </w:pPr>
+            <w:r>
+              <w:rPr>
+                <w:rFonts w:ascii="Times New Roman" w:eastAsia="Times New Roman" w:hAnsi="Times New Roman" w:cs="Times New Roman"/>
+                <w:sz w:val="24"/>
+                <w:szCs w:val="24"/>
+              </w:rPr>
+              <w:t>Modelo de precio</w:t>
+            </w:r>
+          </w:p>
+        </w:tc>
+        <w:tc>
+          <w:tcPr>
+            <w:tcW w:w="1459" w:type="dxa"/>
+          </w:tcPr>
+          <w:p>
+            <w:pPr>
+              <w:jc w:val="both"/>
+              <w:rPr>
+                <w:rFonts w:ascii="Times New Roman" w:eastAsia="Times New Roman" w:hAnsi="Times New Roman" w:cs="Times New Roman"/>
+                <w:sz w:val="24"/>
+                <w:szCs w:val="24"/>
+              </w:rPr>
+            </w:pPr>
+            <w:r>
+              <w:rPr>
+                <w:rFonts w:ascii="Times New Roman" w:eastAsia="Times New Roman" w:hAnsi="Times New Roman" w:cs="Times New Roman"/>
+                <w:sz w:val="24"/>
+                <w:szCs w:val="24"/>
+              </w:rPr>
+              <w:t>Freemium (B2B)</w:t>
+            </w:r>
+          </w:p>
+        </w:tc>
+        <w:tc>
+          <w:tcPr>
+            <w:tcW w:w="1664" w:type="dxa"/>
+          </w:tcPr>
+          <w:p>
+            <w:pPr>
+              <w:jc w:val="both"/>
+              <w:rPr>
+                <w:rFonts w:ascii="Times New Roman" w:eastAsia="Times New Roman" w:hAnsi="Times New Roman" w:cs="Times New Roman"/>
+                <w:sz w:val="24"/>
+                <w:szCs w:val="24"/>
+              </w:rPr>
+            </w:pPr>
+            <w:r>
+              <w:rPr>
+                <w:rFonts w:ascii="Times New Roman" w:eastAsia="Times New Roman" w:hAnsi="Times New Roman" w:cs="Times New Roman"/>
+                <w:sz w:val="24"/>
+                <w:szCs w:val="24"/>
+              </w:rPr>
+              <w:t>Freemium</w:t>
+            </w:r>
+          </w:p>
+        </w:tc>
+        <w:tc>
+          <w:tcPr>
+            <w:tcW w:w="1418" w:type="dxa"/>
+          </w:tcPr>
+          <w:p>
+            <w:pPr>
+              <w:jc w:val="both"/>
+              <w:rPr>
+                <w:rFonts w:ascii="Times New Roman" w:eastAsia="Times New Roman" w:hAnsi="Times New Roman" w:cs="Times New Roman"/>
+                <w:sz w:val="24"/>
+                <w:szCs w:val="24"/>
+              </w:rPr>
+            </w:pPr>
+            <w:r>
+              <w:rPr>
+                <w:rFonts w:ascii="Times New Roman" w:eastAsia="Times New Roman" w:hAnsi="Times New Roman" w:cs="Times New Roman"/>
+                <w:sz w:val="24"/>
+                <w:szCs w:val="24"/>
+              </w:rPr>
+              <w:t>Freemium</w:t>
+            </w:r>
+          </w:p>
+        </w:tc>
+        <w:tc>
+          <w:tcPr>
+            <w:tcW w:w="1417" w:type="dxa"/>
+          </w:tcPr>
+          <w:p>
+            <w:pPr>
+              <w:jc w:val="both"/>
+              <w:rPr>
+                <w:rFonts w:ascii="Times New Roman" w:eastAsia="Times New Roman" w:hAnsi="Times New Roman" w:cs="Times New Roman"/>
+                <w:sz w:val="24"/>
+                <w:szCs w:val="24"/>
+              </w:rPr>
+            </w:pPr>
+            <w:r>
+              <w:rPr>
+                <w:rFonts w:ascii="Times New Roman" w:eastAsia="Times New Roman" w:hAnsi="Times New Roman" w:cs="Times New Roman"/>
+                <w:sz w:val="24"/>
+                <w:szCs w:val="24"/>
+              </w:rPr>
+              <w:t>Freemium + anuncios</w:t>
+            </w:r>
+          </w:p>
+        </w:tc>
+        <w:tc>
+          <w:tcPr>
+            <w:tcW w:w="1270" w:type="dxa"/>
+          </w:tcPr>
+          <w:p>
+            <w:pPr>
+              <w:jc w:val="both"/>
+              <w:rPr>
+                <w:rFonts w:ascii="Times New Roman" w:eastAsia="Times New Roman" w:hAnsi="Times New Roman" w:cs="Times New Roman"/>
+                <w:sz w:val="24"/>
+                <w:szCs w:val="24"/>
+              </w:rPr>
+            </w:pPr>
+            <w:r>
+              <w:rPr>
+                <w:rFonts w:ascii="Times New Roman" w:eastAsia="Times New Roman" w:hAnsi="Times New Roman" w:cs="Times New Roman"/>
+                <w:sz w:val="24"/>
+                <w:szCs w:val="24"/>
+              </w:rPr>
+              <w:t>Freemium (B2B)</w:t>
+            </w:r>
+          </w:p>
+        </w:tc>
+      </w:tr>
+      <w:tr>
+        <w:tc>
+          <w:tcPr>
+            <w:tcW w:w="1550" w:type="dxa"/>
+          </w:tcPr>
+          <w:p>
+            <w:pPr>
+              <w:jc w:val="both"/>
+              <w:rPr>
+                <w:rFonts w:ascii="Times New Roman" w:eastAsia="Times New Roman" w:hAnsi="Times New Roman" w:cs="Times New Roman"/>
+                <w:sz w:val="24"/>
+                <w:szCs w:val="24"/>
+              </w:rPr>
+            </w:pPr>
+            <w:r>
+              <w:rPr>
+                <w:rFonts w:ascii="Times New Roman" w:eastAsia="Times New Roman" w:hAnsi="Times New Roman" w:cs="Times New Roman"/>
+                <w:sz w:val="24"/>
+                <w:szCs w:val="24"/>
+              </w:rPr>
+              <w:t>Multiespecie</w:t>
+            </w:r>
+          </w:p>
+        </w:tc>
+        <w:tc>
+          <w:tcPr>
+            <w:tcW w:w="1459" w:type="dxa"/>
+          </w:tcPr>
+          <w:p>
+            <w:pPr>
+              <w:jc w:val="both"/>
+              <w:rPr>
+                <w:rFonts w:ascii="Times New Roman" w:eastAsia="Times New Roman" w:hAnsi="Times New Roman" w:cs="Times New Roman"/>
+                <w:sz w:val="24"/>
+                <w:szCs w:val="24"/>
+              </w:rPr>
+            </w:pPr>
+            <w:r>
+              <w:rPr>
+                <w:rFonts w:ascii="Times New Roman" w:eastAsia="Times New Roman" w:hAnsi="Times New Roman" w:cs="Times New Roman"/>
+                <w:sz w:val="24"/>
+                <w:szCs w:val="24"/>
+              </w:rPr>
+              <w:t>Sí</w:t>
+            </w:r>
+          </w:p>
+        </w:tc>
+        <w:tc>
+          <w:tcPr>
+            <w:tcW w:w="1664" w:type="dxa"/>
+          </w:tcPr>
+          <w:p>
+            <w:pPr>
+              <w:jc w:val="both"/>
+              <w:rPr>
+                <w:rFonts w:ascii="Times New Roman" w:eastAsia="Times New Roman" w:hAnsi="Times New Roman" w:cs="Times New Roman"/>
+                <w:sz w:val="24"/>
+                <w:szCs w:val="24"/>
+              </w:rPr>
+            </w:pPr>
+            <w:r>
+              <w:rPr>
+                <w:rFonts w:ascii="Times New Roman" w:eastAsia="Times New Roman" w:hAnsi="Times New Roman" w:cs="Times New Roman"/>
+                <w:sz w:val="24"/>
+                <w:szCs w:val="24"/>
+              </w:rPr>
+              <w:t>Sí</w:t>
+            </w:r>
+          </w:p>
+        </w:tc>
+        <w:tc>
+          <w:tcPr>
+            <w:tcW w:w="1418" w:type="dxa"/>
+          </w:tcPr>
+          <w:p>
+            <w:pPr>
+              <w:jc w:val="both"/>
+              <w:rPr>
+                <w:rFonts w:ascii="Times New Roman" w:eastAsia="Times New Roman" w:hAnsi="Times New Roman" w:cs="Times New Roman"/>
+                <w:sz w:val="24"/>
+                <w:szCs w:val="24"/>
+              </w:rPr>
+            </w:pPr>
+            <w:r>
+              <w:rPr>
+                <w:rFonts w:ascii="Times New Roman" w:eastAsia="Times New Roman" w:hAnsi="Times New Roman" w:cs="Times New Roman"/>
+                <w:sz w:val="24"/>
+                <w:szCs w:val="24"/>
+              </w:rPr>
+              <w:t>No (solo perros)</w:t>
+            </w:r>
+          </w:p>
+        </w:tc>
+        <w:tc>
+          <w:tcPr>
+            <w:tcW w:w="1417" w:type="dxa"/>
+          </w:tcPr>
+          <w:p>
+            <w:pPr>
+              <w:jc w:val="both"/>
+              <w:rPr>
+                <w:rFonts w:ascii="Times New Roman" w:eastAsia="Times New Roman" w:hAnsi="Times New Roman" w:cs="Times New Roman"/>
+                <w:sz w:val="24"/>
+                <w:szCs w:val="24"/>
+              </w:rPr>
+            </w:pPr>
+            <w:r>
+              <w:rPr>
+                <w:rFonts w:ascii="Times New Roman" w:eastAsia="Times New Roman" w:hAnsi="Times New Roman" w:cs="Times New Roman"/>
+                <w:sz w:val="24"/>
+                <w:szCs w:val="24"/>
+              </w:rPr>
+              <w:t>Sí</w:t>
+            </w:r>
+          </w:p>
+        </w:tc>
+        <w:tc>
+          <w:tcPr>
+            <w:tcW w:w="1270" w:type="dxa"/>
+          </w:tcPr>
+          <w:p>
+            <w:pPr>
+              <w:jc w:val="both"/>
+              <w:rPr>
+                <w:rFonts w:ascii="Times New Roman" w:eastAsia="Times New Roman" w:hAnsi="Times New Roman" w:cs="Times New Roman"/>
+                <w:sz w:val="24"/>
+                <w:szCs w:val="24"/>
+              </w:rPr>
+            </w:pPr>
+            <w:r>
+              <w:rPr>
+                <w:rFonts w:ascii="Times New Roman" w:eastAsia="Times New Roman" w:hAnsi="Times New Roman" w:cs="Times New Roman"/>
+                <w:sz w:val="24"/>
+                <w:szCs w:val="24"/>
+              </w:rPr>
+              <w:t>Sí</w:t>
+            </w:r>
+          </w:p>
+        </w:tc>
+      </w:tr>
+      <w:tr>
+        <w:tc>
+          <w:tcPr>
+            <w:tcW w:w="1550" w:type="dxa"/>
+          </w:tcPr>
+          <w:p>
+            <w:pPr>
+              <w:jc w:val="both"/>
+              <w:rPr>
+                <w:rFonts w:ascii="Times New Roman" w:eastAsia="Times New Roman" w:hAnsi="Times New Roman" w:cs="Times New Roman"/>
+                <w:sz w:val="24"/>
+                <w:szCs w:val="24"/>
+              </w:rPr>
+            </w:pPr>
+            <w:r>
+              <w:rPr>
+                <w:rFonts w:ascii="Times New Roman" w:eastAsia="Times New Roman" w:hAnsi="Times New Roman" w:cs="Times New Roman"/>
+                <w:sz w:val="24"/>
+                <w:szCs w:val="24"/>
+              </w:rPr>
+              <w:t>Módulo de medicación</w:t>
+            </w:r>
+          </w:p>
+        </w:tc>
+        <w:tc>
+          <w:tcPr>
+            <w:tcW w:w="1459" w:type="dxa"/>
+          </w:tcPr>
+          <w:p>
+            <w:pPr>
+              <w:jc w:val="both"/>
+              <w:rPr>
+                <w:rFonts w:ascii="Times New Roman" w:eastAsia="Times New Roman" w:hAnsi="Times New Roman" w:cs="Times New Roman"/>
+                <w:sz w:val="24"/>
+                <w:szCs w:val="24"/>
+              </w:rPr>
+            </w:pPr>
+            <w:r>
+              <w:rPr>
+                <w:rFonts w:ascii="Times New Roman" w:eastAsia="Times New Roman" w:hAnsi="Times New Roman" w:cs="Times New Roman"/>
+                <w:sz w:val="24"/>
+                <w:szCs w:val="24"/>
+              </w:rPr>
+              <w:t>Sí (básico)</w:t>
+            </w:r>
+          </w:p>
+        </w:tc>
+        <w:tc>
+          <w:tcPr>
+            <w:tcW w:w="1664" w:type="dxa"/>
+          </w:tcPr>
+          <w:p>
+            <w:pPr>
+              <w:jc w:val="both"/>
+              <w:rPr>
+                <w:rFonts w:ascii="Times New Roman" w:eastAsia="Times New Roman" w:hAnsi="Times New Roman" w:cs="Times New Roman"/>
+                <w:sz w:val="24"/>
+                <w:szCs w:val="24"/>
+              </w:rPr>
+            </w:pPr>
+            <w:r>
+              <w:rPr>
+                <w:rFonts w:ascii="Times New Roman" w:eastAsia="Times New Roman" w:hAnsi="Times New Roman" w:cs="Times New Roman"/>
+                <w:sz w:val="24"/>
+                <w:szCs w:val="24"/>
+              </w:rPr>
+              <w:t>Sí</w:t>
+            </w:r>
+          </w:p>
+        </w:tc>
+        <w:tc>
+          <w:tcPr>
+            <w:tcW w:w="1418" w:type="dxa"/>
+          </w:tcPr>
+          <w:p>
+            <w:pPr>
+              <w:jc w:val="both"/>
+              <w:rPr>
+                <w:rFonts w:ascii="Times New Roman" w:eastAsia="Times New Roman" w:hAnsi="Times New Roman" w:cs="Times New Roman"/>
+                <w:sz w:val="24"/>
+                <w:szCs w:val="24"/>
+              </w:rPr>
+            </w:pPr>
+            <w:r>
+              <w:rPr>
+                <w:rFonts w:ascii="Times New Roman" w:eastAsia="Times New Roman" w:hAnsi="Times New Roman" w:cs="Times New Roman"/>
+                <w:sz w:val="24"/>
+                <w:szCs w:val="24"/>
+              </w:rPr>
+              <w:t>Sí (básico)</w:t>
+            </w:r>
+          </w:p>
+        </w:tc>
+        <w:tc>
+          <w:tcPr>
+            <w:tcW w:w="1417" w:type="dxa"/>
+          </w:tcPr>
+          <w:p>
+            <w:pPr>
+              <w:jc w:val="both"/>
+              <w:rPr>
+                <w:rFonts w:ascii="Times New Roman" w:eastAsia="Times New Roman" w:hAnsi="Times New Roman" w:cs="Times New Roman"/>
+                <w:sz w:val="24"/>
+                <w:szCs w:val="24"/>
+              </w:rPr>
+            </w:pPr>
+            <w:r>
+              <w:rPr>
+                <w:rFonts w:ascii="Times New Roman" w:eastAsia="Times New Roman" w:hAnsi="Times New Roman" w:cs="Times New Roman"/>
+                <w:sz w:val="24"/>
+                <w:szCs w:val="24"/>
+              </w:rPr>
+              <w:t>Sí</w:t>
+            </w:r>
+          </w:p>
+        </w:tc>
+        <w:tc>
+          <w:tcPr>
+            <w:tcW w:w="1270" w:type="dxa"/>
+          </w:tcPr>
+          <w:p>
+            <w:pPr>
+              <w:jc w:val="both"/>
+              <w:rPr>
+                <w:rFonts w:ascii="Times New Roman" w:eastAsia="Times New Roman" w:hAnsi="Times New Roman" w:cs="Times New Roman"/>
+                <w:sz w:val="24"/>
+                <w:szCs w:val="24"/>
+              </w:rPr>
+            </w:pPr>
+            <w:r>
+              <w:rPr>
+                <w:rFonts w:ascii="Times New Roman" w:eastAsia="Times New Roman" w:hAnsi="Times New Roman" w:cs="Times New Roman"/>
+                <w:sz w:val="24"/>
+                <w:szCs w:val="24"/>
+              </w:rPr>
+              <w:t>Sí (básico)</w:t>
+            </w:r>
+          </w:p>
+        </w:tc>
+      </w:tr>
+      <w:tr>
+        <w:tc>
+          <w:tcPr>
+            <w:tcW w:w="1550" w:type="dxa"/>
+          </w:tcPr>
+          <w:p>
+            <w:pPr>
+              <w:jc w:val="both"/>
+              <w:rPr>
+                <w:rFonts w:ascii="Times New Roman" w:eastAsia="Times New Roman" w:hAnsi="Times New Roman" w:cs="Times New Roman"/>
+                <w:sz w:val="24"/>
+                <w:szCs w:val="24"/>
+              </w:rPr>
+            </w:pPr>
+            <w:r>
+              <w:rPr>
+                <w:rFonts w:ascii="Times New Roman" w:eastAsia="Times New Roman" w:hAnsi="Times New Roman" w:cs="Times New Roman"/>
+                <w:sz w:val="24"/>
+                <w:szCs w:val="24"/>
+              </w:rPr>
+              <w:t>Módulo de comidas</w:t>
+            </w:r>
+          </w:p>
+        </w:tc>
+        <w:tc>
+          <w:tcPr>
+            <w:tcW w:w="1459" w:type="dxa"/>
+          </w:tcPr>
+          <w:p>
+            <w:pPr>
+              <w:jc w:val="both"/>
+              <w:rPr>
+                <w:rFonts w:ascii="Times New Roman" w:eastAsia="Times New Roman" w:hAnsi="Times New Roman" w:cs="Times New Roman"/>
+                <w:sz w:val="24"/>
+                <w:szCs w:val="24"/>
+              </w:rPr>
+            </w:pPr>
+            <w:r>
+              <w:rPr>
+                <w:rFonts w:ascii="Times New Roman" w:eastAsia="Times New Roman" w:hAnsi="Times New Roman" w:cs="Times New Roman"/>
+                <w:sz w:val="24"/>
+                <w:szCs w:val="24"/>
+              </w:rPr>
+              <w:t>No</w:t>
+            </w:r>
+          </w:p>
+        </w:tc>
+        <w:tc>
+          <w:tcPr>
+            <w:tcW w:w="1664" w:type="dxa"/>
+          </w:tcPr>
+          <w:p>
+            <w:pPr>
+              <w:jc w:val="both"/>
+              <w:rPr>
+                <w:rFonts w:ascii="Times New Roman" w:eastAsia="Times New Roman" w:hAnsi="Times New Roman" w:cs="Times New Roman"/>
+                <w:sz w:val="24"/>
+                <w:szCs w:val="24"/>
+              </w:rPr>
+            </w:pPr>
+            <w:r>
+              <w:rPr>
+                <w:rFonts w:ascii="Times New Roman" w:eastAsia="Times New Roman" w:hAnsi="Times New Roman" w:cs="Times New Roman"/>
+                <w:sz w:val="24"/>
+                <w:szCs w:val="24"/>
+              </w:rPr>
+              <w:t>Sí</w:t>
+            </w:r>
+          </w:p>
+        </w:tc>
+        <w:tc>
+          <w:tcPr>
+            <w:tcW w:w="1418" w:type="dxa"/>
+          </w:tcPr>
+          <w:p>
+            <w:pPr>
+              <w:jc w:val="both"/>
+              <w:rPr>
+                <w:rFonts w:ascii="Times New Roman" w:eastAsia="Times New Roman" w:hAnsi="Times New Roman" w:cs="Times New Roman"/>
+                <w:sz w:val="24"/>
+                <w:szCs w:val="24"/>
+              </w:rPr>
+            </w:pPr>
+            <w:r>
+              <w:rPr>
+                <w:rFonts w:ascii="Times New Roman" w:eastAsia="Times New Roman" w:hAnsi="Times New Roman" w:cs="Times New Roman"/>
+                <w:sz w:val="24"/>
+                <w:szCs w:val="24"/>
+              </w:rPr>
+              <w:t>Sí (básico)</w:t>
+            </w:r>
+          </w:p>
+        </w:tc>
+        <w:tc>
+          <w:tcPr>
+            <w:tcW w:w="1417" w:type="dxa"/>
+          </w:tcPr>
+          <w:p>
+            <w:pPr>
+              <w:jc w:val="both"/>
+              <w:rPr>
+                <w:rFonts w:ascii="Times New Roman" w:eastAsia="Times New Roman" w:hAnsi="Times New Roman" w:cs="Times New Roman"/>
+                <w:sz w:val="24"/>
+                <w:szCs w:val="24"/>
+              </w:rPr>
+            </w:pPr>
+            <w:r>
+              <w:rPr>
+                <w:rFonts w:ascii="Times New Roman" w:eastAsia="Times New Roman" w:hAnsi="Times New Roman" w:cs="Times New Roman"/>
+                <w:sz w:val="24"/>
+                <w:szCs w:val="24"/>
+              </w:rPr>
+              <w:t>Sí</w:t>
+            </w:r>
+          </w:p>
+        </w:tc>
+        <w:tc>
+          <w:tcPr>
+            <w:tcW w:w="1270" w:type="dxa"/>
+          </w:tcPr>
+          <w:p>
+            <w:pPr>
+              <w:jc w:val="both"/>
+              <w:rPr>
+                <w:rFonts w:ascii="Times New Roman" w:eastAsia="Times New Roman" w:hAnsi="Times New Roman" w:cs="Times New Roman"/>
+                <w:sz w:val="24"/>
+                <w:szCs w:val="24"/>
+              </w:rPr>
+            </w:pPr>
+            <w:r>
+              <w:rPr>
+                <w:rFonts w:ascii="Times New Roman" w:eastAsia="Times New Roman" w:hAnsi="Times New Roman" w:cs="Times New Roman"/>
+                <w:sz w:val="24"/>
+                <w:szCs w:val="24"/>
+              </w:rPr>
+              <w:t>No</w:t>
+            </w:r>
+          </w:p>
+        </w:tc>
+      </w:tr>
+      <w:tr>
+        <w:tc>
+          <w:tcPr>
+            <w:tcW w:w="1550" w:type="dxa"/>
+          </w:tcPr>
+          <w:p>
+            <w:pPr>
+              <w:jc w:val="both"/>
+              <w:rPr>
+                <w:rFonts w:ascii="Times New Roman" w:eastAsia="Times New Roman" w:hAnsi="Times New Roman" w:cs="Times New Roman"/>
+                <w:sz w:val="24"/>
+                <w:szCs w:val="24"/>
+              </w:rPr>
+            </w:pPr>
+            <w:r>
+              <w:rPr>
+                <w:rFonts w:ascii="Times New Roman" w:eastAsia="Times New Roman" w:hAnsi="Times New Roman" w:cs="Times New Roman"/>
+                <w:sz w:val="24"/>
+                <w:szCs w:val="24"/>
+              </w:rPr>
+              <w:t>Módulo de paseos</w:t>
+            </w:r>
+          </w:p>
+        </w:tc>
+        <w:tc>
+          <w:tcPr>
+            <w:tcW w:w="1459" w:type="dxa"/>
+          </w:tcPr>
+          <w:p>
+            <w:pPr>
+              <w:jc w:val="both"/>
+              <w:rPr>
+                <w:rFonts w:ascii="Times New Roman" w:eastAsia="Times New Roman" w:hAnsi="Times New Roman" w:cs="Times New Roman"/>
+                <w:sz w:val="24"/>
+                <w:szCs w:val="24"/>
+              </w:rPr>
+            </w:pPr>
+            <w:r>
+              <w:rPr>
+                <w:rFonts w:ascii="Times New Roman" w:eastAsia="Times New Roman" w:hAnsi="Times New Roman" w:cs="Times New Roman"/>
+                <w:sz w:val="24"/>
+                <w:szCs w:val="24"/>
+              </w:rPr>
+              <w:t>No</w:t>
+            </w:r>
+          </w:p>
+        </w:tc>
+        <w:tc>
+          <w:tcPr>
+            <w:tcW w:w="1664" w:type="dxa"/>
+          </w:tcPr>
+          <w:p>
+            <w:pPr>
+              <w:jc w:val="both"/>
+              <w:rPr>
+                <w:rFonts w:ascii="Times New Roman" w:eastAsia="Times New Roman" w:hAnsi="Times New Roman" w:cs="Times New Roman"/>
+                <w:sz w:val="24"/>
+                <w:szCs w:val="24"/>
+              </w:rPr>
+            </w:pPr>
+            <w:r>
+              <w:rPr>
+                <w:rFonts w:ascii="Times New Roman" w:eastAsia="Times New Roman" w:hAnsi="Times New Roman" w:cs="Times New Roman"/>
+                <w:sz w:val="24"/>
+                <w:szCs w:val="24"/>
+              </w:rPr>
+              <w:t>No</w:t>
+            </w:r>
+          </w:p>
+        </w:tc>
+        <w:tc>
+          <w:tcPr>
+            <w:tcW w:w="1418" w:type="dxa"/>
+          </w:tcPr>
+          <w:p>
+            <w:pPr>
+              <w:jc w:val="both"/>
+              <w:rPr>
+                <w:rFonts w:ascii="Times New Roman" w:eastAsia="Times New Roman" w:hAnsi="Times New Roman" w:cs="Times New Roman"/>
+                <w:sz w:val="24"/>
+                <w:szCs w:val="24"/>
+              </w:rPr>
+            </w:pPr>
+            <w:r>
+              <w:rPr>
+                <w:rFonts w:ascii="Times New Roman" w:eastAsia="Times New Roman" w:hAnsi="Times New Roman" w:cs="Times New Roman"/>
+                <w:sz w:val="24"/>
+                <w:szCs w:val="24"/>
+              </w:rPr>
+              <w:t>Sí</w:t>
+            </w:r>
+          </w:p>
+        </w:tc>
+        <w:tc>
+          <w:tcPr>
+            <w:tcW w:w="1417" w:type="dxa"/>
+          </w:tcPr>
+          <w:p>
+            <w:pPr>
+              <w:jc w:val="both"/>
+              <w:rPr>
+                <w:rFonts w:ascii="Times New Roman" w:eastAsia="Times New Roman" w:hAnsi="Times New Roman" w:cs="Times New Roman"/>
+                <w:sz w:val="24"/>
+                <w:szCs w:val="24"/>
+              </w:rPr>
+            </w:pPr>
+            <w:r>
+              <w:rPr>
+                <w:rFonts w:ascii="Times New Roman" w:eastAsia="Times New Roman" w:hAnsi="Times New Roman" w:cs="Times New Roman"/>
+                <w:sz w:val="24"/>
+                <w:szCs w:val="24"/>
+              </w:rPr>
+              <w:t>Sí</w:t>
+            </w:r>
+          </w:p>
+        </w:tc>
+        <w:tc>
+          <w:tcPr>
+            <w:tcW w:w="1270" w:type="dxa"/>
+          </w:tcPr>
+          <w:p>
+            <w:pPr>
+              <w:jc w:val="both"/>
+              <w:rPr>
+                <w:rFonts w:ascii="Times New Roman" w:eastAsia="Times New Roman" w:hAnsi="Times New Roman" w:cs="Times New Roman"/>
+                <w:sz w:val="24"/>
+                <w:szCs w:val="24"/>
+              </w:rPr>
+            </w:pPr>
+            <w:r>
+              <w:rPr>
+                <w:rFonts w:ascii="Times New Roman" w:eastAsia="Times New Roman" w:hAnsi="Times New Roman" w:cs="Times New Roman"/>
+                <w:sz w:val="24"/>
+                <w:szCs w:val="24"/>
+              </w:rPr>
+              <w:t>No</w:t>
+            </w:r>
+          </w:p>
+        </w:tc>
+      </w:tr>
+      <w:tr>
+        <w:tc>
+          <w:tcPr>
+            <w:tcW w:w="1550" w:type="dxa"/>
+          </w:tcPr>
+          <w:p>
+            <w:pPr>
+              <w:jc w:val="both"/>
+              <w:rPr>
+                <w:rFonts w:ascii="Times New Roman" w:eastAsia="Times New Roman" w:hAnsi="Times New Roman" w:cs="Times New Roman"/>
+                <w:sz w:val="24"/>
+                <w:szCs w:val="24"/>
+              </w:rPr>
+            </w:pPr>
+            <w:r>
+              <w:rPr>
+                <w:rFonts w:ascii="Times New Roman" w:eastAsia="Times New Roman" w:hAnsi="Times New Roman" w:cs="Times New Roman"/>
+                <w:sz w:val="24"/>
+                <w:szCs w:val="24"/>
+              </w:rPr>
+              <w:t>Multiusuario</w:t>
+            </w:r>
+          </w:p>
+        </w:tc>
+        <w:tc>
+          <w:tcPr>
+            <w:tcW w:w="1459" w:type="dxa"/>
+          </w:tcPr>
+          <w:p>
+            <w:pPr>
+              <w:jc w:val="both"/>
+              <w:rPr>
+                <w:rFonts w:ascii="Times New Roman" w:eastAsia="Times New Roman" w:hAnsi="Times New Roman" w:cs="Times New Roman"/>
+                <w:sz w:val="24"/>
+                <w:szCs w:val="24"/>
+              </w:rPr>
+            </w:pPr>
+            <w:r>
+              <w:rPr>
+                <w:rFonts w:ascii="Times New Roman" w:eastAsia="Times New Roman" w:hAnsi="Times New Roman" w:cs="Times New Roman"/>
+                <w:sz w:val="24"/>
+                <w:szCs w:val="24"/>
+              </w:rPr>
+              <w:t>Sí (limitado)</w:t>
+            </w:r>
+          </w:p>
+        </w:tc>
+        <w:tc>
+          <w:tcPr>
+            <w:tcW w:w="1664" w:type="dxa"/>
+          </w:tcPr>
+          <w:p>
+            <w:pPr>
+              <w:jc w:val="both"/>
+              <w:rPr>
+                <w:rFonts w:ascii="Times New Roman" w:eastAsia="Times New Roman" w:hAnsi="Times New Roman" w:cs="Times New Roman"/>
+                <w:sz w:val="24"/>
+                <w:szCs w:val="24"/>
+              </w:rPr>
+            </w:pPr>
+            <w:r>
+              <w:rPr>
+                <w:rFonts w:ascii="Times New Roman" w:eastAsia="Times New Roman" w:hAnsi="Times New Roman" w:cs="Times New Roman"/>
+                <w:sz w:val="24"/>
+                <w:szCs w:val="24"/>
+              </w:rPr>
+              <w:t>Sí (misma cuenta)</w:t>
+            </w:r>
+          </w:p>
+        </w:tc>
+        <w:tc>
+          <w:tcPr>
+            <w:tcW w:w="1418" w:type="dxa"/>
+          </w:tcPr>
+          <w:p>
+            <w:pPr>
+              <w:jc w:val="both"/>
+              <w:rPr>
+                <w:rFonts w:ascii="Times New Roman" w:eastAsia="Times New Roman" w:hAnsi="Times New Roman" w:cs="Times New Roman"/>
+                <w:sz w:val="24"/>
+                <w:szCs w:val="24"/>
+              </w:rPr>
+            </w:pPr>
+            <w:r>
+              <w:rPr>
+                <w:rFonts w:ascii="Times New Roman" w:eastAsia="Times New Roman" w:hAnsi="Times New Roman" w:cs="Times New Roman"/>
+                <w:sz w:val="24"/>
+                <w:szCs w:val="24"/>
+              </w:rPr>
+              <w:t>Sí (de pago)</w:t>
+            </w:r>
+          </w:p>
+        </w:tc>
+        <w:tc>
+          <w:tcPr>
+            <w:tcW w:w="1417" w:type="dxa"/>
+          </w:tcPr>
+          <w:p>
+            <w:pPr>
+              <w:jc w:val="both"/>
+              <w:rPr>
+                <w:rFonts w:ascii="Times New Roman" w:eastAsia="Times New Roman" w:hAnsi="Times New Roman" w:cs="Times New Roman"/>
+                <w:sz w:val="24"/>
+                <w:szCs w:val="24"/>
+              </w:rPr>
+            </w:pPr>
+            <w:r>
+              <w:rPr>
+                <w:rFonts w:ascii="Times New Roman" w:eastAsia="Times New Roman" w:hAnsi="Times New Roman" w:cs="Times New Roman"/>
+                <w:sz w:val="24"/>
+                <w:szCs w:val="24"/>
+              </w:rPr>
+              <w:t>Sí</w:t>
+            </w:r>
+          </w:p>
+        </w:tc>
+        <w:tc>
+          <w:tcPr>
+            <w:tcW w:w="1270" w:type="dxa"/>
+          </w:tcPr>
+          <w:p>
+            <w:pPr>
+              <w:jc w:val="both"/>
+              <w:rPr>
+                <w:rFonts w:ascii="Times New Roman" w:eastAsia="Times New Roman" w:hAnsi="Times New Roman" w:cs="Times New Roman"/>
+                <w:sz w:val="24"/>
+                <w:szCs w:val="24"/>
+              </w:rPr>
+            </w:pPr>
+            <w:r>
+              <w:rPr>
+                <w:rFonts w:ascii="Times New Roman" w:eastAsia="Times New Roman" w:hAnsi="Times New Roman" w:cs="Times New Roman"/>
+                <w:sz w:val="24"/>
+                <w:szCs w:val="24"/>
+              </w:rPr>
+              <w:t>Sí</w:t>
+            </w:r>
+          </w:p>
+        </w:tc>
+      </w:tr>
+      <w:tr>
+        <w:tc>
+          <w:tcPr>
+            <w:tcW w:w="1550" w:type="dxa"/>
+          </w:tcPr>
+          <w:p>
+            <w:pPr>
+              <w:jc w:val="both"/>
+              <w:rPr>
+                <w:rFonts w:ascii="Times New Roman" w:eastAsia="Times New Roman" w:hAnsi="Times New Roman" w:cs="Times New Roman"/>
+                <w:sz w:val="24"/>
+                <w:szCs w:val="24"/>
+              </w:rPr>
+            </w:pPr>
+            <w:r>
+              <w:rPr>
+                <w:rFonts w:ascii="Times New Roman" w:eastAsia="Times New Roman" w:hAnsi="Times New Roman" w:cs="Times New Roman"/>
+                <w:sz w:val="24"/>
+                <w:szCs w:val="24"/>
+              </w:rPr>
+              <w:t>Confirmación de acciones compartidas</w:t>
+            </w:r>
+          </w:p>
+        </w:tc>
+        <w:tc>
+          <w:tcPr>
+            <w:tcW w:w="1459" w:type="dxa"/>
+          </w:tcPr>
+          <w:p>
+            <w:pPr>
+              <w:jc w:val="both"/>
+              <w:rPr>
+                <w:rFonts w:ascii="Times New Roman" w:eastAsia="Times New Roman" w:hAnsi="Times New Roman" w:cs="Times New Roman"/>
+                <w:sz w:val="24"/>
+                <w:szCs w:val="24"/>
+              </w:rPr>
+            </w:pPr>
+            <w:r>
+              <w:rPr>
+                <w:rFonts w:ascii="Times New Roman" w:eastAsia="Times New Roman" w:hAnsi="Times New Roman" w:cs="Times New Roman"/>
+                <w:sz w:val="24"/>
+                <w:szCs w:val="24"/>
+              </w:rPr>
+              <w:t>No</w:t>
+            </w:r>
+          </w:p>
+        </w:tc>
+        <w:tc>
+          <w:tcPr>
+            <w:tcW w:w="1664" w:type="dxa"/>
+          </w:tcPr>
+          <w:p>
+            <w:pPr>
+              <w:jc w:val="both"/>
+              <w:rPr>
+                <w:rFonts w:ascii="Times New Roman" w:eastAsia="Times New Roman" w:hAnsi="Times New Roman" w:cs="Times New Roman"/>
+                <w:sz w:val="24"/>
+                <w:szCs w:val="24"/>
+              </w:rPr>
+            </w:pPr>
+            <w:r>
+              <w:rPr>
+                <w:rFonts w:ascii="Times New Roman" w:eastAsia="Times New Roman" w:hAnsi="Times New Roman" w:cs="Times New Roman"/>
+                <w:sz w:val="24"/>
+                <w:szCs w:val="24"/>
+              </w:rPr>
+              <w:t>No</w:t>
+            </w:r>
+          </w:p>
+        </w:tc>
+        <w:tc>
+          <w:tcPr>
+            <w:tcW w:w="1418" w:type="dxa"/>
+          </w:tcPr>
+          <w:p>
+            <w:pPr>
+              <w:jc w:val="both"/>
+              <w:rPr>
+                <w:rFonts w:ascii="Times New Roman" w:eastAsia="Times New Roman" w:hAnsi="Times New Roman" w:cs="Times New Roman"/>
+                <w:sz w:val="24"/>
+                <w:szCs w:val="24"/>
+              </w:rPr>
+            </w:pPr>
+            <w:r>
+              <w:rPr>
+                <w:rFonts w:ascii="Times New Roman" w:eastAsia="Times New Roman" w:hAnsi="Times New Roman" w:cs="Times New Roman"/>
+                <w:sz w:val="24"/>
+                <w:szCs w:val="24"/>
+              </w:rPr>
+              <w:t>No</w:t>
+            </w:r>
+          </w:p>
+        </w:tc>
+        <w:tc>
+          <w:tcPr>
+            <w:tcW w:w="1417" w:type="dxa"/>
+          </w:tcPr>
+          <w:p>
+            <w:pPr>
+              <w:jc w:val="both"/>
+              <w:rPr>
+                <w:rFonts w:ascii="Times New Roman" w:eastAsia="Times New Roman" w:hAnsi="Times New Roman" w:cs="Times New Roman"/>
+                <w:sz w:val="24"/>
+                <w:szCs w:val="24"/>
+              </w:rPr>
+            </w:pPr>
+            <w:r>
+              <w:rPr>
+                <w:rFonts w:ascii="Times New Roman" w:eastAsia="Times New Roman" w:hAnsi="Times New Roman" w:cs="Times New Roman"/>
+                <w:sz w:val="24"/>
+                <w:szCs w:val="24"/>
+              </w:rPr>
+              <w:t>Parcial</w:t>
+            </w:r>
+          </w:p>
+        </w:tc>
+        <w:tc>
+          <w:tcPr>
+            <w:tcW w:w="1270" w:type="dxa"/>
+          </w:tcPr>
+          <w:p>
+            <w:pPr>
+              <w:jc w:val="both"/>
+              <w:rPr>
+                <w:rFonts w:ascii="Times New Roman" w:eastAsia="Times New Roman" w:hAnsi="Times New Roman" w:cs="Times New Roman"/>
+                <w:sz w:val="24"/>
+                <w:szCs w:val="24"/>
+              </w:rPr>
+            </w:pPr>
+            <w:r>
+              <w:rPr>
+                <w:rFonts w:ascii="Times New Roman" w:eastAsia="Times New Roman" w:hAnsi="Times New Roman" w:cs="Times New Roman"/>
+                <w:sz w:val="24"/>
+                <w:szCs w:val="24"/>
+              </w:rPr>
+              <w:t>No</w:t>
+            </w:r>
+          </w:p>
+        </w:tc>
+      </w:tr>
+      <w:tr>
+        <w:tc>
+          <w:tcPr>
+            <w:tcW w:w="1550" w:type="dxa"/>
+          </w:tcPr>
+          <w:p>
+            <w:pPr>
+              <w:jc w:val="both"/>
+              <w:rPr>
+                <w:rFonts w:ascii="Times New Roman" w:eastAsia="Times New Roman" w:hAnsi="Times New Roman" w:cs="Times New Roman"/>
+                <w:sz w:val="24"/>
+                <w:szCs w:val="24"/>
+              </w:rPr>
+            </w:pPr>
+            <w:r>
+              <w:rPr>
+                <w:rFonts w:ascii="Times New Roman" w:eastAsia="Times New Roman" w:hAnsi="Times New Roman" w:cs="Times New Roman"/>
+                <w:sz w:val="24"/>
+                <w:szCs w:val="24"/>
+              </w:rPr>
+              <w:lastRenderedPageBreak/>
+              <w:t>Control de concurrencia</w:t>
+            </w:r>
+          </w:p>
+        </w:tc>
+        <w:tc>
+          <w:tcPr>
+            <w:tcW w:w="1459" w:type="dxa"/>
+          </w:tcPr>
+          <w:p>
+            <w:pPr>
+              <w:jc w:val="both"/>
+              <w:rPr>
+                <w:rFonts w:ascii="Times New Roman" w:eastAsia="Times New Roman" w:hAnsi="Times New Roman" w:cs="Times New Roman"/>
+                <w:sz w:val="24"/>
+                <w:szCs w:val="24"/>
+              </w:rPr>
+            </w:pPr>
+            <w:r>
+              <w:rPr>
+                <w:rFonts w:ascii="Times New Roman" w:eastAsia="Times New Roman" w:hAnsi="Times New Roman" w:cs="Times New Roman"/>
+                <w:sz w:val="24"/>
+                <w:szCs w:val="24"/>
+              </w:rPr>
+              <w:t>No</w:t>
+            </w:r>
+          </w:p>
+        </w:tc>
+        <w:tc>
+          <w:tcPr>
+            <w:tcW w:w="1664" w:type="dxa"/>
+          </w:tcPr>
+          <w:p>
+            <w:pPr>
+              <w:jc w:val="both"/>
+              <w:rPr>
+                <w:rFonts w:ascii="Times New Roman" w:eastAsia="Times New Roman" w:hAnsi="Times New Roman" w:cs="Times New Roman"/>
+                <w:sz w:val="24"/>
+                <w:szCs w:val="24"/>
+              </w:rPr>
+            </w:pPr>
+            <w:r>
+              <w:rPr>
+                <w:rFonts w:ascii="Times New Roman" w:eastAsia="Times New Roman" w:hAnsi="Times New Roman" w:cs="Times New Roman"/>
+                <w:sz w:val="24"/>
+                <w:szCs w:val="24"/>
+              </w:rPr>
+              <w:t>No</w:t>
+            </w:r>
+          </w:p>
+        </w:tc>
+        <w:tc>
+          <w:tcPr>
+            <w:tcW w:w="1418" w:type="dxa"/>
+          </w:tcPr>
+          <w:p>
+            <w:pPr>
+              <w:jc w:val="both"/>
+              <w:rPr>
+                <w:rFonts w:ascii="Times New Roman" w:eastAsia="Times New Roman" w:hAnsi="Times New Roman" w:cs="Times New Roman"/>
+                <w:sz w:val="24"/>
+                <w:szCs w:val="24"/>
+              </w:rPr>
+            </w:pPr>
+            <w:r>
+              <w:rPr>
+                <w:rFonts w:ascii="Times New Roman" w:eastAsia="Times New Roman" w:hAnsi="Times New Roman" w:cs="Times New Roman"/>
+                <w:sz w:val="24"/>
+                <w:szCs w:val="24"/>
+              </w:rPr>
+              <w:t>No</w:t>
+            </w:r>
+          </w:p>
+        </w:tc>
+        <w:tc>
+          <w:tcPr>
+            <w:tcW w:w="1417" w:type="dxa"/>
+          </w:tcPr>
+          <w:p>
+            <w:pPr>
+              <w:jc w:val="both"/>
+              <w:rPr>
+                <w:rFonts w:ascii="Times New Roman" w:eastAsia="Times New Roman" w:hAnsi="Times New Roman" w:cs="Times New Roman"/>
+                <w:sz w:val="24"/>
+                <w:szCs w:val="24"/>
+              </w:rPr>
+            </w:pPr>
+            <w:r>
+              <w:rPr>
+                <w:rFonts w:ascii="Times New Roman" w:eastAsia="Times New Roman" w:hAnsi="Times New Roman" w:cs="Times New Roman"/>
+                <w:sz w:val="24"/>
+                <w:szCs w:val="24"/>
+              </w:rPr>
+              <w:t>No</w:t>
+            </w:r>
+          </w:p>
+        </w:tc>
+        <w:tc>
+          <w:tcPr>
+            <w:tcW w:w="1270" w:type="dxa"/>
+          </w:tcPr>
+          <w:p>
+            <w:pPr>
+              <w:jc w:val="both"/>
+              <w:rPr>
+                <w:rFonts w:ascii="Times New Roman" w:eastAsia="Times New Roman" w:hAnsi="Times New Roman" w:cs="Times New Roman"/>
+                <w:sz w:val="24"/>
+                <w:szCs w:val="24"/>
+              </w:rPr>
+            </w:pPr>
+            <w:r>
+              <w:rPr>
+                <w:rFonts w:ascii="Times New Roman" w:eastAsia="Times New Roman" w:hAnsi="Times New Roman" w:cs="Times New Roman"/>
+                <w:sz w:val="24"/>
+                <w:szCs w:val="24"/>
+              </w:rPr>
+              <w:t>No</w:t>
+            </w:r>
+          </w:p>
+        </w:tc>
+      </w:tr>
+    </w:tbl>
+    <w:p>
+      <w:pPr>
+        <w:pBdr>
+          <w:top w:val="nil"/>
+          <w:left w:val="nil"/>
+          <w:bottom w:val="nil"/>
+          <w:right w:val="nil"/>
+          <w:between w:val="nil"/>
+        </w:pBdr>
+        <w:jc w:val="both"/>
+        <w:rPr>
+          <w:rFonts w:ascii="Times New Roman" w:eastAsia="Times New Roman" w:hAnsi="Times New Roman" w:cs="Times New Roman"/>
+          <w:sz w:val="24"/>
+          <w:szCs w:val="24"/>
+        </w:rPr>
+      </w:pPr>
+    </w:p>
+    <w:p>
+      <w:pPr>
+        <w:pBdr>
+          <w:top w:val="nil"/>
+          <w:left w:val="nil"/>
+          <w:bottom w:val="nil"/>
+          <w:right w:val="nil"/>
+          <w:between w:val="nil"/>
+        </w:pBdr>
+        <w:jc w:val="both"/>
+        <w:rPr>
+          <w:rFonts w:ascii="Times New Roman" w:eastAsia="Times New Roman" w:hAnsi="Times New Roman" w:cs="Times New Roman"/>
+          <w:sz w:val="24"/>
+          <w:szCs w:val="24"/>
+        </w:rPr>
+      </w:pPr>
+      <w:r>
+        <w:rPr>
+          <w:rFonts w:ascii="Times New Roman" w:eastAsia="Times New Roman" w:hAnsi="Times New Roman" w:cs="Times New Roman"/>
+          <w:sz w:val="24"/>
+          <w:szCs w:val="24"/>
+        </w:rPr>
+        <w:t>De la comparativa se extrae que ninguna de las herramientas analizadas ofrece una solución completa a la problemática identificada. PetDesk y VitusVet presentan un enfoque principalmente clínico y dependiente de la integración con clínicas veterinarias, lo que limita su utilidad en el contexto doméstico español. Dogo se centra exclusivamente en el adiestramiento canino y no cubre la gestión del cuidado diario de forma integral. 11Pets ofrece una solución más completa en cuanto a módulos de cuidado, pero su sistema multiusuarios se basa en el uso compartido de una única cuenta, sin diferenciación de roles ni confirmación de acciones entre cuidadores. PetnotePlus es la herramienta más próxima al enfoque del presente proyecto, ya que incorpora módulos de medicación, comidas y paseos con acceso multiusuario y notificaciones entre cuidadores. Sin embargo, ninguna de las aplicaciones analizadas implementa un mecanismo de control de concurrencia que impida la confirmación simultánea de una misma acción por parte de varios cuidadores, ni está disponible como aplicación web progresiva sin necesidad de instalación. Estas carencias justifican el desarrollo de la herramienta propuesta en el presente trabajo</w:t>
       </w:r>
     </w:p>
     <w:p>
@@ -7180,6 +8959,25 @@
       <w:szCs w:val="18"/>
     </w:rPr>
   </w:style>
+  <w:style w:type="table" w:styleId="Tablaconcuadrcula">
+    <w:name w:val="Table Grid"/>
+    <w:basedOn w:val="Tablanormal"/>
+    <w:uiPriority w:val="39"/>
+    <w:rsid w:val="0002033D"/>
+    <w:pPr>
+      <w:spacing w:line="240" w:lineRule="auto"/>
+    </w:pPr>
+    <w:tblPr>
+      <w:tblBorders>
+        <w:top w:val="single" w:sz="4" w:space="0" w:color="auto"/>
+        <w:left w:val="single" w:sz="4" w:space="0" w:color="auto"/>
+        <w:bottom w:val="single" w:sz="4" w:space="0" w:color="auto"/>
+        <w:right w:val="single" w:sz="4" w:space="0" w:color="auto"/>
+        <w:insideH w:val="single" w:sz="4" w:space="0" w:color="auto"/>
+        <w:insideV w:val="single" w:sz="4" w:space="0" w:color="auto"/>
+      </w:tblBorders>
+    </w:tblPr>
+  </w:style>
 </w:styles>
 </file>
 

</xml_diff>

<commit_message>
Update Capitulo 2 to add 2.2.6
</commit_message>
<xml_diff>
--- a/docs/Capítulo 2 - Antecedentes.docx
+++ b/docs/Capítulo 2 - Antecedentes.docx
@@ -3295,7 +3295,25 @@
           <w:sz w:val="24"/>
           <w:szCs w:val="24"/>
         </w:rPr>
-        <w:t>Calendario de Potty Training (Control de esfínteres): Un registro visual donde marcas si el perro hizo sus necesidades fuera, dentro o si hubo un "accidente", ideal para cachorros.</w:t>
+        <w:t xml:space="preserve">Calendario de </w:t>
+      </w:r>
+      <w:proofErr w:type="spellStart"/>
+      <w:r>
+        <w:rPr>
+          <w:rFonts w:ascii="Times New Roman" w:eastAsia="Times New Roman" w:hAnsi="Times New Roman" w:cs="Times New Roman"/>
+          <w:sz w:val="24"/>
+          <w:szCs w:val="24"/>
+        </w:rPr>
+        <w:t>Potty</w:t>
+      </w:r>
+      <w:proofErr w:type="spellEnd"/>
+      <w:r>
+        <w:rPr>
+          <w:rFonts w:ascii="Times New Roman" w:eastAsia="Times New Roman" w:hAnsi="Times New Roman" w:cs="Times New Roman"/>
+          <w:sz w:val="24"/>
+          <w:szCs w:val="24"/>
+        </w:rPr>
+        <w:t xml:space="preserve"> Training (Control de esfínteres): Un registro visual donde marcas si el perro hizo sus necesidades fuera, dentro o si hubo un "accidente", ideal para cachorros.</w:t>
       </w:r>
     </w:p>
     <w:p>
@@ -4178,7 +4196,25 @@
           <w:sz w:val="24"/>
           <w:szCs w:val="24"/>
         </w:rPr>
-        <w:t xml:space="preserve"> modulos que </w:t>
+        <w:t xml:space="preserve"> </w:t>
+      </w:r>
+      <w:proofErr w:type="spellStart"/>
+      <w:r>
+        <w:rPr>
+          <w:rFonts w:ascii="Times New Roman" w:eastAsia="Times New Roman" w:hAnsi="Times New Roman" w:cs="Times New Roman"/>
+          <w:sz w:val="24"/>
+          <w:szCs w:val="24"/>
+        </w:rPr>
+        <w:t>modulos</w:t>
+      </w:r>
+      <w:proofErr w:type="spellEnd"/>
+      <w:r>
+        <w:rPr>
+          <w:rFonts w:ascii="Times New Roman" w:eastAsia="Times New Roman" w:hAnsi="Times New Roman" w:cs="Times New Roman"/>
+          <w:sz w:val="24"/>
+          <w:szCs w:val="24"/>
+        </w:rPr>
+        <w:t xml:space="preserve"> que </w:t>
       </w:r>
       <w:r>
         <w:rPr>
@@ -5553,7 +5589,43 @@
           <w:sz w:val="24"/>
           <w:szCs w:val="24"/>
         </w:rPr>
-        <w:t xml:space="preserve"> El sistema permite compartir la información con diferentes niveles al igual que es posible compartir los registros con un cuidador temporal (acceso limitado o por tiempo) o con un co-propietario. Asimismo, cuenta con un sistema de confirmación de acciones compartidas en la que, al establecer un recordatorio de medicación, la aplicación permite establecerlo como “Realizado”. Esto es visible para todos los que comparten el perfil del animal. Uno de los mayores valores de la herramienta es la notificación en tiempo real. Si un miembro de la familia confirma que ya ha dado la medicación o ha asistido a una cita, el resto de cuidadores recibe una notificación para evitar que se duplique la dosis o acción.</w:t>
+        <w:t xml:space="preserve"> El sistema permite compartir la información con diferentes niveles al igual que es posible compartir los registros con un cuidador temporal (acceso limitado o por tiempo) o con un </w:t>
+      </w:r>
+      <w:proofErr w:type="spellStart"/>
+      <w:r>
+        <w:rPr>
+          <w:rFonts w:ascii="Times New Roman" w:eastAsia="Times New Roman" w:hAnsi="Times New Roman" w:cs="Times New Roman"/>
+          <w:sz w:val="24"/>
+          <w:szCs w:val="24"/>
+        </w:rPr>
+        <w:t>co-propietario</w:t>
+      </w:r>
+      <w:proofErr w:type="spellEnd"/>
+      <w:r>
+        <w:rPr>
+          <w:rFonts w:ascii="Times New Roman" w:eastAsia="Times New Roman" w:hAnsi="Times New Roman" w:cs="Times New Roman"/>
+          <w:sz w:val="24"/>
+          <w:szCs w:val="24"/>
+        </w:rPr>
+        <w:t xml:space="preserve">. Asimismo, cuenta con un sistema de confirmación de acciones compartidas en la que, al establecer un recordatorio de medicación, la aplicación permite establecerlo como “Realizado”. Esto es visible para todos los que comparten el perfil del animal. Uno de los mayores valores de la herramienta es la notificación en tiempo real. Si un miembro de la familia confirma que ya ha dado la medicación o ha asistido a una cita, el resto de </w:t>
+      </w:r>
+      <w:proofErr w:type="gramStart"/>
+      <w:r>
+        <w:rPr>
+          <w:rFonts w:ascii="Times New Roman" w:eastAsia="Times New Roman" w:hAnsi="Times New Roman" w:cs="Times New Roman"/>
+          <w:sz w:val="24"/>
+          <w:szCs w:val="24"/>
+        </w:rPr>
+        <w:t>cuidadores</w:t>
+      </w:r>
+      <w:proofErr w:type="gramEnd"/>
+      <w:r>
+        <w:rPr>
+          <w:rFonts w:ascii="Times New Roman" w:eastAsia="Times New Roman" w:hAnsi="Times New Roman" w:cs="Times New Roman"/>
+          <w:sz w:val="24"/>
+          <w:szCs w:val="24"/>
+        </w:rPr>
+        <w:t xml:space="preserve"> recibe una notificación para evitar que se duplique la dosis o acción.</w:t>
       </w:r>
     </w:p>
     <w:p>
@@ -5654,25 +5726,1213 @@
           <w:sz w:val="24"/>
           <w:szCs w:val="24"/>
         </w:rPr>
-        <w:t>Adicionalmente, al final de este apartado de estudio de diversas herramientas, se pueda incorporar una breve reseña, a modo de resumen, que deje constancia de las características de cada una de las herramientas vistas para, de un vistazo, poder ver las ventajas e inconvenientes de cada una de ellas, qué necesidades cubren y cuáles no. Estaría muy bien incluir aquí un cuadro/tabla resumen que permita hacer una revisión comparativa rápida de las herramientas estudiadas.</w:t>
-      </w:r>
-    </w:p>
-    <w:p>
-      <w:pPr>
-        <w:pBdr>
-          <w:top w:val="nil"/>
-          <w:left w:val="nil"/>
-          <w:bottom w:val="nil"/>
-          <w:right w:val="nil"/>
-          <w:between w:val="nil"/>
-        </w:pBdr>
-        <w:jc w:val="both"/>
-        <w:rPr>
-          <w:rFonts w:ascii="Times New Roman" w:eastAsia="Times New Roman" w:hAnsi="Times New Roman" w:cs="Times New Roman"/>
-          <w:sz w:val="24"/>
-          <w:szCs w:val="24"/>
-        </w:rPr>
-      </w:pPr>
+        <w:t xml:space="preserve">A </w:t>
+      </w:r>
+      <w:proofErr w:type="gramStart"/>
+      <w:r>
+        <w:rPr>
+          <w:rFonts w:ascii="Times New Roman" w:eastAsia="Times New Roman" w:hAnsi="Times New Roman" w:cs="Times New Roman"/>
+          <w:sz w:val="24"/>
+          <w:szCs w:val="24"/>
+        </w:rPr>
+        <w:t>continuación</w:t>
+      </w:r>
+      <w:proofErr w:type="gramEnd"/>
+      <w:r>
+        <w:rPr>
+          <w:rFonts w:ascii="Times New Roman" w:eastAsia="Times New Roman" w:hAnsi="Times New Roman" w:cs="Times New Roman"/>
+          <w:sz w:val="24"/>
+          <w:szCs w:val="24"/>
+        </w:rPr>
+        <w:t xml:space="preserve"> se presenta una tabla resumen que recoge las principales características de las cinco herramientas analizadas, con el objetivo de facilitar una comparación rápida entre ellas e identificar las necesidades que cubren y las que quedan sin resolver.</w:t>
+      </w:r>
+    </w:p>
+    <w:p>
+      <w:pPr>
+        <w:pBdr>
+          <w:top w:val="nil"/>
+          <w:left w:val="nil"/>
+          <w:bottom w:val="nil"/>
+          <w:right w:val="nil"/>
+          <w:between w:val="nil"/>
+        </w:pBdr>
+        <w:jc w:val="both"/>
+        <w:rPr>
+          <w:rFonts w:ascii="Times New Roman" w:eastAsia="Times New Roman" w:hAnsi="Times New Roman" w:cs="Times New Roman"/>
+          <w:sz w:val="24"/>
+          <w:szCs w:val="24"/>
+        </w:rPr>
+      </w:pPr>
+    </w:p>
+    <w:tbl>
+      <w:tblPr>
+        <w:tblStyle w:val="Tablaconcuadrcula"/>
+        <w:tblW w:w="0" w:type="auto"/>
+        <w:tblLook w:val="04A0" w:firstRow="1" w:lastRow="0" w:firstColumn="1" w:lastColumn="0" w:noHBand="0" w:noVBand="1"/>
+      </w:tblPr>
+      <w:tblGrid>
+        <w:gridCol w:w="1463"/>
+        <w:gridCol w:w="1463"/>
+        <w:gridCol w:w="1463"/>
+        <w:gridCol w:w="1463"/>
+        <w:gridCol w:w="1463"/>
+        <w:gridCol w:w="1463"/>
+      </w:tblGrid>
+      <w:tr>
+        <w:tc>
+          <w:tcPr>
+            <w:tcW w:w="1463" w:type="dxa"/>
+          </w:tcPr>
+          <w:p>
+            <w:pPr>
+              <w:jc w:val="both"/>
+              <w:rPr>
+                <w:rFonts w:ascii="Times New Roman" w:eastAsia="Times New Roman" w:hAnsi="Times New Roman" w:cs="Times New Roman"/>
+                <w:sz w:val="24"/>
+                <w:szCs w:val="24"/>
+              </w:rPr>
+            </w:pPr>
+          </w:p>
+        </w:tc>
+        <w:tc>
+          <w:tcPr>
+            <w:tcW w:w="1463" w:type="dxa"/>
+          </w:tcPr>
+          <w:p>
+            <w:pPr>
+              <w:jc w:val="both"/>
+              <w:rPr>
+                <w:rFonts w:ascii="Times New Roman" w:eastAsia="Times New Roman" w:hAnsi="Times New Roman" w:cs="Times New Roman"/>
+                <w:sz w:val="24"/>
+                <w:szCs w:val="24"/>
+              </w:rPr>
+            </w:pPr>
+          </w:p>
+        </w:tc>
+        <w:tc>
+          <w:tcPr>
+            <w:tcW w:w="1463" w:type="dxa"/>
+          </w:tcPr>
+          <w:p>
+            <w:pPr>
+              <w:jc w:val="both"/>
+              <w:rPr>
+                <w:rFonts w:ascii="Times New Roman" w:eastAsia="Times New Roman" w:hAnsi="Times New Roman" w:cs="Times New Roman"/>
+                <w:sz w:val="24"/>
+                <w:szCs w:val="24"/>
+              </w:rPr>
+            </w:pPr>
+          </w:p>
+        </w:tc>
+        <w:tc>
+          <w:tcPr>
+            <w:tcW w:w="1463" w:type="dxa"/>
+          </w:tcPr>
+          <w:p>
+            <w:pPr>
+              <w:jc w:val="both"/>
+              <w:rPr>
+                <w:rFonts w:ascii="Times New Roman" w:eastAsia="Times New Roman" w:hAnsi="Times New Roman" w:cs="Times New Roman"/>
+                <w:sz w:val="24"/>
+                <w:szCs w:val="24"/>
+              </w:rPr>
+            </w:pPr>
+          </w:p>
+        </w:tc>
+        <w:tc>
+          <w:tcPr>
+            <w:tcW w:w="1463" w:type="dxa"/>
+          </w:tcPr>
+          <w:p>
+            <w:pPr>
+              <w:jc w:val="both"/>
+              <w:rPr>
+                <w:rFonts w:ascii="Times New Roman" w:eastAsia="Times New Roman" w:hAnsi="Times New Roman" w:cs="Times New Roman"/>
+                <w:sz w:val="24"/>
+                <w:szCs w:val="24"/>
+              </w:rPr>
+            </w:pPr>
+          </w:p>
+        </w:tc>
+        <w:tc>
+          <w:tcPr>
+            <w:tcW w:w="1463" w:type="dxa"/>
+          </w:tcPr>
+          <w:p>
+            <w:pPr>
+              <w:jc w:val="both"/>
+              <w:rPr>
+                <w:rFonts w:ascii="Times New Roman" w:eastAsia="Times New Roman" w:hAnsi="Times New Roman" w:cs="Times New Roman"/>
+                <w:sz w:val="24"/>
+                <w:szCs w:val="24"/>
+              </w:rPr>
+            </w:pPr>
+          </w:p>
+        </w:tc>
+      </w:tr>
+      <w:tr>
+        <w:tc>
+          <w:tcPr>
+            <w:tcW w:w="1463" w:type="dxa"/>
+          </w:tcPr>
+          <w:p>
+            <w:pPr>
+              <w:jc w:val="both"/>
+              <w:rPr>
+                <w:rFonts w:ascii="Times New Roman" w:eastAsia="Times New Roman" w:hAnsi="Times New Roman" w:cs="Times New Roman"/>
+                <w:sz w:val="24"/>
+                <w:szCs w:val="24"/>
+              </w:rPr>
+            </w:pPr>
+          </w:p>
+        </w:tc>
+        <w:tc>
+          <w:tcPr>
+            <w:tcW w:w="1463" w:type="dxa"/>
+          </w:tcPr>
+          <w:p>
+            <w:pPr>
+              <w:jc w:val="both"/>
+              <w:rPr>
+                <w:rFonts w:ascii="Times New Roman" w:eastAsia="Times New Roman" w:hAnsi="Times New Roman" w:cs="Times New Roman"/>
+                <w:sz w:val="24"/>
+                <w:szCs w:val="24"/>
+              </w:rPr>
+            </w:pPr>
+          </w:p>
+        </w:tc>
+        <w:tc>
+          <w:tcPr>
+            <w:tcW w:w="1463" w:type="dxa"/>
+          </w:tcPr>
+          <w:p>
+            <w:pPr>
+              <w:jc w:val="both"/>
+              <w:rPr>
+                <w:rFonts w:ascii="Times New Roman" w:eastAsia="Times New Roman" w:hAnsi="Times New Roman" w:cs="Times New Roman"/>
+                <w:sz w:val="24"/>
+                <w:szCs w:val="24"/>
+              </w:rPr>
+            </w:pPr>
+          </w:p>
+        </w:tc>
+        <w:tc>
+          <w:tcPr>
+            <w:tcW w:w="1463" w:type="dxa"/>
+          </w:tcPr>
+          <w:p>
+            <w:pPr>
+              <w:jc w:val="both"/>
+              <w:rPr>
+                <w:rFonts w:ascii="Times New Roman" w:eastAsia="Times New Roman" w:hAnsi="Times New Roman" w:cs="Times New Roman"/>
+                <w:sz w:val="24"/>
+                <w:szCs w:val="24"/>
+              </w:rPr>
+            </w:pPr>
+          </w:p>
+        </w:tc>
+        <w:tc>
+          <w:tcPr>
+            <w:tcW w:w="1463" w:type="dxa"/>
+          </w:tcPr>
+          <w:p>
+            <w:pPr>
+              <w:jc w:val="both"/>
+              <w:rPr>
+                <w:rFonts w:ascii="Times New Roman" w:eastAsia="Times New Roman" w:hAnsi="Times New Roman" w:cs="Times New Roman"/>
+                <w:sz w:val="24"/>
+                <w:szCs w:val="24"/>
+              </w:rPr>
+            </w:pPr>
+          </w:p>
+        </w:tc>
+        <w:tc>
+          <w:tcPr>
+            <w:tcW w:w="1463" w:type="dxa"/>
+          </w:tcPr>
+          <w:p>
+            <w:pPr>
+              <w:jc w:val="both"/>
+              <w:rPr>
+                <w:rFonts w:ascii="Times New Roman" w:eastAsia="Times New Roman" w:hAnsi="Times New Roman" w:cs="Times New Roman"/>
+                <w:sz w:val="24"/>
+                <w:szCs w:val="24"/>
+              </w:rPr>
+            </w:pPr>
+          </w:p>
+        </w:tc>
+      </w:tr>
+      <w:tr>
+        <w:tc>
+          <w:tcPr>
+            <w:tcW w:w="1463" w:type="dxa"/>
+          </w:tcPr>
+          <w:p>
+            <w:pPr>
+              <w:jc w:val="both"/>
+              <w:rPr>
+                <w:rFonts w:ascii="Times New Roman" w:eastAsia="Times New Roman" w:hAnsi="Times New Roman" w:cs="Times New Roman"/>
+                <w:sz w:val="24"/>
+                <w:szCs w:val="24"/>
+              </w:rPr>
+            </w:pPr>
+          </w:p>
+        </w:tc>
+        <w:tc>
+          <w:tcPr>
+            <w:tcW w:w="1463" w:type="dxa"/>
+          </w:tcPr>
+          <w:p>
+            <w:pPr>
+              <w:jc w:val="both"/>
+              <w:rPr>
+                <w:rFonts w:ascii="Times New Roman" w:eastAsia="Times New Roman" w:hAnsi="Times New Roman" w:cs="Times New Roman"/>
+                <w:sz w:val="24"/>
+                <w:szCs w:val="24"/>
+              </w:rPr>
+            </w:pPr>
+          </w:p>
+        </w:tc>
+        <w:tc>
+          <w:tcPr>
+            <w:tcW w:w="1463" w:type="dxa"/>
+          </w:tcPr>
+          <w:p>
+            <w:pPr>
+              <w:jc w:val="both"/>
+              <w:rPr>
+                <w:rFonts w:ascii="Times New Roman" w:eastAsia="Times New Roman" w:hAnsi="Times New Roman" w:cs="Times New Roman"/>
+                <w:sz w:val="24"/>
+                <w:szCs w:val="24"/>
+              </w:rPr>
+            </w:pPr>
+          </w:p>
+        </w:tc>
+        <w:tc>
+          <w:tcPr>
+            <w:tcW w:w="1463" w:type="dxa"/>
+          </w:tcPr>
+          <w:p>
+            <w:pPr>
+              <w:jc w:val="both"/>
+              <w:rPr>
+                <w:rFonts w:ascii="Times New Roman" w:eastAsia="Times New Roman" w:hAnsi="Times New Roman" w:cs="Times New Roman"/>
+                <w:sz w:val="24"/>
+                <w:szCs w:val="24"/>
+              </w:rPr>
+            </w:pPr>
+          </w:p>
+        </w:tc>
+        <w:tc>
+          <w:tcPr>
+            <w:tcW w:w="1463" w:type="dxa"/>
+          </w:tcPr>
+          <w:p>
+            <w:pPr>
+              <w:jc w:val="both"/>
+              <w:rPr>
+                <w:rFonts w:ascii="Times New Roman" w:eastAsia="Times New Roman" w:hAnsi="Times New Roman" w:cs="Times New Roman"/>
+                <w:sz w:val="24"/>
+                <w:szCs w:val="24"/>
+              </w:rPr>
+            </w:pPr>
+          </w:p>
+        </w:tc>
+        <w:tc>
+          <w:tcPr>
+            <w:tcW w:w="1463" w:type="dxa"/>
+          </w:tcPr>
+          <w:p>
+            <w:pPr>
+              <w:jc w:val="both"/>
+              <w:rPr>
+                <w:rFonts w:ascii="Times New Roman" w:eastAsia="Times New Roman" w:hAnsi="Times New Roman" w:cs="Times New Roman"/>
+                <w:sz w:val="24"/>
+                <w:szCs w:val="24"/>
+              </w:rPr>
+            </w:pPr>
+          </w:p>
+        </w:tc>
+      </w:tr>
+      <w:tr>
+        <w:tc>
+          <w:tcPr>
+            <w:tcW w:w="1463" w:type="dxa"/>
+          </w:tcPr>
+          <w:p>
+            <w:pPr>
+              <w:jc w:val="both"/>
+              <w:rPr>
+                <w:rFonts w:ascii="Times New Roman" w:eastAsia="Times New Roman" w:hAnsi="Times New Roman" w:cs="Times New Roman"/>
+                <w:sz w:val="24"/>
+                <w:szCs w:val="24"/>
+              </w:rPr>
+            </w:pPr>
+          </w:p>
+        </w:tc>
+        <w:tc>
+          <w:tcPr>
+            <w:tcW w:w="1463" w:type="dxa"/>
+          </w:tcPr>
+          <w:p>
+            <w:pPr>
+              <w:jc w:val="both"/>
+              <w:rPr>
+                <w:rFonts w:ascii="Times New Roman" w:eastAsia="Times New Roman" w:hAnsi="Times New Roman" w:cs="Times New Roman"/>
+                <w:sz w:val="24"/>
+                <w:szCs w:val="24"/>
+              </w:rPr>
+            </w:pPr>
+          </w:p>
+        </w:tc>
+        <w:tc>
+          <w:tcPr>
+            <w:tcW w:w="1463" w:type="dxa"/>
+          </w:tcPr>
+          <w:p>
+            <w:pPr>
+              <w:jc w:val="both"/>
+              <w:rPr>
+                <w:rFonts w:ascii="Times New Roman" w:eastAsia="Times New Roman" w:hAnsi="Times New Roman" w:cs="Times New Roman"/>
+                <w:sz w:val="24"/>
+                <w:szCs w:val="24"/>
+              </w:rPr>
+            </w:pPr>
+          </w:p>
+        </w:tc>
+        <w:tc>
+          <w:tcPr>
+            <w:tcW w:w="1463" w:type="dxa"/>
+          </w:tcPr>
+          <w:p>
+            <w:pPr>
+              <w:jc w:val="both"/>
+              <w:rPr>
+                <w:rFonts w:ascii="Times New Roman" w:eastAsia="Times New Roman" w:hAnsi="Times New Roman" w:cs="Times New Roman"/>
+                <w:sz w:val="24"/>
+                <w:szCs w:val="24"/>
+              </w:rPr>
+            </w:pPr>
+          </w:p>
+        </w:tc>
+        <w:tc>
+          <w:tcPr>
+            <w:tcW w:w="1463" w:type="dxa"/>
+          </w:tcPr>
+          <w:p>
+            <w:pPr>
+              <w:jc w:val="both"/>
+              <w:rPr>
+                <w:rFonts w:ascii="Times New Roman" w:eastAsia="Times New Roman" w:hAnsi="Times New Roman" w:cs="Times New Roman"/>
+                <w:sz w:val="24"/>
+                <w:szCs w:val="24"/>
+              </w:rPr>
+            </w:pPr>
+          </w:p>
+        </w:tc>
+        <w:tc>
+          <w:tcPr>
+            <w:tcW w:w="1463" w:type="dxa"/>
+          </w:tcPr>
+          <w:p>
+            <w:pPr>
+              <w:jc w:val="both"/>
+              <w:rPr>
+                <w:rFonts w:ascii="Times New Roman" w:eastAsia="Times New Roman" w:hAnsi="Times New Roman" w:cs="Times New Roman"/>
+                <w:sz w:val="24"/>
+                <w:szCs w:val="24"/>
+              </w:rPr>
+            </w:pPr>
+          </w:p>
+        </w:tc>
+      </w:tr>
+      <w:tr>
+        <w:tc>
+          <w:tcPr>
+            <w:tcW w:w="1463" w:type="dxa"/>
+          </w:tcPr>
+          <w:p>
+            <w:pPr>
+              <w:jc w:val="both"/>
+              <w:rPr>
+                <w:rFonts w:ascii="Times New Roman" w:eastAsia="Times New Roman" w:hAnsi="Times New Roman" w:cs="Times New Roman"/>
+                <w:sz w:val="24"/>
+                <w:szCs w:val="24"/>
+              </w:rPr>
+            </w:pPr>
+          </w:p>
+        </w:tc>
+        <w:tc>
+          <w:tcPr>
+            <w:tcW w:w="1463" w:type="dxa"/>
+          </w:tcPr>
+          <w:p>
+            <w:pPr>
+              <w:jc w:val="both"/>
+              <w:rPr>
+                <w:rFonts w:ascii="Times New Roman" w:eastAsia="Times New Roman" w:hAnsi="Times New Roman" w:cs="Times New Roman"/>
+                <w:sz w:val="24"/>
+                <w:szCs w:val="24"/>
+              </w:rPr>
+            </w:pPr>
+          </w:p>
+        </w:tc>
+        <w:tc>
+          <w:tcPr>
+            <w:tcW w:w="1463" w:type="dxa"/>
+          </w:tcPr>
+          <w:p>
+            <w:pPr>
+              <w:jc w:val="both"/>
+              <w:rPr>
+                <w:rFonts w:ascii="Times New Roman" w:eastAsia="Times New Roman" w:hAnsi="Times New Roman" w:cs="Times New Roman"/>
+                <w:sz w:val="24"/>
+                <w:szCs w:val="24"/>
+              </w:rPr>
+            </w:pPr>
+          </w:p>
+        </w:tc>
+        <w:tc>
+          <w:tcPr>
+            <w:tcW w:w="1463" w:type="dxa"/>
+          </w:tcPr>
+          <w:p>
+            <w:pPr>
+              <w:jc w:val="both"/>
+              <w:rPr>
+                <w:rFonts w:ascii="Times New Roman" w:eastAsia="Times New Roman" w:hAnsi="Times New Roman" w:cs="Times New Roman"/>
+                <w:sz w:val="24"/>
+                <w:szCs w:val="24"/>
+              </w:rPr>
+            </w:pPr>
+          </w:p>
+        </w:tc>
+        <w:tc>
+          <w:tcPr>
+            <w:tcW w:w="1463" w:type="dxa"/>
+          </w:tcPr>
+          <w:p>
+            <w:pPr>
+              <w:jc w:val="both"/>
+              <w:rPr>
+                <w:rFonts w:ascii="Times New Roman" w:eastAsia="Times New Roman" w:hAnsi="Times New Roman" w:cs="Times New Roman"/>
+                <w:sz w:val="24"/>
+                <w:szCs w:val="24"/>
+              </w:rPr>
+            </w:pPr>
+          </w:p>
+        </w:tc>
+        <w:tc>
+          <w:tcPr>
+            <w:tcW w:w="1463" w:type="dxa"/>
+          </w:tcPr>
+          <w:p>
+            <w:pPr>
+              <w:jc w:val="both"/>
+              <w:rPr>
+                <w:rFonts w:ascii="Times New Roman" w:eastAsia="Times New Roman" w:hAnsi="Times New Roman" w:cs="Times New Roman"/>
+                <w:sz w:val="24"/>
+                <w:szCs w:val="24"/>
+              </w:rPr>
+            </w:pPr>
+          </w:p>
+        </w:tc>
+      </w:tr>
+      <w:tr>
+        <w:tc>
+          <w:tcPr>
+            <w:tcW w:w="1463" w:type="dxa"/>
+          </w:tcPr>
+          <w:p>
+            <w:pPr>
+              <w:jc w:val="both"/>
+              <w:rPr>
+                <w:rFonts w:ascii="Times New Roman" w:eastAsia="Times New Roman" w:hAnsi="Times New Roman" w:cs="Times New Roman"/>
+                <w:sz w:val="24"/>
+                <w:szCs w:val="24"/>
+              </w:rPr>
+            </w:pPr>
+          </w:p>
+        </w:tc>
+        <w:tc>
+          <w:tcPr>
+            <w:tcW w:w="1463" w:type="dxa"/>
+          </w:tcPr>
+          <w:p>
+            <w:pPr>
+              <w:jc w:val="both"/>
+              <w:rPr>
+                <w:rFonts w:ascii="Times New Roman" w:eastAsia="Times New Roman" w:hAnsi="Times New Roman" w:cs="Times New Roman"/>
+                <w:sz w:val="24"/>
+                <w:szCs w:val="24"/>
+              </w:rPr>
+            </w:pPr>
+          </w:p>
+        </w:tc>
+        <w:tc>
+          <w:tcPr>
+            <w:tcW w:w="1463" w:type="dxa"/>
+          </w:tcPr>
+          <w:p>
+            <w:pPr>
+              <w:jc w:val="both"/>
+              <w:rPr>
+                <w:rFonts w:ascii="Times New Roman" w:eastAsia="Times New Roman" w:hAnsi="Times New Roman" w:cs="Times New Roman"/>
+                <w:sz w:val="24"/>
+                <w:szCs w:val="24"/>
+              </w:rPr>
+            </w:pPr>
+          </w:p>
+        </w:tc>
+        <w:tc>
+          <w:tcPr>
+            <w:tcW w:w="1463" w:type="dxa"/>
+          </w:tcPr>
+          <w:p>
+            <w:pPr>
+              <w:jc w:val="both"/>
+              <w:rPr>
+                <w:rFonts w:ascii="Times New Roman" w:eastAsia="Times New Roman" w:hAnsi="Times New Roman" w:cs="Times New Roman"/>
+                <w:sz w:val="24"/>
+                <w:szCs w:val="24"/>
+              </w:rPr>
+            </w:pPr>
+          </w:p>
+        </w:tc>
+        <w:tc>
+          <w:tcPr>
+            <w:tcW w:w="1463" w:type="dxa"/>
+          </w:tcPr>
+          <w:p>
+            <w:pPr>
+              <w:jc w:val="both"/>
+              <w:rPr>
+                <w:rFonts w:ascii="Times New Roman" w:eastAsia="Times New Roman" w:hAnsi="Times New Roman" w:cs="Times New Roman"/>
+                <w:sz w:val="24"/>
+                <w:szCs w:val="24"/>
+              </w:rPr>
+            </w:pPr>
+          </w:p>
+        </w:tc>
+        <w:tc>
+          <w:tcPr>
+            <w:tcW w:w="1463" w:type="dxa"/>
+          </w:tcPr>
+          <w:p>
+            <w:pPr>
+              <w:jc w:val="both"/>
+              <w:rPr>
+                <w:rFonts w:ascii="Times New Roman" w:eastAsia="Times New Roman" w:hAnsi="Times New Roman" w:cs="Times New Roman"/>
+                <w:sz w:val="24"/>
+                <w:szCs w:val="24"/>
+              </w:rPr>
+            </w:pPr>
+          </w:p>
+        </w:tc>
+      </w:tr>
+      <w:tr>
+        <w:tc>
+          <w:tcPr>
+            <w:tcW w:w="1463" w:type="dxa"/>
+          </w:tcPr>
+          <w:p>
+            <w:pPr>
+              <w:jc w:val="both"/>
+              <w:rPr>
+                <w:rFonts w:ascii="Times New Roman" w:eastAsia="Times New Roman" w:hAnsi="Times New Roman" w:cs="Times New Roman"/>
+                <w:sz w:val="24"/>
+                <w:szCs w:val="24"/>
+              </w:rPr>
+            </w:pPr>
+          </w:p>
+        </w:tc>
+        <w:tc>
+          <w:tcPr>
+            <w:tcW w:w="1463" w:type="dxa"/>
+          </w:tcPr>
+          <w:p>
+            <w:pPr>
+              <w:jc w:val="both"/>
+              <w:rPr>
+                <w:rFonts w:ascii="Times New Roman" w:eastAsia="Times New Roman" w:hAnsi="Times New Roman" w:cs="Times New Roman"/>
+                <w:sz w:val="24"/>
+                <w:szCs w:val="24"/>
+              </w:rPr>
+            </w:pPr>
+          </w:p>
+        </w:tc>
+        <w:tc>
+          <w:tcPr>
+            <w:tcW w:w="1463" w:type="dxa"/>
+          </w:tcPr>
+          <w:p>
+            <w:pPr>
+              <w:jc w:val="both"/>
+              <w:rPr>
+                <w:rFonts w:ascii="Times New Roman" w:eastAsia="Times New Roman" w:hAnsi="Times New Roman" w:cs="Times New Roman"/>
+                <w:sz w:val="24"/>
+                <w:szCs w:val="24"/>
+              </w:rPr>
+            </w:pPr>
+          </w:p>
+        </w:tc>
+        <w:tc>
+          <w:tcPr>
+            <w:tcW w:w="1463" w:type="dxa"/>
+          </w:tcPr>
+          <w:p>
+            <w:pPr>
+              <w:jc w:val="both"/>
+              <w:rPr>
+                <w:rFonts w:ascii="Times New Roman" w:eastAsia="Times New Roman" w:hAnsi="Times New Roman" w:cs="Times New Roman"/>
+                <w:sz w:val="24"/>
+                <w:szCs w:val="24"/>
+              </w:rPr>
+            </w:pPr>
+          </w:p>
+        </w:tc>
+        <w:tc>
+          <w:tcPr>
+            <w:tcW w:w="1463" w:type="dxa"/>
+          </w:tcPr>
+          <w:p>
+            <w:pPr>
+              <w:jc w:val="both"/>
+              <w:rPr>
+                <w:rFonts w:ascii="Times New Roman" w:eastAsia="Times New Roman" w:hAnsi="Times New Roman" w:cs="Times New Roman"/>
+                <w:sz w:val="24"/>
+                <w:szCs w:val="24"/>
+              </w:rPr>
+            </w:pPr>
+          </w:p>
+        </w:tc>
+        <w:tc>
+          <w:tcPr>
+            <w:tcW w:w="1463" w:type="dxa"/>
+          </w:tcPr>
+          <w:p>
+            <w:pPr>
+              <w:jc w:val="both"/>
+              <w:rPr>
+                <w:rFonts w:ascii="Times New Roman" w:eastAsia="Times New Roman" w:hAnsi="Times New Roman" w:cs="Times New Roman"/>
+                <w:sz w:val="24"/>
+                <w:szCs w:val="24"/>
+              </w:rPr>
+            </w:pPr>
+          </w:p>
+        </w:tc>
+      </w:tr>
+      <w:tr>
+        <w:tc>
+          <w:tcPr>
+            <w:tcW w:w="1463" w:type="dxa"/>
+          </w:tcPr>
+          <w:p>
+            <w:pPr>
+              <w:jc w:val="both"/>
+              <w:rPr>
+                <w:rFonts w:ascii="Times New Roman" w:eastAsia="Times New Roman" w:hAnsi="Times New Roman" w:cs="Times New Roman"/>
+                <w:sz w:val="24"/>
+                <w:szCs w:val="24"/>
+              </w:rPr>
+            </w:pPr>
+          </w:p>
+        </w:tc>
+        <w:tc>
+          <w:tcPr>
+            <w:tcW w:w="1463" w:type="dxa"/>
+          </w:tcPr>
+          <w:p>
+            <w:pPr>
+              <w:jc w:val="both"/>
+              <w:rPr>
+                <w:rFonts w:ascii="Times New Roman" w:eastAsia="Times New Roman" w:hAnsi="Times New Roman" w:cs="Times New Roman"/>
+                <w:sz w:val="24"/>
+                <w:szCs w:val="24"/>
+              </w:rPr>
+            </w:pPr>
+          </w:p>
+        </w:tc>
+        <w:tc>
+          <w:tcPr>
+            <w:tcW w:w="1463" w:type="dxa"/>
+          </w:tcPr>
+          <w:p>
+            <w:pPr>
+              <w:jc w:val="both"/>
+              <w:rPr>
+                <w:rFonts w:ascii="Times New Roman" w:eastAsia="Times New Roman" w:hAnsi="Times New Roman" w:cs="Times New Roman"/>
+                <w:sz w:val="24"/>
+                <w:szCs w:val="24"/>
+              </w:rPr>
+            </w:pPr>
+          </w:p>
+        </w:tc>
+        <w:tc>
+          <w:tcPr>
+            <w:tcW w:w="1463" w:type="dxa"/>
+          </w:tcPr>
+          <w:p>
+            <w:pPr>
+              <w:jc w:val="both"/>
+              <w:rPr>
+                <w:rFonts w:ascii="Times New Roman" w:eastAsia="Times New Roman" w:hAnsi="Times New Roman" w:cs="Times New Roman"/>
+                <w:sz w:val="24"/>
+                <w:szCs w:val="24"/>
+              </w:rPr>
+            </w:pPr>
+          </w:p>
+        </w:tc>
+        <w:tc>
+          <w:tcPr>
+            <w:tcW w:w="1463" w:type="dxa"/>
+          </w:tcPr>
+          <w:p>
+            <w:pPr>
+              <w:jc w:val="both"/>
+              <w:rPr>
+                <w:rFonts w:ascii="Times New Roman" w:eastAsia="Times New Roman" w:hAnsi="Times New Roman" w:cs="Times New Roman"/>
+                <w:sz w:val="24"/>
+                <w:szCs w:val="24"/>
+              </w:rPr>
+            </w:pPr>
+          </w:p>
+        </w:tc>
+        <w:tc>
+          <w:tcPr>
+            <w:tcW w:w="1463" w:type="dxa"/>
+          </w:tcPr>
+          <w:p>
+            <w:pPr>
+              <w:jc w:val="both"/>
+              <w:rPr>
+                <w:rFonts w:ascii="Times New Roman" w:eastAsia="Times New Roman" w:hAnsi="Times New Roman" w:cs="Times New Roman"/>
+                <w:sz w:val="24"/>
+                <w:szCs w:val="24"/>
+              </w:rPr>
+            </w:pPr>
+          </w:p>
+        </w:tc>
+      </w:tr>
+      <w:tr>
+        <w:tc>
+          <w:tcPr>
+            <w:tcW w:w="1463" w:type="dxa"/>
+          </w:tcPr>
+          <w:p>
+            <w:pPr>
+              <w:jc w:val="both"/>
+              <w:rPr>
+                <w:rFonts w:ascii="Times New Roman" w:eastAsia="Times New Roman" w:hAnsi="Times New Roman" w:cs="Times New Roman"/>
+                <w:sz w:val="24"/>
+                <w:szCs w:val="24"/>
+              </w:rPr>
+            </w:pPr>
+          </w:p>
+        </w:tc>
+        <w:tc>
+          <w:tcPr>
+            <w:tcW w:w="1463" w:type="dxa"/>
+          </w:tcPr>
+          <w:p>
+            <w:pPr>
+              <w:jc w:val="both"/>
+              <w:rPr>
+                <w:rFonts w:ascii="Times New Roman" w:eastAsia="Times New Roman" w:hAnsi="Times New Roman" w:cs="Times New Roman"/>
+                <w:sz w:val="24"/>
+                <w:szCs w:val="24"/>
+              </w:rPr>
+            </w:pPr>
+          </w:p>
+        </w:tc>
+        <w:tc>
+          <w:tcPr>
+            <w:tcW w:w="1463" w:type="dxa"/>
+          </w:tcPr>
+          <w:p>
+            <w:pPr>
+              <w:jc w:val="both"/>
+              <w:rPr>
+                <w:rFonts w:ascii="Times New Roman" w:eastAsia="Times New Roman" w:hAnsi="Times New Roman" w:cs="Times New Roman"/>
+                <w:sz w:val="24"/>
+                <w:szCs w:val="24"/>
+              </w:rPr>
+            </w:pPr>
+          </w:p>
+        </w:tc>
+        <w:tc>
+          <w:tcPr>
+            <w:tcW w:w="1463" w:type="dxa"/>
+          </w:tcPr>
+          <w:p>
+            <w:pPr>
+              <w:jc w:val="both"/>
+              <w:rPr>
+                <w:rFonts w:ascii="Times New Roman" w:eastAsia="Times New Roman" w:hAnsi="Times New Roman" w:cs="Times New Roman"/>
+                <w:sz w:val="24"/>
+                <w:szCs w:val="24"/>
+              </w:rPr>
+            </w:pPr>
+          </w:p>
+        </w:tc>
+        <w:tc>
+          <w:tcPr>
+            <w:tcW w:w="1463" w:type="dxa"/>
+          </w:tcPr>
+          <w:p>
+            <w:pPr>
+              <w:jc w:val="both"/>
+              <w:rPr>
+                <w:rFonts w:ascii="Times New Roman" w:eastAsia="Times New Roman" w:hAnsi="Times New Roman" w:cs="Times New Roman"/>
+                <w:sz w:val="24"/>
+                <w:szCs w:val="24"/>
+              </w:rPr>
+            </w:pPr>
+          </w:p>
+        </w:tc>
+        <w:tc>
+          <w:tcPr>
+            <w:tcW w:w="1463" w:type="dxa"/>
+          </w:tcPr>
+          <w:p>
+            <w:pPr>
+              <w:jc w:val="both"/>
+              <w:rPr>
+                <w:rFonts w:ascii="Times New Roman" w:eastAsia="Times New Roman" w:hAnsi="Times New Roman" w:cs="Times New Roman"/>
+                <w:sz w:val="24"/>
+                <w:szCs w:val="24"/>
+              </w:rPr>
+            </w:pPr>
+          </w:p>
+        </w:tc>
+      </w:tr>
+      <w:tr>
+        <w:tc>
+          <w:tcPr>
+            <w:tcW w:w="1463" w:type="dxa"/>
+          </w:tcPr>
+          <w:p>
+            <w:pPr>
+              <w:jc w:val="both"/>
+              <w:rPr>
+                <w:rFonts w:ascii="Times New Roman" w:eastAsia="Times New Roman" w:hAnsi="Times New Roman" w:cs="Times New Roman"/>
+                <w:sz w:val="24"/>
+                <w:szCs w:val="24"/>
+              </w:rPr>
+            </w:pPr>
+          </w:p>
+        </w:tc>
+        <w:tc>
+          <w:tcPr>
+            <w:tcW w:w="1463" w:type="dxa"/>
+          </w:tcPr>
+          <w:p>
+            <w:pPr>
+              <w:jc w:val="both"/>
+              <w:rPr>
+                <w:rFonts w:ascii="Times New Roman" w:eastAsia="Times New Roman" w:hAnsi="Times New Roman" w:cs="Times New Roman"/>
+                <w:sz w:val="24"/>
+                <w:szCs w:val="24"/>
+              </w:rPr>
+            </w:pPr>
+          </w:p>
+        </w:tc>
+        <w:tc>
+          <w:tcPr>
+            <w:tcW w:w="1463" w:type="dxa"/>
+          </w:tcPr>
+          <w:p>
+            <w:pPr>
+              <w:jc w:val="both"/>
+              <w:rPr>
+                <w:rFonts w:ascii="Times New Roman" w:eastAsia="Times New Roman" w:hAnsi="Times New Roman" w:cs="Times New Roman"/>
+                <w:sz w:val="24"/>
+                <w:szCs w:val="24"/>
+              </w:rPr>
+            </w:pPr>
+          </w:p>
+        </w:tc>
+        <w:tc>
+          <w:tcPr>
+            <w:tcW w:w="1463" w:type="dxa"/>
+          </w:tcPr>
+          <w:p>
+            <w:pPr>
+              <w:jc w:val="both"/>
+              <w:rPr>
+                <w:rFonts w:ascii="Times New Roman" w:eastAsia="Times New Roman" w:hAnsi="Times New Roman" w:cs="Times New Roman"/>
+                <w:sz w:val="24"/>
+                <w:szCs w:val="24"/>
+              </w:rPr>
+            </w:pPr>
+          </w:p>
+        </w:tc>
+        <w:tc>
+          <w:tcPr>
+            <w:tcW w:w="1463" w:type="dxa"/>
+          </w:tcPr>
+          <w:p>
+            <w:pPr>
+              <w:jc w:val="both"/>
+              <w:rPr>
+                <w:rFonts w:ascii="Times New Roman" w:eastAsia="Times New Roman" w:hAnsi="Times New Roman" w:cs="Times New Roman"/>
+                <w:sz w:val="24"/>
+                <w:szCs w:val="24"/>
+              </w:rPr>
+            </w:pPr>
+          </w:p>
+        </w:tc>
+        <w:tc>
+          <w:tcPr>
+            <w:tcW w:w="1463" w:type="dxa"/>
+          </w:tcPr>
+          <w:p>
+            <w:pPr>
+              <w:jc w:val="both"/>
+              <w:rPr>
+                <w:rFonts w:ascii="Times New Roman" w:eastAsia="Times New Roman" w:hAnsi="Times New Roman" w:cs="Times New Roman"/>
+                <w:sz w:val="24"/>
+                <w:szCs w:val="24"/>
+              </w:rPr>
+            </w:pPr>
+          </w:p>
+        </w:tc>
+      </w:tr>
+      <w:tr>
+        <w:tc>
+          <w:tcPr>
+            <w:tcW w:w="1463" w:type="dxa"/>
+          </w:tcPr>
+          <w:p>
+            <w:pPr>
+              <w:jc w:val="both"/>
+              <w:rPr>
+                <w:rFonts w:ascii="Times New Roman" w:eastAsia="Times New Roman" w:hAnsi="Times New Roman" w:cs="Times New Roman"/>
+                <w:sz w:val="24"/>
+                <w:szCs w:val="24"/>
+              </w:rPr>
+            </w:pPr>
+          </w:p>
+        </w:tc>
+        <w:tc>
+          <w:tcPr>
+            <w:tcW w:w="1463" w:type="dxa"/>
+          </w:tcPr>
+          <w:p>
+            <w:pPr>
+              <w:jc w:val="both"/>
+              <w:rPr>
+                <w:rFonts w:ascii="Times New Roman" w:eastAsia="Times New Roman" w:hAnsi="Times New Roman" w:cs="Times New Roman"/>
+                <w:sz w:val="24"/>
+                <w:szCs w:val="24"/>
+              </w:rPr>
+            </w:pPr>
+          </w:p>
+        </w:tc>
+        <w:tc>
+          <w:tcPr>
+            <w:tcW w:w="1463" w:type="dxa"/>
+          </w:tcPr>
+          <w:p>
+            <w:pPr>
+              <w:jc w:val="both"/>
+              <w:rPr>
+                <w:rFonts w:ascii="Times New Roman" w:eastAsia="Times New Roman" w:hAnsi="Times New Roman" w:cs="Times New Roman"/>
+                <w:sz w:val="24"/>
+                <w:szCs w:val="24"/>
+              </w:rPr>
+            </w:pPr>
+          </w:p>
+        </w:tc>
+        <w:tc>
+          <w:tcPr>
+            <w:tcW w:w="1463" w:type="dxa"/>
+          </w:tcPr>
+          <w:p>
+            <w:pPr>
+              <w:jc w:val="both"/>
+              <w:rPr>
+                <w:rFonts w:ascii="Times New Roman" w:eastAsia="Times New Roman" w:hAnsi="Times New Roman" w:cs="Times New Roman"/>
+                <w:sz w:val="24"/>
+                <w:szCs w:val="24"/>
+              </w:rPr>
+            </w:pPr>
+          </w:p>
+        </w:tc>
+        <w:tc>
+          <w:tcPr>
+            <w:tcW w:w="1463" w:type="dxa"/>
+          </w:tcPr>
+          <w:p>
+            <w:pPr>
+              <w:jc w:val="both"/>
+              <w:rPr>
+                <w:rFonts w:ascii="Times New Roman" w:eastAsia="Times New Roman" w:hAnsi="Times New Roman" w:cs="Times New Roman"/>
+                <w:sz w:val="24"/>
+                <w:szCs w:val="24"/>
+              </w:rPr>
+            </w:pPr>
+          </w:p>
+        </w:tc>
+        <w:tc>
+          <w:tcPr>
+            <w:tcW w:w="1463" w:type="dxa"/>
+          </w:tcPr>
+          <w:p>
+            <w:pPr>
+              <w:jc w:val="both"/>
+              <w:rPr>
+                <w:rFonts w:ascii="Times New Roman" w:eastAsia="Times New Roman" w:hAnsi="Times New Roman" w:cs="Times New Roman"/>
+                <w:sz w:val="24"/>
+                <w:szCs w:val="24"/>
+              </w:rPr>
+            </w:pPr>
+          </w:p>
+        </w:tc>
+      </w:tr>
+      <w:tr>
+        <w:tc>
+          <w:tcPr>
+            <w:tcW w:w="1463" w:type="dxa"/>
+          </w:tcPr>
+          <w:p>
+            <w:pPr>
+              <w:jc w:val="both"/>
+              <w:rPr>
+                <w:rFonts w:ascii="Times New Roman" w:eastAsia="Times New Roman" w:hAnsi="Times New Roman" w:cs="Times New Roman"/>
+                <w:sz w:val="24"/>
+                <w:szCs w:val="24"/>
+              </w:rPr>
+            </w:pPr>
+          </w:p>
+        </w:tc>
+        <w:tc>
+          <w:tcPr>
+            <w:tcW w:w="1463" w:type="dxa"/>
+          </w:tcPr>
+          <w:p>
+            <w:pPr>
+              <w:jc w:val="both"/>
+              <w:rPr>
+                <w:rFonts w:ascii="Times New Roman" w:eastAsia="Times New Roman" w:hAnsi="Times New Roman" w:cs="Times New Roman"/>
+                <w:sz w:val="24"/>
+                <w:szCs w:val="24"/>
+              </w:rPr>
+            </w:pPr>
+          </w:p>
+        </w:tc>
+        <w:tc>
+          <w:tcPr>
+            <w:tcW w:w="1463" w:type="dxa"/>
+          </w:tcPr>
+          <w:p>
+            <w:pPr>
+              <w:jc w:val="both"/>
+              <w:rPr>
+                <w:rFonts w:ascii="Times New Roman" w:eastAsia="Times New Roman" w:hAnsi="Times New Roman" w:cs="Times New Roman"/>
+                <w:sz w:val="24"/>
+                <w:szCs w:val="24"/>
+              </w:rPr>
+            </w:pPr>
+          </w:p>
+        </w:tc>
+        <w:tc>
+          <w:tcPr>
+            <w:tcW w:w="1463" w:type="dxa"/>
+          </w:tcPr>
+          <w:p>
+            <w:pPr>
+              <w:jc w:val="both"/>
+              <w:rPr>
+                <w:rFonts w:ascii="Times New Roman" w:eastAsia="Times New Roman" w:hAnsi="Times New Roman" w:cs="Times New Roman"/>
+                <w:sz w:val="24"/>
+                <w:szCs w:val="24"/>
+              </w:rPr>
+            </w:pPr>
+          </w:p>
+        </w:tc>
+        <w:tc>
+          <w:tcPr>
+            <w:tcW w:w="1463" w:type="dxa"/>
+          </w:tcPr>
+          <w:p>
+            <w:pPr>
+              <w:jc w:val="both"/>
+              <w:rPr>
+                <w:rFonts w:ascii="Times New Roman" w:eastAsia="Times New Roman" w:hAnsi="Times New Roman" w:cs="Times New Roman"/>
+                <w:sz w:val="24"/>
+                <w:szCs w:val="24"/>
+              </w:rPr>
+            </w:pPr>
+          </w:p>
+        </w:tc>
+        <w:tc>
+          <w:tcPr>
+            <w:tcW w:w="1463" w:type="dxa"/>
+          </w:tcPr>
+          <w:p>
+            <w:pPr>
+              <w:jc w:val="both"/>
+              <w:rPr>
+                <w:rFonts w:ascii="Times New Roman" w:eastAsia="Times New Roman" w:hAnsi="Times New Roman" w:cs="Times New Roman"/>
+                <w:sz w:val="24"/>
+                <w:szCs w:val="24"/>
+              </w:rPr>
+            </w:pPr>
+          </w:p>
+        </w:tc>
+      </w:tr>
+    </w:tbl>
+    <w:p>
+      <w:pPr>
+        <w:pBdr>
+          <w:top w:val="nil"/>
+          <w:left w:val="nil"/>
+          <w:bottom w:val="nil"/>
+          <w:right w:val="nil"/>
+          <w:between w:val="nil"/>
+        </w:pBdr>
+        <w:jc w:val="both"/>
+        <w:rPr>
+          <w:rFonts w:ascii="Times New Roman" w:eastAsia="Times New Roman" w:hAnsi="Times New Roman" w:cs="Times New Roman"/>
+          <w:sz w:val="24"/>
+          <w:szCs w:val="24"/>
+        </w:rPr>
+      </w:pPr>
+    </w:p>
+    <w:p>
+      <w:pPr>
+        <w:pBdr>
+          <w:top w:val="nil"/>
+          <w:left w:val="nil"/>
+          <w:bottom w:val="nil"/>
+          <w:right w:val="nil"/>
+          <w:between w:val="nil"/>
+        </w:pBdr>
+        <w:jc w:val="both"/>
+        <w:rPr>
+          <w:rFonts w:ascii="Times New Roman" w:eastAsia="Times New Roman" w:hAnsi="Times New Roman" w:cs="Times New Roman"/>
+          <w:sz w:val="24"/>
+          <w:szCs w:val="24"/>
+        </w:rPr>
+      </w:pPr>
+      <w:r>
+        <w:rPr>
+          <w:rFonts w:ascii="Times New Roman" w:eastAsia="Times New Roman" w:hAnsi="Times New Roman" w:cs="Times New Roman"/>
+          <w:sz w:val="24"/>
+          <w:szCs w:val="24"/>
+        </w:rPr>
+        <w:t xml:space="preserve">De la comparativa se extrae que ninguna de las herramientas analizadas ofrece una solución completa a la problemática identificada. PetDesk y VitusVet presentan un enfoque principalmente clínico y dependiente de la integración con clínicas veterinarias, lo que limita </w:t>
+      </w:r>
+      <w:r>
+        <w:rPr>
+          <w:rFonts w:ascii="Times New Roman" w:eastAsia="Times New Roman" w:hAnsi="Times New Roman" w:cs="Times New Roman"/>
+          <w:sz w:val="24"/>
+          <w:szCs w:val="24"/>
+        </w:rPr>
+        <w:lastRenderedPageBreak/>
+        <w:t>su utilidad en el contexto doméstico español. Dogo se centra exclusivamente en el adiestramiento canino y no cubre la gestión del cuidado diario de forma integral. 11Pets ofrece una solución más completa en cuanto a módulos de cuidado, pero su sistema multiusuario se basa en el uso compartido de una única cuenta, sin diferenciación de roles ni confirmación de acciones entre cuidadores. PetnotePlus es la herramienta más próxima al enfoque del presente proyecto, ya que incorpora módulos de medicación, comidas y paseos con acceso multiusuario y notificaciones entre cuidadores. Sin embargo, ninguna de las aplicaciones analizadas implementa un mecanismo de control de concurrencia que impida la confirmación simultánea de una misma acción por parte de varios cuidadores, ni está disponible como aplicación web progresiva sin necesidad de instalación. Estas carencias justifican el desarrollo de la herramienta propuesta en el presente trabajo.</w:t>
+      </w:r>
     </w:p>
     <w:p>
       <w:pPr>
@@ -5754,7 +7014,25 @@
           <w:sz w:val="24"/>
           <w:szCs w:val="24"/>
         </w:rPr>
-        <w:t>También se puede incluir al final del capítulo 2 un apartado de valoración, en el que el alumno juzgue los pros y contras de la información expuesta en los apartados anteriores con la intención de dejar constancia de la necesidad de abordar este trabajo, es decir, de hacer algo nuevo que cubra un hueco o carencia que el resto de herramientas estudiadas no cubría satisfactoriamente.</w:t>
+        <w:t xml:space="preserve">También se puede incluir al final del capítulo 2 un apartado de valoración, en el que el alumno juzgue los pros y contras de la información expuesta en los apartados anteriores con la intención de dejar constancia de la necesidad de abordar este trabajo, es decir, de hacer algo nuevo que cubra un hueco o carencia que el resto de </w:t>
+      </w:r>
+      <w:proofErr w:type="gramStart"/>
+      <w:r>
+        <w:rPr>
+          <w:rFonts w:ascii="Times New Roman" w:eastAsia="Times New Roman" w:hAnsi="Times New Roman" w:cs="Times New Roman"/>
+          <w:sz w:val="24"/>
+          <w:szCs w:val="24"/>
+        </w:rPr>
+        <w:t>herramientas</w:t>
+      </w:r>
+      <w:proofErr w:type="gramEnd"/>
+      <w:r>
+        <w:rPr>
+          <w:rFonts w:ascii="Times New Roman" w:eastAsia="Times New Roman" w:hAnsi="Times New Roman" w:cs="Times New Roman"/>
+          <w:sz w:val="24"/>
+          <w:szCs w:val="24"/>
+        </w:rPr>
+        <w:t xml:space="preserve"> estudiadas no cubría satisfactoriamente.</w:t>
       </w:r>
     </w:p>
     <w:p>
@@ -6527,6 +7805,25 @@
       <w:szCs w:val="18"/>
     </w:rPr>
   </w:style>
+  <w:style w:type="table" w:styleId="Tablaconcuadrcula">
+    <w:name w:val="Table Grid"/>
+    <w:basedOn w:val="Tablanormal"/>
+    <w:uiPriority w:val="39"/>
+    <w:rsid w:val="00200FD1"/>
+    <w:pPr>
+      <w:spacing w:line="240" w:lineRule="auto"/>
+    </w:pPr>
+    <w:tblPr>
+      <w:tblBorders>
+        <w:top w:val="single" w:sz="4" w:space="0" w:color="auto"/>
+        <w:left w:val="single" w:sz="4" w:space="0" w:color="auto"/>
+        <w:bottom w:val="single" w:sz="4" w:space="0" w:color="auto"/>
+        <w:right w:val="single" w:sz="4" w:space="0" w:color="auto"/>
+        <w:insideH w:val="single" w:sz="4" w:space="0" w:color="auto"/>
+        <w:insideV w:val="single" w:sz="4" w:space="0" w:color="auto"/>
+      </w:tblBorders>
+    </w:tblPr>
+  </w:style>
 </w:styles>
 </file>
 

</xml_diff>

<commit_message>
docs: chapter 2 updated to final version
</commit_message>
<xml_diff>
--- a/docs/Capítulo 2 - Antecedentes.docx
+++ b/docs/Capítulo 2 - Antecedentes.docx
@@ -3295,25 +3295,7 @@
           <w:sz w:val="24"/>
           <w:szCs w:val="24"/>
         </w:rPr>
-        <w:t xml:space="preserve">Calendario de </w:t>
-      </w:r>
-      <w:proofErr w:type="spellStart"/>
-      <w:r>
-        <w:rPr>
-          <w:rFonts w:ascii="Times New Roman" w:eastAsia="Times New Roman" w:hAnsi="Times New Roman" w:cs="Times New Roman"/>
-          <w:sz w:val="24"/>
-          <w:szCs w:val="24"/>
-        </w:rPr>
-        <w:t>Potty</w:t>
-      </w:r>
-      <w:proofErr w:type="spellEnd"/>
-      <w:r>
-        <w:rPr>
-          <w:rFonts w:ascii="Times New Roman" w:eastAsia="Times New Roman" w:hAnsi="Times New Roman" w:cs="Times New Roman"/>
-          <w:sz w:val="24"/>
-          <w:szCs w:val="24"/>
-        </w:rPr>
-        <w:t xml:space="preserve"> Training (Control de esfínteres): Un registro visual donde marcas si el perro hizo sus necesidades fuera, dentro o si hubo un "accidente", ideal para cachorros.</w:t>
+        <w:t>Calendario de Potty Training (Control de esfínteres): Un registro visual donde marcas si el perro hizo sus necesidades fuera, dentro o si hubo un "accidente", ideal para cachorros.</w:t>
       </w:r>
     </w:p>
     <w:p>
@@ -4196,25 +4178,7 @@
           <w:sz w:val="24"/>
           <w:szCs w:val="24"/>
         </w:rPr>
-        <w:t xml:space="preserve"> </w:t>
-      </w:r>
-      <w:proofErr w:type="spellStart"/>
-      <w:r>
-        <w:rPr>
-          <w:rFonts w:ascii="Times New Roman" w:eastAsia="Times New Roman" w:hAnsi="Times New Roman" w:cs="Times New Roman"/>
-          <w:sz w:val="24"/>
-          <w:szCs w:val="24"/>
-        </w:rPr>
-        <w:t>modulos</w:t>
-      </w:r>
-      <w:proofErr w:type="spellEnd"/>
-      <w:r>
-        <w:rPr>
-          <w:rFonts w:ascii="Times New Roman" w:eastAsia="Times New Roman" w:hAnsi="Times New Roman" w:cs="Times New Roman"/>
-          <w:sz w:val="24"/>
-          <w:szCs w:val="24"/>
-        </w:rPr>
-        <w:t xml:space="preserve"> que </w:t>
+        <w:t xml:space="preserve"> modulos que </w:t>
       </w:r>
       <w:r>
         <w:rPr>
@@ -5591,41 +5555,21 @@
         </w:rPr>
         <w:t xml:space="preserve"> El sistema permite compartir la información con diferentes niveles al igual que es posible compartir los registros con un cuidador temporal (acceso limitado o por tiempo) o con un </w:t>
       </w:r>
-      <w:proofErr w:type="spellStart"/>
-      <w:r>
-        <w:rPr>
-          <w:rFonts w:ascii="Times New Roman" w:eastAsia="Times New Roman" w:hAnsi="Times New Roman" w:cs="Times New Roman"/>
-          <w:sz w:val="24"/>
-          <w:szCs w:val="24"/>
-        </w:rPr>
-        <w:t>co-propietario</w:t>
-      </w:r>
-      <w:proofErr w:type="spellEnd"/>
-      <w:r>
-        <w:rPr>
-          <w:rFonts w:ascii="Times New Roman" w:eastAsia="Times New Roman" w:hAnsi="Times New Roman" w:cs="Times New Roman"/>
-          <w:sz w:val="24"/>
-          <w:szCs w:val="24"/>
-        </w:rPr>
-        <w:t xml:space="preserve">. Asimismo, cuenta con un sistema de confirmación de acciones compartidas en la que, al establecer un recordatorio de medicación, la aplicación permite establecerlo como “Realizado”. Esto es visible para todos los que comparten el perfil del animal. Uno de los mayores valores de la herramienta es la notificación en tiempo real. Si un miembro de la familia confirma que ya ha dado la medicación o ha asistido a una cita, el resto de </w:t>
-      </w:r>
-      <w:proofErr w:type="gramStart"/>
-      <w:r>
-        <w:rPr>
-          <w:rFonts w:ascii="Times New Roman" w:eastAsia="Times New Roman" w:hAnsi="Times New Roman" w:cs="Times New Roman"/>
-          <w:sz w:val="24"/>
-          <w:szCs w:val="24"/>
-        </w:rPr>
-        <w:t>cuidadores</w:t>
-      </w:r>
-      <w:proofErr w:type="gramEnd"/>
-      <w:r>
-        <w:rPr>
-          <w:rFonts w:ascii="Times New Roman" w:eastAsia="Times New Roman" w:hAnsi="Times New Roman" w:cs="Times New Roman"/>
-          <w:sz w:val="24"/>
-          <w:szCs w:val="24"/>
-        </w:rPr>
-        <w:t xml:space="preserve"> recibe una notificación para evitar que se duplique la dosis o acción.</w:t>
+      <w:r>
+        <w:rPr>
+          <w:rFonts w:ascii="Times New Roman" w:eastAsia="Times New Roman" w:hAnsi="Times New Roman" w:cs="Times New Roman"/>
+          <w:sz w:val="24"/>
+          <w:szCs w:val="24"/>
+        </w:rPr>
+        <w:t>copropietario</w:t>
+      </w:r>
+      <w:r>
+        <w:rPr>
+          <w:rFonts w:ascii="Times New Roman" w:eastAsia="Times New Roman" w:hAnsi="Times New Roman" w:cs="Times New Roman"/>
+          <w:sz w:val="24"/>
+          <w:szCs w:val="24"/>
+        </w:rPr>
+        <w:t>. Asimismo, cuenta con un sistema de confirmación de acciones compartidas en la que, al establecer un recordatorio de medicación, la aplicación permite establecerlo como “Realizado”. Esto es visible para todos los que comparten el perfil del animal. Uno de los mayores valores de la herramienta es la notificación en tiempo real. Si un miembro de la familia confirma que ya ha dado la medicación o ha asistido a una cita, el resto de cuidadores recibe una notificación para evitar que se duplique la dosis o acción.</w:t>
       </w:r>
     </w:p>
     <w:p>
@@ -5684,7 +5628,23 @@
           <w:sz w:val="28"/>
           <w:szCs w:val="28"/>
         </w:rPr>
-        <w:t>2.2.4.- Resumen</w:t>
+        <w:t>2.2.</w:t>
+      </w:r>
+      <w:r>
+        <w:rPr>
+          <w:b/>
+          <w:sz w:val="28"/>
+          <w:szCs w:val="28"/>
+        </w:rPr>
+        <w:t>6</w:t>
+      </w:r>
+      <w:r>
+        <w:rPr>
+          <w:b/>
+          <w:sz w:val="28"/>
+          <w:szCs w:val="28"/>
+        </w:rPr>
+        <w:t>.- Resumen</w:t>
       </w:r>
     </w:p>
     <w:p>
@@ -5728,23 +5688,29 @@
         </w:rPr>
         <w:t xml:space="preserve">A </w:t>
       </w:r>
-      <w:proofErr w:type="gramStart"/>
-      <w:r>
-        <w:rPr>
-          <w:rFonts w:ascii="Times New Roman" w:eastAsia="Times New Roman" w:hAnsi="Times New Roman" w:cs="Times New Roman"/>
-          <w:sz w:val="24"/>
-          <w:szCs w:val="24"/>
-        </w:rPr>
-        <w:t>continuación</w:t>
-      </w:r>
-      <w:proofErr w:type="gramEnd"/>
-      <w:r>
-        <w:rPr>
-          <w:rFonts w:ascii="Times New Roman" w:eastAsia="Times New Roman" w:hAnsi="Times New Roman" w:cs="Times New Roman"/>
-          <w:sz w:val="24"/>
-          <w:szCs w:val="24"/>
-        </w:rPr>
-        <w:t xml:space="preserve"> se presenta una tabla resumen que recoge las principales características de las cinco herramientas analizadas, con el objetivo de facilitar una comparación rápida entre ellas e identificar las necesidades que cubren y las que quedan sin resolver.</w:t>
+      <w:r>
+        <w:rPr>
+          <w:rFonts w:ascii="Times New Roman" w:eastAsia="Times New Roman" w:hAnsi="Times New Roman" w:cs="Times New Roman"/>
+          <w:sz w:val="24"/>
+          <w:szCs w:val="24"/>
+        </w:rPr>
+        <w:t>continuación,</w:t>
+      </w:r>
+      <w:r>
+        <w:rPr>
+          <w:rFonts w:ascii="Times New Roman" w:eastAsia="Times New Roman" w:hAnsi="Times New Roman" w:cs="Times New Roman"/>
+          <w:sz w:val="24"/>
+          <w:szCs w:val="24"/>
+        </w:rPr>
+        <w:t xml:space="preserve"> se presenta una tabla resumen que recoge las principales características de las cinco herramientas analizadas, </w:t>
+      </w:r>
+      <w:r>
+        <w:rPr>
+          <w:rFonts w:ascii="Times New Roman" w:eastAsia="Times New Roman" w:hAnsi="Times New Roman" w:cs="Times New Roman"/>
+          <w:sz w:val="24"/>
+          <w:szCs w:val="24"/>
+        </w:rPr>
+        <w:t>con el fin de facilitar una comparativa rápida de sus funcionalidades, ventajas e inconvenientes en relación con las necesidades identificadas en el apartado 2.1.</w:t>
       </w:r>
     </w:p>
     <w:p>
@@ -5771,17 +5737,17 @@
         <w:tblLook w:val="04A0" w:firstRow="1" w:lastRow="0" w:firstColumn="1" w:lastColumn="0" w:noHBand="0" w:noVBand="1"/>
       </w:tblPr>
       <w:tblGrid>
-        <w:gridCol w:w="1463"/>
-        <w:gridCol w:w="1463"/>
-        <w:gridCol w:w="1463"/>
-        <w:gridCol w:w="1463"/>
-        <w:gridCol w:w="1463"/>
-        <w:gridCol w:w="1463"/>
+        <w:gridCol w:w="1550"/>
+        <w:gridCol w:w="1446"/>
+        <w:gridCol w:w="1439"/>
+        <w:gridCol w:w="1436"/>
+        <w:gridCol w:w="1459"/>
+        <w:gridCol w:w="1448"/>
       </w:tblGrid>
       <w:tr>
         <w:tc>
           <w:tcPr>
-            <w:tcW w:w="1463" w:type="dxa"/>
+            <w:tcW w:w="1550" w:type="dxa"/>
           </w:tcPr>
           <w:p>
             <w:pPr>
@@ -5792,11 +5758,19 @@
                 <w:szCs w:val="24"/>
               </w:rPr>
             </w:pPr>
+            <w:r>
+              <w:rPr>
+                <w:rFonts w:ascii="Times New Roman" w:eastAsia="Times New Roman" w:hAnsi="Times New Roman" w:cs="Times New Roman"/>
+                <w:sz w:val="24"/>
+                <w:szCs w:val="24"/>
+              </w:rPr>
+              <w:t>Característica</w:t>
+            </w:r>
           </w:p>
         </w:tc>
         <w:tc>
           <w:tcPr>
-            <w:tcW w:w="1463" w:type="dxa"/>
+            <w:tcW w:w="1446" w:type="dxa"/>
           </w:tcPr>
           <w:p>
             <w:pPr>
@@ -5807,11 +5781,19 @@
                 <w:szCs w:val="24"/>
               </w:rPr>
             </w:pPr>
+            <w:r>
+              <w:rPr>
+                <w:rFonts w:ascii="Times New Roman" w:eastAsia="Times New Roman" w:hAnsi="Times New Roman" w:cs="Times New Roman"/>
+                <w:sz w:val="24"/>
+                <w:szCs w:val="24"/>
+              </w:rPr>
+              <w:t>PetDesk</w:t>
+            </w:r>
           </w:p>
         </w:tc>
         <w:tc>
           <w:tcPr>
-            <w:tcW w:w="1463" w:type="dxa"/>
+            <w:tcW w:w="1439" w:type="dxa"/>
           </w:tcPr>
           <w:p>
             <w:pPr>
@@ -5822,11 +5804,19 @@
                 <w:szCs w:val="24"/>
               </w:rPr>
             </w:pPr>
+            <w:r>
+              <w:rPr>
+                <w:rFonts w:ascii="Times New Roman" w:eastAsia="Times New Roman" w:hAnsi="Times New Roman" w:cs="Times New Roman"/>
+                <w:sz w:val="24"/>
+                <w:szCs w:val="24"/>
+              </w:rPr>
+              <w:t>11pets</w:t>
+            </w:r>
           </w:p>
         </w:tc>
         <w:tc>
           <w:tcPr>
-            <w:tcW w:w="1463" w:type="dxa"/>
+            <w:tcW w:w="1436" w:type="dxa"/>
           </w:tcPr>
           <w:p>
             <w:pPr>
@@ -5837,11 +5827,19 @@
                 <w:szCs w:val="24"/>
               </w:rPr>
             </w:pPr>
+            <w:r>
+              <w:rPr>
+                <w:rFonts w:ascii="Times New Roman" w:eastAsia="Times New Roman" w:hAnsi="Times New Roman" w:cs="Times New Roman"/>
+                <w:sz w:val="24"/>
+                <w:szCs w:val="24"/>
+              </w:rPr>
+              <w:t>Dogo</w:t>
+            </w:r>
           </w:p>
         </w:tc>
         <w:tc>
           <w:tcPr>
-            <w:tcW w:w="1463" w:type="dxa"/>
+            <w:tcW w:w="1459" w:type="dxa"/>
           </w:tcPr>
           <w:p>
             <w:pPr>
@@ -5852,11 +5850,19 @@
                 <w:szCs w:val="24"/>
               </w:rPr>
             </w:pPr>
+            <w:r>
+              <w:rPr>
+                <w:rFonts w:ascii="Times New Roman" w:eastAsia="Times New Roman" w:hAnsi="Times New Roman" w:cs="Times New Roman"/>
+                <w:sz w:val="24"/>
+                <w:szCs w:val="24"/>
+              </w:rPr>
+              <w:t>PetnotePlus</w:t>
+            </w:r>
           </w:p>
         </w:tc>
         <w:tc>
           <w:tcPr>
-            <w:tcW w:w="1463" w:type="dxa"/>
+            <w:tcW w:w="1448" w:type="dxa"/>
           </w:tcPr>
           <w:p>
             <w:pPr>
@@ -5867,13 +5873,21 @@
                 <w:szCs w:val="24"/>
               </w:rPr>
             </w:pPr>
+            <w:r>
+              <w:rPr>
+                <w:rFonts w:ascii="Times New Roman" w:eastAsia="Times New Roman" w:hAnsi="Times New Roman" w:cs="Times New Roman"/>
+                <w:sz w:val="24"/>
+                <w:szCs w:val="24"/>
+              </w:rPr>
+              <w:t>VitusVet</w:t>
+            </w:r>
           </w:p>
         </w:tc>
       </w:tr>
       <w:tr>
         <w:tc>
           <w:tcPr>
-            <w:tcW w:w="1463" w:type="dxa"/>
+            <w:tcW w:w="1550" w:type="dxa"/>
           </w:tcPr>
           <w:p>
             <w:pPr>
@@ -5884,11 +5898,19 @@
                 <w:szCs w:val="24"/>
               </w:rPr>
             </w:pPr>
+            <w:r>
+              <w:rPr>
+                <w:rFonts w:ascii="Times New Roman" w:eastAsia="Times New Roman" w:hAnsi="Times New Roman" w:cs="Times New Roman"/>
+                <w:sz w:val="24"/>
+                <w:szCs w:val="24"/>
+              </w:rPr>
+              <w:t>Plataforma</w:t>
+            </w:r>
           </w:p>
         </w:tc>
         <w:tc>
           <w:tcPr>
-            <w:tcW w:w="1463" w:type="dxa"/>
+            <w:tcW w:w="1446" w:type="dxa"/>
           </w:tcPr>
           <w:p>
             <w:pPr>
@@ -5899,11 +5921,19 @@
                 <w:szCs w:val="24"/>
               </w:rPr>
             </w:pPr>
+            <w:r>
+              <w:rPr>
+                <w:rFonts w:ascii="Times New Roman" w:eastAsia="Times New Roman" w:hAnsi="Times New Roman" w:cs="Times New Roman"/>
+                <w:sz w:val="24"/>
+                <w:szCs w:val="24"/>
+              </w:rPr>
+              <w:t>iOS / Android</w:t>
+            </w:r>
           </w:p>
         </w:tc>
         <w:tc>
           <w:tcPr>
-            <w:tcW w:w="1463" w:type="dxa"/>
+            <w:tcW w:w="1439" w:type="dxa"/>
           </w:tcPr>
           <w:p>
             <w:pPr>
@@ -5914,11 +5944,19 @@
                 <w:szCs w:val="24"/>
               </w:rPr>
             </w:pPr>
+            <w:r>
+              <w:rPr>
+                <w:rFonts w:ascii="Times New Roman" w:eastAsia="Times New Roman" w:hAnsi="Times New Roman" w:cs="Times New Roman"/>
+                <w:sz w:val="24"/>
+                <w:szCs w:val="24"/>
+              </w:rPr>
+              <w:t>iOS / Android / Web</w:t>
+            </w:r>
           </w:p>
         </w:tc>
         <w:tc>
           <w:tcPr>
-            <w:tcW w:w="1463" w:type="dxa"/>
+            <w:tcW w:w="1436" w:type="dxa"/>
           </w:tcPr>
           <w:p>
             <w:pPr>
@@ -5929,11 +5967,19 @@
                 <w:szCs w:val="24"/>
               </w:rPr>
             </w:pPr>
+            <w:r>
+              <w:rPr>
+                <w:rFonts w:ascii="Times New Roman" w:eastAsia="Times New Roman" w:hAnsi="Times New Roman" w:cs="Times New Roman"/>
+                <w:sz w:val="24"/>
+                <w:szCs w:val="24"/>
+              </w:rPr>
+              <w:t>iOS / Android</w:t>
+            </w:r>
           </w:p>
         </w:tc>
         <w:tc>
           <w:tcPr>
-            <w:tcW w:w="1463" w:type="dxa"/>
+            <w:tcW w:w="1459" w:type="dxa"/>
           </w:tcPr>
           <w:p>
             <w:pPr>
@@ -5944,11 +5990,19 @@
                 <w:szCs w:val="24"/>
               </w:rPr>
             </w:pPr>
+            <w:r>
+              <w:rPr>
+                <w:rFonts w:ascii="Times New Roman" w:eastAsia="Times New Roman" w:hAnsi="Times New Roman" w:cs="Times New Roman"/>
+                <w:sz w:val="24"/>
+                <w:szCs w:val="24"/>
+              </w:rPr>
+              <w:t>iOS / Android</w:t>
+            </w:r>
           </w:p>
         </w:tc>
         <w:tc>
           <w:tcPr>
-            <w:tcW w:w="1463" w:type="dxa"/>
+            <w:tcW w:w="1448" w:type="dxa"/>
           </w:tcPr>
           <w:p>
             <w:pPr>
@@ -5959,13 +6013,21 @@
                 <w:szCs w:val="24"/>
               </w:rPr>
             </w:pPr>
+            <w:r>
+              <w:rPr>
+                <w:rFonts w:ascii="Times New Roman" w:eastAsia="Times New Roman" w:hAnsi="Times New Roman" w:cs="Times New Roman"/>
+                <w:sz w:val="24"/>
+                <w:szCs w:val="24"/>
+              </w:rPr>
+              <w:t>iOS / Android</w:t>
+            </w:r>
           </w:p>
         </w:tc>
       </w:tr>
       <w:tr>
         <w:tc>
           <w:tcPr>
-            <w:tcW w:w="1463" w:type="dxa"/>
+            <w:tcW w:w="1550" w:type="dxa"/>
           </w:tcPr>
           <w:p>
             <w:pPr>
@@ -5976,11 +6038,19 @@
                 <w:szCs w:val="24"/>
               </w:rPr>
             </w:pPr>
+            <w:r>
+              <w:rPr>
+                <w:rFonts w:ascii="Times New Roman" w:eastAsia="Times New Roman" w:hAnsi="Times New Roman" w:cs="Times New Roman"/>
+                <w:sz w:val="24"/>
+                <w:szCs w:val="24"/>
+              </w:rPr>
+              <w:t>Disponible en España</w:t>
+            </w:r>
           </w:p>
         </w:tc>
         <w:tc>
           <w:tcPr>
-            <w:tcW w:w="1463" w:type="dxa"/>
+            <w:tcW w:w="1446" w:type="dxa"/>
           </w:tcPr>
           <w:p>
             <w:pPr>
@@ -5991,11 +6061,19 @@
                 <w:szCs w:val="24"/>
               </w:rPr>
             </w:pPr>
+            <w:r>
+              <w:rPr>
+                <w:rFonts w:ascii="Times New Roman" w:eastAsia="Times New Roman" w:hAnsi="Times New Roman" w:cs="Times New Roman"/>
+                <w:sz w:val="24"/>
+                <w:szCs w:val="24"/>
+              </w:rPr>
+              <w:t>No disponible</w:t>
+            </w:r>
           </w:p>
         </w:tc>
         <w:tc>
           <w:tcPr>
-            <w:tcW w:w="1463" w:type="dxa"/>
+            <w:tcW w:w="1439" w:type="dxa"/>
           </w:tcPr>
           <w:p>
             <w:pPr>
@@ -6006,11 +6084,19 @@
                 <w:szCs w:val="24"/>
               </w:rPr>
             </w:pPr>
+            <w:r>
+              <w:rPr>
+                <w:rFonts w:ascii="Times New Roman" w:eastAsia="Times New Roman" w:hAnsi="Times New Roman" w:cs="Times New Roman"/>
+                <w:sz w:val="24"/>
+                <w:szCs w:val="24"/>
+              </w:rPr>
+              <w:t>Disponible</w:t>
+            </w:r>
           </w:p>
         </w:tc>
         <w:tc>
           <w:tcPr>
-            <w:tcW w:w="1463" w:type="dxa"/>
+            <w:tcW w:w="1436" w:type="dxa"/>
           </w:tcPr>
           <w:p>
             <w:pPr>
@@ -6021,11 +6107,19 @@
                 <w:szCs w:val="24"/>
               </w:rPr>
             </w:pPr>
+            <w:r>
+              <w:rPr>
+                <w:rFonts w:ascii="Times New Roman" w:eastAsia="Times New Roman" w:hAnsi="Times New Roman" w:cs="Times New Roman"/>
+                <w:sz w:val="24"/>
+                <w:szCs w:val="24"/>
+              </w:rPr>
+              <w:t>Disponible</w:t>
+            </w:r>
           </w:p>
         </w:tc>
         <w:tc>
           <w:tcPr>
-            <w:tcW w:w="1463" w:type="dxa"/>
+            <w:tcW w:w="1459" w:type="dxa"/>
           </w:tcPr>
           <w:p>
             <w:pPr>
@@ -6036,11 +6130,19 @@
                 <w:szCs w:val="24"/>
               </w:rPr>
             </w:pPr>
+            <w:r>
+              <w:rPr>
+                <w:rFonts w:ascii="Times New Roman" w:eastAsia="Times New Roman" w:hAnsi="Times New Roman" w:cs="Times New Roman"/>
+                <w:sz w:val="24"/>
+                <w:szCs w:val="24"/>
+              </w:rPr>
+              <w:t>Disponible</w:t>
+            </w:r>
           </w:p>
         </w:tc>
         <w:tc>
           <w:tcPr>
-            <w:tcW w:w="1463" w:type="dxa"/>
+            <w:tcW w:w="1448" w:type="dxa"/>
           </w:tcPr>
           <w:p>
             <w:pPr>
@@ -6051,13 +6153,21 @@
                 <w:szCs w:val="24"/>
               </w:rPr>
             </w:pPr>
+            <w:r>
+              <w:rPr>
+                <w:rFonts w:ascii="Times New Roman" w:eastAsia="Times New Roman" w:hAnsi="Times New Roman" w:cs="Times New Roman"/>
+                <w:sz w:val="24"/>
+                <w:szCs w:val="24"/>
+              </w:rPr>
+              <w:t>Disponible</w:t>
+            </w:r>
           </w:p>
         </w:tc>
       </w:tr>
       <w:tr>
         <w:tc>
           <w:tcPr>
-            <w:tcW w:w="1463" w:type="dxa"/>
+            <w:tcW w:w="1550" w:type="dxa"/>
           </w:tcPr>
           <w:p>
             <w:pPr>
@@ -6068,11 +6178,19 @@
                 <w:szCs w:val="24"/>
               </w:rPr>
             </w:pPr>
+            <w:r>
+              <w:rPr>
+                <w:rFonts w:ascii="Times New Roman" w:eastAsia="Times New Roman" w:hAnsi="Times New Roman" w:cs="Times New Roman"/>
+                <w:sz w:val="24"/>
+                <w:szCs w:val="24"/>
+              </w:rPr>
+              <w:t>Modelo de negocio</w:t>
+            </w:r>
           </w:p>
         </w:tc>
         <w:tc>
           <w:tcPr>
-            <w:tcW w:w="1463" w:type="dxa"/>
+            <w:tcW w:w="1446" w:type="dxa"/>
           </w:tcPr>
           <w:p>
             <w:pPr>
@@ -6083,11 +6201,19 @@
                 <w:szCs w:val="24"/>
               </w:rPr>
             </w:pPr>
+            <w:r>
+              <w:rPr>
+                <w:rFonts w:ascii="Times New Roman" w:eastAsia="Times New Roman" w:hAnsi="Times New Roman" w:cs="Times New Roman"/>
+                <w:sz w:val="24"/>
+                <w:szCs w:val="24"/>
+              </w:rPr>
+              <w:t>Gratuita (B2B)</w:t>
+            </w:r>
           </w:p>
         </w:tc>
         <w:tc>
           <w:tcPr>
-            <w:tcW w:w="1463" w:type="dxa"/>
+            <w:tcW w:w="1439" w:type="dxa"/>
           </w:tcPr>
           <w:p>
             <w:pPr>
@@ -6098,11 +6224,19 @@
                 <w:szCs w:val="24"/>
               </w:rPr>
             </w:pPr>
+            <w:r>
+              <w:rPr>
+                <w:rFonts w:ascii="Times New Roman" w:eastAsia="Times New Roman" w:hAnsi="Times New Roman" w:cs="Times New Roman"/>
+                <w:sz w:val="24"/>
+                <w:szCs w:val="24"/>
+              </w:rPr>
+              <w:t>Freemium</w:t>
+            </w:r>
           </w:p>
         </w:tc>
         <w:tc>
           <w:tcPr>
-            <w:tcW w:w="1463" w:type="dxa"/>
+            <w:tcW w:w="1436" w:type="dxa"/>
           </w:tcPr>
           <w:p>
             <w:pPr>
@@ -6113,11 +6247,19 @@
                 <w:szCs w:val="24"/>
               </w:rPr>
             </w:pPr>
+            <w:r>
+              <w:rPr>
+                <w:rFonts w:ascii="Times New Roman" w:eastAsia="Times New Roman" w:hAnsi="Times New Roman" w:cs="Times New Roman"/>
+                <w:sz w:val="24"/>
+                <w:szCs w:val="24"/>
+              </w:rPr>
+              <w:t>Freemium</w:t>
+            </w:r>
           </w:p>
         </w:tc>
         <w:tc>
           <w:tcPr>
-            <w:tcW w:w="1463" w:type="dxa"/>
+            <w:tcW w:w="1459" w:type="dxa"/>
           </w:tcPr>
           <w:p>
             <w:pPr>
@@ -6128,11 +6270,19 @@
                 <w:szCs w:val="24"/>
               </w:rPr>
             </w:pPr>
+            <w:r>
+              <w:rPr>
+                <w:rFonts w:ascii="Times New Roman" w:eastAsia="Times New Roman" w:hAnsi="Times New Roman" w:cs="Times New Roman"/>
+                <w:sz w:val="24"/>
+                <w:szCs w:val="24"/>
+              </w:rPr>
+              <w:t>Freemium</w:t>
+            </w:r>
           </w:p>
         </w:tc>
         <w:tc>
           <w:tcPr>
-            <w:tcW w:w="1463" w:type="dxa"/>
+            <w:tcW w:w="1448" w:type="dxa"/>
           </w:tcPr>
           <w:p>
             <w:pPr>
@@ -6143,13 +6293,21 @@
                 <w:szCs w:val="24"/>
               </w:rPr>
             </w:pPr>
+            <w:r>
+              <w:rPr>
+                <w:rFonts w:ascii="Times New Roman" w:eastAsia="Times New Roman" w:hAnsi="Times New Roman" w:cs="Times New Roman"/>
+                <w:sz w:val="24"/>
+                <w:szCs w:val="24"/>
+              </w:rPr>
+              <w:t>Freemium</w:t>
+            </w:r>
           </w:p>
         </w:tc>
       </w:tr>
       <w:tr>
         <w:tc>
           <w:tcPr>
-            <w:tcW w:w="1463" w:type="dxa"/>
+            <w:tcW w:w="1550" w:type="dxa"/>
           </w:tcPr>
           <w:p>
             <w:pPr>
@@ -6160,11 +6318,19 @@
                 <w:szCs w:val="24"/>
               </w:rPr>
             </w:pPr>
+            <w:r>
+              <w:rPr>
+                <w:rFonts w:ascii="Times New Roman" w:eastAsia="Times New Roman" w:hAnsi="Times New Roman" w:cs="Times New Roman"/>
+                <w:sz w:val="24"/>
+                <w:szCs w:val="24"/>
+              </w:rPr>
+              <w:t>Multiespecie</w:t>
+            </w:r>
           </w:p>
         </w:tc>
         <w:tc>
           <w:tcPr>
-            <w:tcW w:w="1463" w:type="dxa"/>
+            <w:tcW w:w="1446" w:type="dxa"/>
           </w:tcPr>
           <w:p>
             <w:pPr>
@@ -6175,11 +6341,19 @@
                 <w:szCs w:val="24"/>
               </w:rPr>
             </w:pPr>
+            <w:r>
+              <w:rPr>
+                <w:rFonts w:ascii="Times New Roman" w:eastAsia="Times New Roman" w:hAnsi="Times New Roman" w:cs="Times New Roman"/>
+                <w:sz w:val="24"/>
+                <w:szCs w:val="24"/>
+              </w:rPr>
+              <w:t>Disponible</w:t>
+            </w:r>
           </w:p>
         </w:tc>
         <w:tc>
           <w:tcPr>
-            <w:tcW w:w="1463" w:type="dxa"/>
+            <w:tcW w:w="1439" w:type="dxa"/>
           </w:tcPr>
           <w:p>
             <w:pPr>
@@ -6190,11 +6364,19 @@
                 <w:szCs w:val="24"/>
               </w:rPr>
             </w:pPr>
+            <w:r>
+              <w:rPr>
+                <w:rFonts w:ascii="Times New Roman" w:eastAsia="Times New Roman" w:hAnsi="Times New Roman" w:cs="Times New Roman"/>
+                <w:sz w:val="24"/>
+                <w:szCs w:val="24"/>
+              </w:rPr>
+              <w:t>Disponible</w:t>
+            </w:r>
           </w:p>
         </w:tc>
         <w:tc>
           <w:tcPr>
-            <w:tcW w:w="1463" w:type="dxa"/>
+            <w:tcW w:w="1436" w:type="dxa"/>
           </w:tcPr>
           <w:p>
             <w:pPr>
@@ -6205,11 +6387,19 @@
                 <w:szCs w:val="24"/>
               </w:rPr>
             </w:pPr>
+            <w:r>
+              <w:rPr>
+                <w:rFonts w:ascii="Times New Roman" w:eastAsia="Times New Roman" w:hAnsi="Times New Roman" w:cs="Times New Roman"/>
+                <w:sz w:val="24"/>
+                <w:szCs w:val="24"/>
+              </w:rPr>
+              <w:t>No disponible</w:t>
+            </w:r>
           </w:p>
         </w:tc>
         <w:tc>
           <w:tcPr>
-            <w:tcW w:w="1463" w:type="dxa"/>
+            <w:tcW w:w="1459" w:type="dxa"/>
           </w:tcPr>
           <w:p>
             <w:pPr>
@@ -6220,11 +6410,19 @@
                 <w:szCs w:val="24"/>
               </w:rPr>
             </w:pPr>
+            <w:r>
+              <w:rPr>
+                <w:rFonts w:ascii="Times New Roman" w:eastAsia="Times New Roman" w:hAnsi="Times New Roman" w:cs="Times New Roman"/>
+                <w:sz w:val="24"/>
+                <w:szCs w:val="24"/>
+              </w:rPr>
+              <w:t>Disponible</w:t>
+            </w:r>
           </w:p>
         </w:tc>
         <w:tc>
           <w:tcPr>
-            <w:tcW w:w="1463" w:type="dxa"/>
+            <w:tcW w:w="1448" w:type="dxa"/>
           </w:tcPr>
           <w:p>
             <w:pPr>
@@ -6235,13 +6433,21 @@
                 <w:szCs w:val="24"/>
               </w:rPr>
             </w:pPr>
+            <w:r>
+              <w:rPr>
+                <w:rFonts w:ascii="Times New Roman" w:eastAsia="Times New Roman" w:hAnsi="Times New Roman" w:cs="Times New Roman"/>
+                <w:sz w:val="24"/>
+                <w:szCs w:val="24"/>
+              </w:rPr>
+              <w:t>Disponible</w:t>
+            </w:r>
           </w:p>
         </w:tc>
       </w:tr>
       <w:tr>
         <w:tc>
           <w:tcPr>
-            <w:tcW w:w="1463" w:type="dxa"/>
+            <w:tcW w:w="1550" w:type="dxa"/>
           </w:tcPr>
           <w:p>
             <w:pPr>
@@ -6252,11 +6458,19 @@
                 <w:szCs w:val="24"/>
               </w:rPr>
             </w:pPr>
+            <w:r>
+              <w:rPr>
+                <w:rFonts w:ascii="Times New Roman" w:eastAsia="Times New Roman" w:hAnsi="Times New Roman" w:cs="Times New Roman"/>
+                <w:sz w:val="24"/>
+                <w:szCs w:val="24"/>
+              </w:rPr>
+              <w:t>Módulo de medicación</w:t>
+            </w:r>
           </w:p>
         </w:tc>
         <w:tc>
           <w:tcPr>
-            <w:tcW w:w="1463" w:type="dxa"/>
+            <w:tcW w:w="1446" w:type="dxa"/>
           </w:tcPr>
           <w:p>
             <w:pPr>
@@ -6267,11 +6481,19 @@
                 <w:szCs w:val="24"/>
               </w:rPr>
             </w:pPr>
+            <w:r>
+              <w:rPr>
+                <w:rFonts w:ascii="Times New Roman" w:eastAsia="Times New Roman" w:hAnsi="Times New Roman" w:cs="Times New Roman"/>
+                <w:sz w:val="24"/>
+                <w:szCs w:val="24"/>
+              </w:rPr>
+              <w:t>Disponible</w:t>
+            </w:r>
           </w:p>
         </w:tc>
         <w:tc>
           <w:tcPr>
-            <w:tcW w:w="1463" w:type="dxa"/>
+            <w:tcW w:w="1439" w:type="dxa"/>
           </w:tcPr>
           <w:p>
             <w:pPr>
@@ -6282,11 +6504,19 @@
                 <w:szCs w:val="24"/>
               </w:rPr>
             </w:pPr>
+            <w:r>
+              <w:rPr>
+                <w:rFonts w:ascii="Times New Roman" w:eastAsia="Times New Roman" w:hAnsi="Times New Roman" w:cs="Times New Roman"/>
+                <w:sz w:val="24"/>
+                <w:szCs w:val="24"/>
+              </w:rPr>
+              <w:t>Disponible</w:t>
+            </w:r>
           </w:p>
         </w:tc>
         <w:tc>
           <w:tcPr>
-            <w:tcW w:w="1463" w:type="dxa"/>
+            <w:tcW w:w="1436" w:type="dxa"/>
           </w:tcPr>
           <w:p>
             <w:pPr>
@@ -6297,11 +6527,19 @@
                 <w:szCs w:val="24"/>
               </w:rPr>
             </w:pPr>
+            <w:r>
+              <w:rPr>
+                <w:rFonts w:ascii="Times New Roman" w:eastAsia="Times New Roman" w:hAnsi="Times New Roman" w:cs="Times New Roman"/>
+                <w:sz w:val="24"/>
+                <w:szCs w:val="24"/>
+              </w:rPr>
+              <w:t>Disponible</w:t>
+            </w:r>
           </w:p>
         </w:tc>
         <w:tc>
           <w:tcPr>
-            <w:tcW w:w="1463" w:type="dxa"/>
+            <w:tcW w:w="1459" w:type="dxa"/>
           </w:tcPr>
           <w:p>
             <w:pPr>
@@ -6312,11 +6550,19 @@
                 <w:szCs w:val="24"/>
               </w:rPr>
             </w:pPr>
+            <w:r>
+              <w:rPr>
+                <w:rFonts w:ascii="Times New Roman" w:eastAsia="Times New Roman" w:hAnsi="Times New Roman" w:cs="Times New Roman"/>
+                <w:sz w:val="24"/>
+                <w:szCs w:val="24"/>
+              </w:rPr>
+              <w:t>Disponible</w:t>
+            </w:r>
           </w:p>
         </w:tc>
         <w:tc>
           <w:tcPr>
-            <w:tcW w:w="1463" w:type="dxa"/>
+            <w:tcW w:w="1448" w:type="dxa"/>
           </w:tcPr>
           <w:p>
             <w:pPr>
@@ -6327,13 +6573,21 @@
                 <w:szCs w:val="24"/>
               </w:rPr>
             </w:pPr>
+            <w:r>
+              <w:rPr>
+                <w:rFonts w:ascii="Times New Roman" w:eastAsia="Times New Roman" w:hAnsi="Times New Roman" w:cs="Times New Roman"/>
+                <w:sz w:val="24"/>
+                <w:szCs w:val="24"/>
+              </w:rPr>
+              <w:t>Disponible</w:t>
+            </w:r>
           </w:p>
         </w:tc>
       </w:tr>
       <w:tr>
         <w:tc>
           <w:tcPr>
-            <w:tcW w:w="1463" w:type="dxa"/>
+            <w:tcW w:w="1550" w:type="dxa"/>
           </w:tcPr>
           <w:p>
             <w:pPr>
@@ -6344,11 +6598,19 @@
                 <w:szCs w:val="24"/>
               </w:rPr>
             </w:pPr>
+            <w:r>
+              <w:rPr>
+                <w:rFonts w:ascii="Times New Roman" w:eastAsia="Times New Roman" w:hAnsi="Times New Roman" w:cs="Times New Roman"/>
+                <w:sz w:val="24"/>
+                <w:szCs w:val="24"/>
+              </w:rPr>
+              <w:t>Módulo de comidas</w:t>
+            </w:r>
           </w:p>
         </w:tc>
         <w:tc>
           <w:tcPr>
-            <w:tcW w:w="1463" w:type="dxa"/>
+            <w:tcW w:w="1446" w:type="dxa"/>
           </w:tcPr>
           <w:p>
             <w:pPr>
@@ -6359,11 +6621,19 @@
                 <w:szCs w:val="24"/>
               </w:rPr>
             </w:pPr>
+            <w:r>
+              <w:rPr>
+                <w:rFonts w:ascii="Times New Roman" w:eastAsia="Times New Roman" w:hAnsi="Times New Roman" w:cs="Times New Roman"/>
+                <w:sz w:val="24"/>
+                <w:szCs w:val="24"/>
+              </w:rPr>
+              <w:t>No disponible</w:t>
+            </w:r>
           </w:p>
         </w:tc>
         <w:tc>
           <w:tcPr>
-            <w:tcW w:w="1463" w:type="dxa"/>
+            <w:tcW w:w="1439" w:type="dxa"/>
           </w:tcPr>
           <w:p>
             <w:pPr>
@@ -6374,11 +6644,19 @@
                 <w:szCs w:val="24"/>
               </w:rPr>
             </w:pPr>
+            <w:r>
+              <w:rPr>
+                <w:rFonts w:ascii="Times New Roman" w:eastAsia="Times New Roman" w:hAnsi="Times New Roman" w:cs="Times New Roman"/>
+                <w:sz w:val="24"/>
+                <w:szCs w:val="24"/>
+              </w:rPr>
+              <w:t>Disponible</w:t>
+            </w:r>
           </w:p>
         </w:tc>
         <w:tc>
           <w:tcPr>
-            <w:tcW w:w="1463" w:type="dxa"/>
+            <w:tcW w:w="1436" w:type="dxa"/>
           </w:tcPr>
           <w:p>
             <w:pPr>
@@ -6389,11 +6667,19 @@
                 <w:szCs w:val="24"/>
               </w:rPr>
             </w:pPr>
+            <w:r>
+              <w:rPr>
+                <w:rFonts w:ascii="Times New Roman" w:eastAsia="Times New Roman" w:hAnsi="Times New Roman" w:cs="Times New Roman"/>
+                <w:sz w:val="24"/>
+                <w:szCs w:val="24"/>
+              </w:rPr>
+              <w:t>No disponible</w:t>
+            </w:r>
           </w:p>
         </w:tc>
         <w:tc>
           <w:tcPr>
-            <w:tcW w:w="1463" w:type="dxa"/>
+            <w:tcW w:w="1459" w:type="dxa"/>
           </w:tcPr>
           <w:p>
             <w:pPr>
@@ -6404,11 +6690,19 @@
                 <w:szCs w:val="24"/>
               </w:rPr>
             </w:pPr>
+            <w:r>
+              <w:rPr>
+                <w:rFonts w:ascii="Times New Roman" w:eastAsia="Times New Roman" w:hAnsi="Times New Roman" w:cs="Times New Roman"/>
+                <w:sz w:val="24"/>
+                <w:szCs w:val="24"/>
+              </w:rPr>
+              <w:t xml:space="preserve">Disponible </w:t>
+            </w:r>
           </w:p>
         </w:tc>
         <w:tc>
           <w:tcPr>
-            <w:tcW w:w="1463" w:type="dxa"/>
+            <w:tcW w:w="1448" w:type="dxa"/>
           </w:tcPr>
           <w:p>
             <w:pPr>
@@ -6419,13 +6713,21 @@
                 <w:szCs w:val="24"/>
               </w:rPr>
             </w:pPr>
+            <w:r>
+              <w:rPr>
+                <w:rFonts w:ascii="Times New Roman" w:eastAsia="Times New Roman" w:hAnsi="Times New Roman" w:cs="Times New Roman"/>
+                <w:sz w:val="24"/>
+                <w:szCs w:val="24"/>
+              </w:rPr>
+              <w:t>No disponible</w:t>
+            </w:r>
           </w:p>
         </w:tc>
       </w:tr>
       <w:tr>
         <w:tc>
           <w:tcPr>
-            <w:tcW w:w="1463" w:type="dxa"/>
+            <w:tcW w:w="1550" w:type="dxa"/>
           </w:tcPr>
           <w:p>
             <w:pPr>
@@ -6436,11 +6738,19 @@
                 <w:szCs w:val="24"/>
               </w:rPr>
             </w:pPr>
+            <w:r>
+              <w:rPr>
+                <w:rFonts w:ascii="Times New Roman" w:eastAsia="Times New Roman" w:hAnsi="Times New Roman" w:cs="Times New Roman"/>
+                <w:sz w:val="24"/>
+                <w:szCs w:val="24"/>
+              </w:rPr>
+              <w:t>Módulo de paseos</w:t>
+            </w:r>
           </w:p>
         </w:tc>
         <w:tc>
           <w:tcPr>
-            <w:tcW w:w="1463" w:type="dxa"/>
+            <w:tcW w:w="1446" w:type="dxa"/>
           </w:tcPr>
           <w:p>
             <w:pPr>
@@ -6451,11 +6761,19 @@
                 <w:szCs w:val="24"/>
               </w:rPr>
             </w:pPr>
+            <w:r>
+              <w:rPr>
+                <w:rFonts w:ascii="Times New Roman" w:eastAsia="Times New Roman" w:hAnsi="Times New Roman" w:cs="Times New Roman"/>
+                <w:sz w:val="24"/>
+                <w:szCs w:val="24"/>
+              </w:rPr>
+              <w:t>No disponible</w:t>
+            </w:r>
           </w:p>
         </w:tc>
         <w:tc>
           <w:tcPr>
-            <w:tcW w:w="1463" w:type="dxa"/>
+            <w:tcW w:w="1439" w:type="dxa"/>
           </w:tcPr>
           <w:p>
             <w:pPr>
@@ -6466,11 +6784,19 @@
                 <w:szCs w:val="24"/>
               </w:rPr>
             </w:pPr>
+            <w:r>
+              <w:rPr>
+                <w:rFonts w:ascii="Times New Roman" w:eastAsia="Times New Roman" w:hAnsi="Times New Roman" w:cs="Times New Roman"/>
+                <w:sz w:val="24"/>
+                <w:szCs w:val="24"/>
+              </w:rPr>
+              <w:t>Disponible</w:t>
+            </w:r>
           </w:p>
         </w:tc>
         <w:tc>
           <w:tcPr>
-            <w:tcW w:w="1463" w:type="dxa"/>
+            <w:tcW w:w="1436" w:type="dxa"/>
           </w:tcPr>
           <w:p>
             <w:pPr>
@@ -6481,11 +6807,19 @@
                 <w:szCs w:val="24"/>
               </w:rPr>
             </w:pPr>
+            <w:r>
+              <w:rPr>
+                <w:rFonts w:ascii="Times New Roman" w:eastAsia="Times New Roman" w:hAnsi="Times New Roman" w:cs="Times New Roman"/>
+                <w:sz w:val="24"/>
+                <w:szCs w:val="24"/>
+              </w:rPr>
+              <w:t>Disponible</w:t>
+            </w:r>
           </w:p>
         </w:tc>
         <w:tc>
           <w:tcPr>
-            <w:tcW w:w="1463" w:type="dxa"/>
+            <w:tcW w:w="1459" w:type="dxa"/>
           </w:tcPr>
           <w:p>
             <w:pPr>
@@ -6496,11 +6830,19 @@
                 <w:szCs w:val="24"/>
               </w:rPr>
             </w:pPr>
+            <w:r>
+              <w:rPr>
+                <w:rFonts w:ascii="Times New Roman" w:eastAsia="Times New Roman" w:hAnsi="Times New Roman" w:cs="Times New Roman"/>
+                <w:sz w:val="24"/>
+                <w:szCs w:val="24"/>
+              </w:rPr>
+              <w:t>Disponible</w:t>
+            </w:r>
           </w:p>
         </w:tc>
         <w:tc>
           <w:tcPr>
-            <w:tcW w:w="1463" w:type="dxa"/>
+            <w:tcW w:w="1448" w:type="dxa"/>
           </w:tcPr>
           <w:p>
             <w:pPr>
@@ -6511,13 +6853,21 @@
                 <w:szCs w:val="24"/>
               </w:rPr>
             </w:pPr>
+            <w:r>
+              <w:rPr>
+                <w:rFonts w:ascii="Times New Roman" w:eastAsia="Times New Roman" w:hAnsi="Times New Roman" w:cs="Times New Roman"/>
+                <w:sz w:val="24"/>
+                <w:szCs w:val="24"/>
+              </w:rPr>
+              <w:t>No disponible</w:t>
+            </w:r>
           </w:p>
         </w:tc>
       </w:tr>
       <w:tr>
         <w:tc>
           <w:tcPr>
-            <w:tcW w:w="1463" w:type="dxa"/>
+            <w:tcW w:w="1550" w:type="dxa"/>
           </w:tcPr>
           <w:p>
             <w:pPr>
@@ -6528,11 +6878,20 @@
                 <w:szCs w:val="24"/>
               </w:rPr>
             </w:pPr>
+            <w:r>
+              <w:rPr>
+                <w:rFonts w:ascii="Times New Roman" w:eastAsia="Times New Roman" w:hAnsi="Times New Roman" w:cs="Times New Roman"/>
+                <w:sz w:val="24"/>
+                <w:szCs w:val="24"/>
+              </w:rPr>
+              <w:lastRenderedPageBreak/>
+              <w:t>Acceso multiusuario</w:t>
+            </w:r>
           </w:p>
         </w:tc>
         <w:tc>
           <w:tcPr>
-            <w:tcW w:w="1463" w:type="dxa"/>
+            <w:tcW w:w="1446" w:type="dxa"/>
           </w:tcPr>
           <w:p>
             <w:pPr>
@@ -6543,11 +6902,19 @@
                 <w:szCs w:val="24"/>
               </w:rPr>
             </w:pPr>
+            <w:r>
+              <w:rPr>
+                <w:rFonts w:ascii="Times New Roman" w:eastAsia="Times New Roman" w:hAnsi="Times New Roman" w:cs="Times New Roman"/>
+                <w:sz w:val="24"/>
+                <w:szCs w:val="24"/>
+              </w:rPr>
+              <w:t>Parcial o con limitaciones</w:t>
+            </w:r>
           </w:p>
         </w:tc>
         <w:tc>
           <w:tcPr>
-            <w:tcW w:w="1463" w:type="dxa"/>
+            <w:tcW w:w="1439" w:type="dxa"/>
           </w:tcPr>
           <w:p>
             <w:pPr>
@@ -6558,11 +6925,19 @@
                 <w:szCs w:val="24"/>
               </w:rPr>
             </w:pPr>
+            <w:r>
+              <w:rPr>
+                <w:rFonts w:ascii="Times New Roman" w:eastAsia="Times New Roman" w:hAnsi="Times New Roman" w:cs="Times New Roman"/>
+                <w:sz w:val="24"/>
+                <w:szCs w:val="24"/>
+              </w:rPr>
+              <w:t>Parcial o con limitaciones</w:t>
+            </w:r>
           </w:p>
         </w:tc>
         <w:tc>
           <w:tcPr>
-            <w:tcW w:w="1463" w:type="dxa"/>
+            <w:tcW w:w="1436" w:type="dxa"/>
           </w:tcPr>
           <w:p>
             <w:pPr>
@@ -6573,11 +6948,19 @@
                 <w:szCs w:val="24"/>
               </w:rPr>
             </w:pPr>
+            <w:r>
+              <w:rPr>
+                <w:rFonts w:ascii="Times New Roman" w:eastAsia="Times New Roman" w:hAnsi="Times New Roman" w:cs="Times New Roman"/>
+                <w:sz w:val="24"/>
+                <w:szCs w:val="24"/>
+              </w:rPr>
+              <w:t>Parcial o con limitaciones</w:t>
+            </w:r>
           </w:p>
         </w:tc>
         <w:tc>
           <w:tcPr>
-            <w:tcW w:w="1463" w:type="dxa"/>
+            <w:tcW w:w="1459" w:type="dxa"/>
           </w:tcPr>
           <w:p>
             <w:pPr>
@@ -6588,11 +6971,19 @@
                 <w:szCs w:val="24"/>
               </w:rPr>
             </w:pPr>
+            <w:r>
+              <w:rPr>
+                <w:rFonts w:ascii="Times New Roman" w:eastAsia="Times New Roman" w:hAnsi="Times New Roman" w:cs="Times New Roman"/>
+                <w:sz w:val="24"/>
+                <w:szCs w:val="24"/>
+              </w:rPr>
+              <w:t>Disponible</w:t>
+            </w:r>
           </w:p>
         </w:tc>
         <w:tc>
           <w:tcPr>
-            <w:tcW w:w="1463" w:type="dxa"/>
+            <w:tcW w:w="1448" w:type="dxa"/>
           </w:tcPr>
           <w:p>
             <w:pPr>
@@ -6603,13 +6994,21 @@
                 <w:szCs w:val="24"/>
               </w:rPr>
             </w:pPr>
+            <w:r>
+              <w:rPr>
+                <w:rFonts w:ascii="Times New Roman" w:eastAsia="Times New Roman" w:hAnsi="Times New Roman" w:cs="Times New Roman"/>
+                <w:sz w:val="24"/>
+                <w:szCs w:val="24"/>
+              </w:rPr>
+              <w:t>Disponible</w:t>
+            </w:r>
           </w:p>
         </w:tc>
       </w:tr>
       <w:tr>
         <w:tc>
           <w:tcPr>
-            <w:tcW w:w="1463" w:type="dxa"/>
+            <w:tcW w:w="1550" w:type="dxa"/>
           </w:tcPr>
           <w:p>
             <w:pPr>
@@ -6620,11 +7019,19 @@
                 <w:szCs w:val="24"/>
               </w:rPr>
             </w:pPr>
+            <w:r>
+              <w:rPr>
+                <w:rFonts w:ascii="Times New Roman" w:eastAsia="Times New Roman" w:hAnsi="Times New Roman" w:cs="Times New Roman"/>
+                <w:sz w:val="24"/>
+                <w:szCs w:val="24"/>
+              </w:rPr>
+              <w:t>Roles diferenciados</w:t>
+            </w:r>
           </w:p>
         </w:tc>
         <w:tc>
           <w:tcPr>
-            <w:tcW w:w="1463" w:type="dxa"/>
+            <w:tcW w:w="1446" w:type="dxa"/>
           </w:tcPr>
           <w:p>
             <w:pPr>
@@ -6635,11 +7042,19 @@
                 <w:szCs w:val="24"/>
               </w:rPr>
             </w:pPr>
+            <w:r>
+              <w:rPr>
+                <w:rFonts w:ascii="Times New Roman" w:eastAsia="Times New Roman" w:hAnsi="Times New Roman" w:cs="Times New Roman"/>
+                <w:sz w:val="24"/>
+                <w:szCs w:val="24"/>
+              </w:rPr>
+              <w:t>No disponible</w:t>
+            </w:r>
           </w:p>
         </w:tc>
         <w:tc>
           <w:tcPr>
-            <w:tcW w:w="1463" w:type="dxa"/>
+            <w:tcW w:w="1439" w:type="dxa"/>
           </w:tcPr>
           <w:p>
             <w:pPr>
@@ -6650,11 +7065,19 @@
                 <w:szCs w:val="24"/>
               </w:rPr>
             </w:pPr>
+            <w:r>
+              <w:rPr>
+                <w:rFonts w:ascii="Times New Roman" w:eastAsia="Times New Roman" w:hAnsi="Times New Roman" w:cs="Times New Roman"/>
+                <w:sz w:val="24"/>
+                <w:szCs w:val="24"/>
+              </w:rPr>
+              <w:t>No disponible</w:t>
+            </w:r>
           </w:p>
         </w:tc>
         <w:tc>
           <w:tcPr>
-            <w:tcW w:w="1463" w:type="dxa"/>
+            <w:tcW w:w="1436" w:type="dxa"/>
           </w:tcPr>
           <w:p>
             <w:pPr>
@@ -6665,11 +7088,19 @@
                 <w:szCs w:val="24"/>
               </w:rPr>
             </w:pPr>
+            <w:r>
+              <w:rPr>
+                <w:rFonts w:ascii="Times New Roman" w:eastAsia="Times New Roman" w:hAnsi="Times New Roman" w:cs="Times New Roman"/>
+                <w:sz w:val="24"/>
+                <w:szCs w:val="24"/>
+              </w:rPr>
+              <w:t>No disponible</w:t>
+            </w:r>
           </w:p>
         </w:tc>
         <w:tc>
           <w:tcPr>
-            <w:tcW w:w="1463" w:type="dxa"/>
+            <w:tcW w:w="1459" w:type="dxa"/>
           </w:tcPr>
           <w:p>
             <w:pPr>
@@ -6680,11 +7111,19 @@
                 <w:szCs w:val="24"/>
               </w:rPr>
             </w:pPr>
+            <w:r>
+              <w:rPr>
+                <w:rFonts w:ascii="Times New Roman" w:eastAsia="Times New Roman" w:hAnsi="Times New Roman" w:cs="Times New Roman"/>
+                <w:sz w:val="24"/>
+                <w:szCs w:val="24"/>
+              </w:rPr>
+              <w:t>Parcial o con limitaciones</w:t>
+            </w:r>
           </w:p>
         </w:tc>
         <w:tc>
           <w:tcPr>
-            <w:tcW w:w="1463" w:type="dxa"/>
+            <w:tcW w:w="1448" w:type="dxa"/>
           </w:tcPr>
           <w:p>
             <w:pPr>
@@ -6695,13 +7134,21 @@
                 <w:szCs w:val="24"/>
               </w:rPr>
             </w:pPr>
+            <w:r>
+              <w:rPr>
+                <w:rFonts w:ascii="Times New Roman" w:eastAsia="Times New Roman" w:hAnsi="Times New Roman" w:cs="Times New Roman"/>
+                <w:sz w:val="24"/>
+                <w:szCs w:val="24"/>
+              </w:rPr>
+              <w:t>Disponible</w:t>
+            </w:r>
           </w:p>
         </w:tc>
       </w:tr>
       <w:tr>
         <w:tc>
           <w:tcPr>
-            <w:tcW w:w="1463" w:type="dxa"/>
+            <w:tcW w:w="1550" w:type="dxa"/>
           </w:tcPr>
           <w:p>
             <w:pPr>
@@ -6712,11 +7159,19 @@
                 <w:szCs w:val="24"/>
               </w:rPr>
             </w:pPr>
+            <w:r>
+              <w:rPr>
+                <w:rFonts w:ascii="Times New Roman" w:eastAsia="Times New Roman" w:hAnsi="Times New Roman" w:cs="Times New Roman"/>
+                <w:sz w:val="24"/>
+                <w:szCs w:val="24"/>
+              </w:rPr>
+              <w:t>Confirmación de acciones compartidas</w:t>
+            </w:r>
           </w:p>
         </w:tc>
         <w:tc>
           <w:tcPr>
-            <w:tcW w:w="1463" w:type="dxa"/>
+            <w:tcW w:w="1446" w:type="dxa"/>
           </w:tcPr>
           <w:p>
             <w:pPr>
@@ -6727,11 +7182,19 @@
                 <w:szCs w:val="24"/>
               </w:rPr>
             </w:pPr>
+            <w:r>
+              <w:rPr>
+                <w:rFonts w:ascii="Times New Roman" w:eastAsia="Times New Roman" w:hAnsi="Times New Roman" w:cs="Times New Roman"/>
+                <w:sz w:val="24"/>
+                <w:szCs w:val="24"/>
+              </w:rPr>
+              <w:t>No disponible</w:t>
+            </w:r>
           </w:p>
         </w:tc>
         <w:tc>
           <w:tcPr>
-            <w:tcW w:w="1463" w:type="dxa"/>
+            <w:tcW w:w="1439" w:type="dxa"/>
           </w:tcPr>
           <w:p>
             <w:pPr>
@@ -6742,11 +7205,19 @@
                 <w:szCs w:val="24"/>
               </w:rPr>
             </w:pPr>
+            <w:r>
+              <w:rPr>
+                <w:rFonts w:ascii="Times New Roman" w:eastAsia="Times New Roman" w:hAnsi="Times New Roman" w:cs="Times New Roman"/>
+                <w:sz w:val="24"/>
+                <w:szCs w:val="24"/>
+              </w:rPr>
+              <w:t>No disponible</w:t>
+            </w:r>
           </w:p>
         </w:tc>
         <w:tc>
           <w:tcPr>
-            <w:tcW w:w="1463" w:type="dxa"/>
+            <w:tcW w:w="1436" w:type="dxa"/>
           </w:tcPr>
           <w:p>
             <w:pPr>
@@ -6757,11 +7228,19 @@
                 <w:szCs w:val="24"/>
               </w:rPr>
             </w:pPr>
+            <w:r>
+              <w:rPr>
+                <w:rFonts w:ascii="Times New Roman" w:eastAsia="Times New Roman" w:hAnsi="Times New Roman" w:cs="Times New Roman"/>
+                <w:sz w:val="24"/>
+                <w:szCs w:val="24"/>
+              </w:rPr>
+              <w:t>No disponible</w:t>
+            </w:r>
           </w:p>
         </w:tc>
         <w:tc>
           <w:tcPr>
-            <w:tcW w:w="1463" w:type="dxa"/>
+            <w:tcW w:w="1459" w:type="dxa"/>
           </w:tcPr>
           <w:p>
             <w:pPr>
@@ -6772,11 +7251,19 @@
                 <w:szCs w:val="24"/>
               </w:rPr>
             </w:pPr>
+            <w:r>
+              <w:rPr>
+                <w:rFonts w:ascii="Times New Roman" w:eastAsia="Times New Roman" w:hAnsi="Times New Roman" w:cs="Times New Roman"/>
+                <w:sz w:val="24"/>
+                <w:szCs w:val="24"/>
+              </w:rPr>
+              <w:t>Parcial o con limitaciones</w:t>
+            </w:r>
           </w:p>
         </w:tc>
         <w:tc>
           <w:tcPr>
-            <w:tcW w:w="1463" w:type="dxa"/>
+            <w:tcW w:w="1448" w:type="dxa"/>
           </w:tcPr>
           <w:p>
             <w:pPr>
@@ -6787,13 +7274,21 @@
                 <w:szCs w:val="24"/>
               </w:rPr>
             </w:pPr>
+            <w:r>
+              <w:rPr>
+                <w:rFonts w:ascii="Times New Roman" w:eastAsia="Times New Roman" w:hAnsi="Times New Roman" w:cs="Times New Roman"/>
+                <w:sz w:val="24"/>
+                <w:szCs w:val="24"/>
+              </w:rPr>
+              <w:t>No disponible</w:t>
+            </w:r>
           </w:p>
         </w:tc>
       </w:tr>
       <w:tr>
         <w:tc>
           <w:tcPr>
-            <w:tcW w:w="1463" w:type="dxa"/>
+            <w:tcW w:w="1550" w:type="dxa"/>
           </w:tcPr>
           <w:p>
             <w:pPr>
@@ -6804,11 +7299,19 @@
                 <w:szCs w:val="24"/>
               </w:rPr>
             </w:pPr>
+            <w:r>
+              <w:rPr>
+                <w:rFonts w:ascii="Times New Roman" w:eastAsia="Times New Roman" w:hAnsi="Times New Roman" w:cs="Times New Roman"/>
+                <w:sz w:val="24"/>
+                <w:szCs w:val="24"/>
+              </w:rPr>
+              <w:t>Notificación al resto de cuidadores</w:t>
+            </w:r>
           </w:p>
         </w:tc>
         <w:tc>
           <w:tcPr>
-            <w:tcW w:w="1463" w:type="dxa"/>
+            <w:tcW w:w="1446" w:type="dxa"/>
           </w:tcPr>
           <w:p>
             <w:pPr>
@@ -6819,11 +7322,19 @@
                 <w:szCs w:val="24"/>
               </w:rPr>
             </w:pPr>
+            <w:r>
+              <w:rPr>
+                <w:rFonts w:ascii="Times New Roman" w:eastAsia="Times New Roman" w:hAnsi="Times New Roman" w:cs="Times New Roman"/>
+                <w:sz w:val="24"/>
+                <w:szCs w:val="24"/>
+              </w:rPr>
+              <w:t>No disponible</w:t>
+            </w:r>
           </w:p>
         </w:tc>
         <w:tc>
           <w:tcPr>
-            <w:tcW w:w="1463" w:type="dxa"/>
+            <w:tcW w:w="1439" w:type="dxa"/>
           </w:tcPr>
           <w:p>
             <w:pPr>
@@ -6834,11 +7345,19 @@
                 <w:szCs w:val="24"/>
               </w:rPr>
             </w:pPr>
+            <w:r>
+              <w:rPr>
+                <w:rFonts w:ascii="Times New Roman" w:eastAsia="Times New Roman" w:hAnsi="Times New Roman" w:cs="Times New Roman"/>
+                <w:sz w:val="24"/>
+                <w:szCs w:val="24"/>
+              </w:rPr>
+              <w:t>No disponible</w:t>
+            </w:r>
           </w:p>
         </w:tc>
         <w:tc>
           <w:tcPr>
-            <w:tcW w:w="1463" w:type="dxa"/>
+            <w:tcW w:w="1436" w:type="dxa"/>
           </w:tcPr>
           <w:p>
             <w:pPr>
@@ -6849,11 +7368,19 @@
                 <w:szCs w:val="24"/>
               </w:rPr>
             </w:pPr>
+            <w:r>
+              <w:rPr>
+                <w:rFonts w:ascii="Times New Roman" w:eastAsia="Times New Roman" w:hAnsi="Times New Roman" w:cs="Times New Roman"/>
+                <w:sz w:val="24"/>
+                <w:szCs w:val="24"/>
+              </w:rPr>
+              <w:t>Parcial o con limitaciones</w:t>
+            </w:r>
           </w:p>
         </w:tc>
         <w:tc>
           <w:tcPr>
-            <w:tcW w:w="1463" w:type="dxa"/>
+            <w:tcW w:w="1459" w:type="dxa"/>
           </w:tcPr>
           <w:p>
             <w:pPr>
@@ -6864,11 +7391,19 @@
                 <w:szCs w:val="24"/>
               </w:rPr>
             </w:pPr>
+            <w:r>
+              <w:rPr>
+                <w:rFonts w:ascii="Times New Roman" w:eastAsia="Times New Roman" w:hAnsi="Times New Roman" w:cs="Times New Roman"/>
+                <w:sz w:val="24"/>
+                <w:szCs w:val="24"/>
+              </w:rPr>
+              <w:t>Disponible</w:t>
+            </w:r>
           </w:p>
         </w:tc>
         <w:tc>
           <w:tcPr>
-            <w:tcW w:w="1463" w:type="dxa"/>
+            <w:tcW w:w="1448" w:type="dxa"/>
           </w:tcPr>
           <w:p>
             <w:pPr>
@@ -6879,6 +7414,154 @@
                 <w:szCs w:val="24"/>
               </w:rPr>
             </w:pPr>
+            <w:r>
+              <w:rPr>
+                <w:rFonts w:ascii="Times New Roman" w:eastAsia="Times New Roman" w:hAnsi="Times New Roman" w:cs="Times New Roman"/>
+                <w:sz w:val="24"/>
+                <w:szCs w:val="24"/>
+              </w:rPr>
+              <w:t>No disponible</w:t>
+            </w:r>
+          </w:p>
+        </w:tc>
+      </w:tr>
+      <w:tr>
+        <w:tc>
+          <w:tcPr>
+            <w:tcW w:w="1550" w:type="dxa"/>
+          </w:tcPr>
+          <w:p>
+            <w:pPr>
+              <w:jc w:val="both"/>
+              <w:rPr>
+                <w:rFonts w:ascii="Times New Roman" w:eastAsia="Times New Roman" w:hAnsi="Times New Roman" w:cs="Times New Roman"/>
+                <w:sz w:val="24"/>
+                <w:szCs w:val="24"/>
+              </w:rPr>
+            </w:pPr>
+            <w:r>
+              <w:rPr>
+                <w:rFonts w:ascii="Times New Roman" w:eastAsia="Times New Roman" w:hAnsi="Times New Roman" w:cs="Times New Roman"/>
+                <w:sz w:val="24"/>
+                <w:szCs w:val="24"/>
+              </w:rPr>
+              <w:t>Control de concurrencia</w:t>
+            </w:r>
+          </w:p>
+        </w:tc>
+        <w:tc>
+          <w:tcPr>
+            <w:tcW w:w="1446" w:type="dxa"/>
+          </w:tcPr>
+          <w:p>
+            <w:pPr>
+              <w:jc w:val="both"/>
+              <w:rPr>
+                <w:rFonts w:ascii="Times New Roman" w:eastAsia="Times New Roman" w:hAnsi="Times New Roman" w:cs="Times New Roman"/>
+                <w:sz w:val="24"/>
+                <w:szCs w:val="24"/>
+              </w:rPr>
+            </w:pPr>
+            <w:r>
+              <w:rPr>
+                <w:rFonts w:ascii="Times New Roman" w:eastAsia="Times New Roman" w:hAnsi="Times New Roman" w:cs="Times New Roman"/>
+                <w:sz w:val="24"/>
+                <w:szCs w:val="24"/>
+              </w:rPr>
+              <w:t>No disponible</w:t>
+            </w:r>
+          </w:p>
+        </w:tc>
+        <w:tc>
+          <w:tcPr>
+            <w:tcW w:w="1439" w:type="dxa"/>
+          </w:tcPr>
+          <w:p>
+            <w:pPr>
+              <w:jc w:val="both"/>
+              <w:rPr>
+                <w:rFonts w:ascii="Times New Roman" w:eastAsia="Times New Roman" w:hAnsi="Times New Roman" w:cs="Times New Roman"/>
+                <w:sz w:val="24"/>
+                <w:szCs w:val="24"/>
+              </w:rPr>
+            </w:pPr>
+            <w:r>
+              <w:rPr>
+                <w:rFonts w:ascii="Times New Roman" w:eastAsia="Times New Roman" w:hAnsi="Times New Roman" w:cs="Times New Roman"/>
+                <w:sz w:val="24"/>
+                <w:szCs w:val="24"/>
+              </w:rPr>
+              <w:t>No disponible</w:t>
+            </w:r>
+          </w:p>
+        </w:tc>
+        <w:tc>
+          <w:tcPr>
+            <w:tcW w:w="1436" w:type="dxa"/>
+          </w:tcPr>
+          <w:p>
+            <w:pPr>
+              <w:jc w:val="both"/>
+              <w:rPr>
+                <w:rFonts w:ascii="Times New Roman" w:eastAsia="Times New Roman" w:hAnsi="Times New Roman" w:cs="Times New Roman"/>
+                <w:sz w:val="24"/>
+                <w:szCs w:val="24"/>
+              </w:rPr>
+            </w:pPr>
+            <w:r>
+              <w:rPr>
+                <w:rFonts w:ascii="Times New Roman" w:eastAsia="Times New Roman" w:hAnsi="Times New Roman" w:cs="Times New Roman"/>
+                <w:sz w:val="24"/>
+                <w:szCs w:val="24"/>
+              </w:rPr>
+              <w:t>No disponible</w:t>
+            </w:r>
+          </w:p>
+        </w:tc>
+        <w:tc>
+          <w:tcPr>
+            <w:tcW w:w="1459" w:type="dxa"/>
+          </w:tcPr>
+          <w:p>
+            <w:pPr>
+              <w:jc w:val="both"/>
+              <w:rPr>
+                <w:rFonts w:ascii="Times New Roman" w:eastAsia="Times New Roman" w:hAnsi="Times New Roman" w:cs="Times New Roman"/>
+                <w:sz w:val="24"/>
+                <w:szCs w:val="24"/>
+              </w:rPr>
+            </w:pPr>
+            <w:r>
+              <w:rPr>
+                <w:rFonts w:ascii="Times New Roman" w:eastAsia="Times New Roman" w:hAnsi="Times New Roman" w:cs="Times New Roman"/>
+                <w:sz w:val="24"/>
+                <w:szCs w:val="24"/>
+              </w:rPr>
+              <w:t>No disponible</w:t>
+            </w:r>
+          </w:p>
+        </w:tc>
+        <w:tc>
+          <w:tcPr>
+            <w:tcW w:w="1448" w:type="dxa"/>
+          </w:tcPr>
+          <w:p>
+            <w:pPr>
+              <w:jc w:val="both"/>
+              <w:rPr>
+                <w:rFonts w:ascii="Times New Roman" w:eastAsia="Times New Roman" w:hAnsi="Times New Roman" w:cs="Times New Roman"/>
+                <w:sz w:val="24"/>
+                <w:szCs w:val="24"/>
+              </w:rPr>
+            </w:pPr>
+            <w:r>
+              <w:rPr>
+                <w:rFonts w:ascii="Times New Roman" w:eastAsia="Times New Roman" w:hAnsi="Times New Roman" w:cs="Times New Roman"/>
+                <w:sz w:val="24"/>
+                <w:szCs w:val="24"/>
+              </w:rPr>
+              <w:t>No disponible</w:t>
+            </w:r>
           </w:p>
         </w:tc>
       </w:tr>
@@ -6922,17 +7605,25 @@
           <w:sz w:val="24"/>
           <w:szCs w:val="24"/>
         </w:rPr>
-        <w:t xml:space="preserve">De la comparativa se extrae que ninguna de las herramientas analizadas ofrece una solución completa a la problemática identificada. PetDesk y VitusVet presentan un enfoque principalmente clínico y dependiente de la integración con clínicas veterinarias, lo que limita </w:t>
-      </w:r>
-      <w:r>
-        <w:rPr>
-          <w:rFonts w:ascii="Times New Roman" w:eastAsia="Times New Roman" w:hAnsi="Times New Roman" w:cs="Times New Roman"/>
-          <w:sz w:val="24"/>
-          <w:szCs w:val="24"/>
-        </w:rPr>
-        <w:lastRenderedPageBreak/>
-        <w:t>su utilidad en el contexto doméstico español. Dogo se centra exclusivamente en el adiestramiento canino y no cubre la gestión del cuidado diario de forma integral. 11Pets ofrece una solución más completa en cuanto a módulos de cuidado, pero su sistema multiusuario se basa en el uso compartido de una única cuenta, sin diferenciación de roles ni confirmación de acciones entre cuidadores. PetnotePlus es la herramienta más próxima al enfoque del presente proyecto, ya que incorpora módulos de medicación, comidas y paseos con acceso multiusuario y notificaciones entre cuidadores. Sin embargo, ninguna de las aplicaciones analizadas implementa un mecanismo de control de concurrencia que impida la confirmación simultánea de una misma acción por parte de varios cuidadores, ni está disponible como aplicación web progresiva sin necesidad de instalación. Estas carencias justifican el desarrollo de la herramienta propuesta en el presente trabajo.</w:t>
-      </w:r>
+        <w:t>De la comparativa se extrae que ninguna de las herramientas analizadas ofrece una solución completa a la problemática identificada. PetDesk y VitusVet presentan un enfoque principalmente clínico y dependiente de la integración con clínicas veterinarias, lo que limita su utilidad en el contexto doméstico español. Dogo se centra exclusivamente en el adiestramiento canino y no cubre la gestión del cuidado diario de forma integral. 11Pets ofrece una solución más completa en cuanto a módulos de cuidado, pero su sistema multiusuario se basa en el uso compartido de una única cuenta, sin diferenciación de roles ni confirmación de acciones entre cuidadores. PetnotePlus es la herramienta más próxima al enfoque del presente proyecto, ya que incorpora módulos de medicación, comidas y paseos con acceso multiusuario y notificaciones entre cuidadores. Sin embargo, ninguna de las aplicaciones analizadas implementa un mecanismo de control de concurrencia que impida la confirmación simultánea de una misma acción por parte de varios cuidadores, ni está disponible como aplicación web progresiva sin necesidad de instalación. Estas carencias justifican el desarrollo de la herramienta propuesta en el presente trabajo.</w:t>
+      </w:r>
+    </w:p>
+    <w:p>
+      <w:pPr>
+        <w:pBdr>
+          <w:top w:val="nil"/>
+          <w:left w:val="nil"/>
+          <w:bottom w:val="nil"/>
+          <w:right w:val="nil"/>
+          <w:between w:val="nil"/>
+        </w:pBdr>
+        <w:jc w:val="both"/>
+        <w:rPr>
+          <w:rFonts w:ascii="Times New Roman" w:eastAsia="Times New Roman" w:hAnsi="Times New Roman" w:cs="Times New Roman"/>
+          <w:sz w:val="24"/>
+          <w:szCs w:val="24"/>
+        </w:rPr>
+      </w:pPr>
     </w:p>
     <w:p>
       <w:pPr>
@@ -7014,25 +7705,142 @@
           <w:sz w:val="24"/>
           <w:szCs w:val="24"/>
         </w:rPr>
-        <w:t xml:space="preserve">También se puede incluir al final del capítulo 2 un apartado de valoración, en el que el alumno juzgue los pros y contras de la información expuesta en los apartados anteriores con la intención de dejar constancia de la necesidad de abordar este trabajo, es decir, de hacer algo nuevo que cubra un hueco o carencia que el resto de </w:t>
-      </w:r>
-      <w:proofErr w:type="gramStart"/>
-      <w:r>
-        <w:rPr>
-          <w:rFonts w:ascii="Times New Roman" w:eastAsia="Times New Roman" w:hAnsi="Times New Roman" w:cs="Times New Roman"/>
-          <w:sz w:val="24"/>
-          <w:szCs w:val="24"/>
-        </w:rPr>
-        <w:t>herramientas</w:t>
-      </w:r>
-      <w:proofErr w:type="gramEnd"/>
-      <w:r>
-        <w:rPr>
-          <w:rFonts w:ascii="Times New Roman" w:eastAsia="Times New Roman" w:hAnsi="Times New Roman" w:cs="Times New Roman"/>
-          <w:sz w:val="24"/>
-          <w:szCs w:val="24"/>
-        </w:rPr>
-        <w:t xml:space="preserve"> estudiadas no cubría satisfactoriamente.</w:t>
+        <w:t>Tras el análisis realizado, puede observarse que la gran mayoría de herramientas disponibles en el mercado están orientadas bien a la gestión del historial clínico y a la comunicación con profesionales veterinarios (PetDesk, VitusVet), bien al adiestramiento y el comportamiento animal (Dogo). Solo una pequeña parte de las soluciones estudiadas, concretamente 11Pets y PetnotePlus, aborda la gestión del cuidado animal de forma más integral. Esto refleja que existe un nicho poco cubierto: la coordinación del cuidado cotidiano entre varios cuidadores en el hogar.</w:t>
+      </w:r>
+    </w:p>
+    <w:p>
+      <w:pPr>
+        <w:pBdr>
+          <w:top w:val="nil"/>
+          <w:left w:val="nil"/>
+          <w:bottom w:val="nil"/>
+          <w:right w:val="nil"/>
+          <w:between w:val="nil"/>
+        </w:pBdr>
+        <w:jc w:val="both"/>
+        <w:rPr>
+          <w:rFonts w:ascii="Times New Roman" w:eastAsia="Times New Roman" w:hAnsi="Times New Roman" w:cs="Times New Roman"/>
+          <w:sz w:val="24"/>
+          <w:szCs w:val="24"/>
+        </w:rPr>
+      </w:pPr>
+    </w:p>
+    <w:p>
+      <w:pPr>
+        <w:pBdr>
+          <w:top w:val="nil"/>
+          <w:left w:val="nil"/>
+          <w:bottom w:val="nil"/>
+          <w:right w:val="nil"/>
+          <w:between w:val="nil"/>
+        </w:pBdr>
+        <w:jc w:val="both"/>
+        <w:rPr>
+          <w:rFonts w:ascii="Times New Roman" w:eastAsia="Times New Roman" w:hAnsi="Times New Roman" w:cs="Times New Roman"/>
+          <w:sz w:val="24"/>
+          <w:szCs w:val="24"/>
+        </w:rPr>
+      </w:pPr>
+      <w:r>
+        <w:rPr>
+          <w:rFonts w:ascii="Times New Roman" w:eastAsia="Times New Roman" w:hAnsi="Times New Roman" w:cs="Times New Roman"/>
+          <w:sz w:val="24"/>
+          <w:szCs w:val="24"/>
+        </w:rPr>
+        <w:t xml:space="preserve">Ninguna de las herramientas analizadas implementa un sistema real de control de concurrencia que impida confirmar la misma acción simultáneamente desde varios dispositivos. Los sistemas multiusuario de la mayoría se basan en compartir una única cuenta o en una sincronización básica, sin diferenciación real de roles ni trazabilidad de quién realizó cada acción. Asimismo, varias herramientas presentan limitaciones funcionales </w:t>
+      </w:r>
+      <w:r>
+        <w:rPr>
+          <w:rFonts w:ascii="Times New Roman" w:eastAsia="Times New Roman" w:hAnsi="Times New Roman" w:cs="Times New Roman"/>
+          <w:sz w:val="24"/>
+          <w:szCs w:val="24"/>
+        </w:rPr>
+        <w:lastRenderedPageBreak/>
+        <w:t>relevantes en su versión gratuita, como la restricción a un número máximo de mascotas o de elementos de seguimiento, lo que puede suponer una barrera de acceso para muchos usuarios. Por otra parte, todas las herramientas analizadas son aplicaciones nativas que requieren instalación desde una tienda de aplicaciones, con el consiguiente consumo de almacenamiento en el dispositivo y la dependencia de las políticas de distribución de cada plataforma.</w:t>
+      </w:r>
+    </w:p>
+    <w:p>
+      <w:pPr>
+        <w:pBdr>
+          <w:top w:val="nil"/>
+          <w:left w:val="nil"/>
+          <w:bottom w:val="nil"/>
+          <w:right w:val="nil"/>
+          <w:between w:val="nil"/>
+        </w:pBdr>
+        <w:jc w:val="both"/>
+        <w:rPr>
+          <w:rFonts w:ascii="Times New Roman" w:eastAsia="Times New Roman" w:hAnsi="Times New Roman" w:cs="Times New Roman"/>
+          <w:sz w:val="24"/>
+          <w:szCs w:val="24"/>
+        </w:rPr>
+      </w:pPr>
+    </w:p>
+    <w:p>
+      <w:pPr>
+        <w:pBdr>
+          <w:top w:val="nil"/>
+          <w:left w:val="nil"/>
+          <w:bottom w:val="nil"/>
+          <w:right w:val="nil"/>
+          <w:between w:val="nil"/>
+        </w:pBdr>
+        <w:jc w:val="both"/>
+        <w:rPr>
+          <w:rFonts w:ascii="Times New Roman" w:eastAsia="Times New Roman" w:hAnsi="Times New Roman" w:cs="Times New Roman"/>
+          <w:sz w:val="24"/>
+          <w:szCs w:val="24"/>
+        </w:rPr>
+      </w:pPr>
+      <w:r>
+        <w:rPr>
+          <w:rFonts w:ascii="Times New Roman" w:eastAsia="Times New Roman" w:hAnsi="Times New Roman" w:cs="Times New Roman"/>
+          <w:sz w:val="24"/>
+          <w:szCs w:val="24"/>
+        </w:rPr>
+        <w:t>En el caso de PetnotePlus, que es la herramienta más completa de las analizadas, aunque permite el acceso multiusuario con sincronización en tiempo real, no dispone de un mecanismo de bloqueo que impida que dos cuidadores confirmen la misma acción de forma simultánea, lo que puede dar lugar a registros duplicados. Además, la versión gratuita limita el seguimiento a 8 elementos por mascota e incluye publicidad, lo que puede resultar insuficiente o intrusivo para un uso doméstico completo.</w:t>
+      </w:r>
+    </w:p>
+    <w:p>
+      <w:pPr>
+        <w:pBdr>
+          <w:top w:val="nil"/>
+          <w:left w:val="nil"/>
+          <w:bottom w:val="nil"/>
+          <w:right w:val="nil"/>
+          <w:between w:val="nil"/>
+        </w:pBdr>
+        <w:jc w:val="both"/>
+        <w:rPr>
+          <w:rFonts w:ascii="Times New Roman" w:eastAsia="Times New Roman" w:hAnsi="Times New Roman" w:cs="Times New Roman"/>
+          <w:sz w:val="24"/>
+          <w:szCs w:val="24"/>
+        </w:rPr>
+      </w:pPr>
+    </w:p>
+    <w:p>
+      <w:pPr>
+        <w:pBdr>
+          <w:top w:val="nil"/>
+          <w:left w:val="nil"/>
+          <w:bottom w:val="nil"/>
+          <w:right w:val="nil"/>
+          <w:between w:val="nil"/>
+        </w:pBdr>
+        <w:jc w:val="both"/>
+        <w:rPr>
+          <w:rFonts w:ascii="Times New Roman" w:eastAsia="Times New Roman" w:hAnsi="Times New Roman" w:cs="Times New Roman"/>
+          <w:sz w:val="24"/>
+          <w:szCs w:val="24"/>
+        </w:rPr>
+      </w:pPr>
+      <w:r>
+        <w:rPr>
+          <w:rFonts w:ascii="Times New Roman" w:eastAsia="Times New Roman" w:hAnsi="Times New Roman" w:cs="Times New Roman"/>
+          <w:sz w:val="24"/>
+          <w:szCs w:val="24"/>
+        </w:rPr>
+        <w:t>La aplicación propuesta en este trabajo tiene como objetivo cubrir el vacío identificado: una herramienta específicamente diseñada para la coordinación del cuidado de mascotas entre varios cuidadores en un mismo hogar. A diferencia de las soluciones analizadas, incorpora un sistema de control de concurrencia que garantiza que una misma acción no pueda ser confirmada por dos usuarios de forma simultánea. El sistema multiusuario está basado en roles diferenciados con cuentas independientes, trazabilidad de acciones y notificaciones en tiempo real. Adicionalmente, al desarrollarse como una aplicación web progresiva (PWA) con diseño responsive, elimina la necesidad de instalación y es accesible desde cualquier dispositivo con navegador, incluyendo móviles, tabletas y ordenadores. En los capítulos siguientes se describe el proceso de diseño e implementación de dicha solución.</w:t>
       </w:r>
     </w:p>
     <w:p>

</xml_diff>

<commit_message>
Update Capitulo 2 to correct spelling mistaked
</commit_message>
<xml_diff>
--- a/docs/Capítulo 2 - Antecedentes.docx
+++ b/docs/Capítulo 2 - Antecedentes.docx
@@ -3295,7 +3295,25 @@
           <w:sz w:val="24"/>
           <w:szCs w:val="24"/>
         </w:rPr>
-        <w:t>Calendario de Potty Training (Control de esfínteres): Un registro visual donde marcas si el perro hizo sus necesidades fuera, dentro o si hubo un "accidente", ideal para cachorros.</w:t>
+        <w:t xml:space="preserve">Calendario de </w:t>
+      </w:r>
+      <w:proofErr w:type="spellStart"/>
+      <w:r>
+        <w:rPr>
+          <w:rFonts w:ascii="Times New Roman" w:eastAsia="Times New Roman" w:hAnsi="Times New Roman" w:cs="Times New Roman"/>
+          <w:sz w:val="24"/>
+          <w:szCs w:val="24"/>
+        </w:rPr>
+        <w:t>Potty</w:t>
+      </w:r>
+      <w:proofErr w:type="spellEnd"/>
+      <w:r>
+        <w:rPr>
+          <w:rFonts w:ascii="Times New Roman" w:eastAsia="Times New Roman" w:hAnsi="Times New Roman" w:cs="Times New Roman"/>
+          <w:sz w:val="24"/>
+          <w:szCs w:val="24"/>
+        </w:rPr>
+        <w:t xml:space="preserve"> Training (Control de esfínteres): Un registro visual donde marcas si el perro hizo sus necesidades fuera, dentro o si hubo un "accidente", ideal para cachorros.</w:t>
       </w:r>
     </w:p>
     <w:p>
@@ -4178,7 +4196,23 @@
           <w:sz w:val="24"/>
           <w:szCs w:val="24"/>
         </w:rPr>
-        <w:t xml:space="preserve"> modulos que </w:t>
+        <w:t xml:space="preserve"> </w:t>
+      </w:r>
+      <w:r>
+        <w:rPr>
+          <w:rFonts w:ascii="Times New Roman" w:eastAsia="Times New Roman" w:hAnsi="Times New Roman" w:cs="Times New Roman"/>
+          <w:sz w:val="24"/>
+          <w:szCs w:val="24"/>
+        </w:rPr>
+        <w:t>módulos</w:t>
+      </w:r>
+      <w:r>
+        <w:rPr>
+          <w:rFonts w:ascii="Times New Roman" w:eastAsia="Times New Roman" w:hAnsi="Times New Roman" w:cs="Times New Roman"/>
+          <w:sz w:val="24"/>
+          <w:szCs w:val="24"/>
+        </w:rPr>
+        <w:t xml:space="preserve"> que </w:t>
       </w:r>
       <w:r>
         <w:rPr>
@@ -5569,7 +5603,25 @@
           <w:sz w:val="24"/>
           <w:szCs w:val="24"/>
         </w:rPr>
-        <w:t>. Asimismo, cuenta con un sistema de confirmación de acciones compartidas en la que, al establecer un recordatorio de medicación, la aplicación permite establecerlo como “Realizado”. Esto es visible para todos los que comparten el perfil del animal. Uno de los mayores valores de la herramienta es la notificación en tiempo real. Si un miembro de la familia confirma que ya ha dado la medicación o ha asistido a una cita, el resto de cuidadores recibe una notificación para evitar que se duplique la dosis o acción.</w:t>
+        <w:t xml:space="preserve">. Asimismo, cuenta con un sistema de confirmación de acciones compartidas en la que, al establecer un recordatorio de medicación, la aplicación permite establecerlo como “Realizado”. Esto es visible para todos los que comparten el perfil del animal. Uno de los mayores valores de la herramienta es la notificación en tiempo real. Si un miembro de la familia confirma que ya ha dado la medicación o ha asistido a una cita, el resto de </w:t>
+      </w:r>
+      <w:proofErr w:type="gramStart"/>
+      <w:r>
+        <w:rPr>
+          <w:rFonts w:ascii="Times New Roman" w:eastAsia="Times New Roman" w:hAnsi="Times New Roman" w:cs="Times New Roman"/>
+          <w:sz w:val="24"/>
+          <w:szCs w:val="24"/>
+        </w:rPr>
+        <w:t>cuidadores</w:t>
+      </w:r>
+      <w:proofErr w:type="gramEnd"/>
+      <w:r>
+        <w:rPr>
+          <w:rFonts w:ascii="Times New Roman" w:eastAsia="Times New Roman" w:hAnsi="Times New Roman" w:cs="Times New Roman"/>
+          <w:sz w:val="24"/>
+          <w:szCs w:val="24"/>
+        </w:rPr>
+        <w:t xml:space="preserve"> recibe una notificación para evitar que se duplique la dosis o acción.</w:t>
       </w:r>
     </w:p>
     <w:p>

</xml_diff>